<commit_message>
Pkt 1.3: wdrozenie na 50 pojazdach, metoda SAM z danych publicznych, aneksy (LOI, struktura bazy), D35 zatwierdzona, N47-N49, T17-T19
Co-Authored-By: Claude Sonnet 5.5 <noreply@anthropic.com>
Claude-Session: https://claude.ai/code/session_01672WnJhixnEcarbb7uiwfx
</commit_message>
<xml_diff>
--- a/Sekcja_1.3_i_ceny.docx
+++ b/Sekcja_1.3_i_ceny.docx
@@ -173,7 +173,7 @@
                 <w:b w:val="0"/>
                 <w:sz w:val="18"/>
               </w:rPr>
-              <w:t>Jedna podstawa: TAM 544,97 tys., SAM 200 000 jako założenie z metodą do uzupełnienia, prognoza tylko dla Polski (0,50% SAM, 0,18% TAM).</w:t>
+              <w:t>Jedna podstawa: TAM 544,97 tys., SAM 200 000 z metodą z danych publicznych (Aneks A), 1 000 pojazdów w 2034 r. to 0,50% SAM i 0,18% TAM. Wielkości rynku CEE usunięte do czasu pobrania danych Eurostatu.</w:t>
             </w:r>
           </w:p>
         </w:tc>
@@ -581,7 +581,7 @@
           <w:color w:val="666666"/>
           <w:sz w:val="17"/>
         </w:rPr>
-        <w:t xml:space="preserve"> [8023 znaków]</w:t>
+        <w:t xml:space="preserve"> [8743 znaków]</w:t>
       </w:r>
     </w:p>
     <w:p>
@@ -621,20 +621,20 @@
         <w:rPr>
           <w:b w:val="0"/>
         </w:rPr>
-        <w:t xml:space="preserve">SAM to naczepy, w których można zamontować zestaw retrofit i które nie mają telematyki producenta: szacunkowo 200 000 w Polsce </w:t>
+        <w:t xml:space="preserve">SAM to naczepy, w których można zamontować zestaw retrofit i które nie mają telematyki producenta. Według PZPM w 2025 r. platformy i nadwozia skrzyniowe, w tym kurtynowe, to 47-48% rejestracji nowych naczep, a furgony 24-25%, razem ok. 72%, a tylko te nadwozia nadają się do montażu zestawu (wywrotki i cysterny nie). Telematykę miało w 2019 r. ok. 14% naczep w Europie (Frost &amp; Sullivan </w:t>
       </w:r>
       <w:r>
         <w:rPr>
           <w:b w:val="0"/>
           <w:highlight w:val="yellow"/>
         </w:rPr>
-        <w:t>ZAŁOŻENIE: podać metodę, np. udział nadwozi zamkniętych i kurtynowych oraz naczep bez telematyki fabrycznej w 544,97 tys.</w:t>
+        <w:t>sprawdzić źródło i dodać nowsze dane</w:t>
       </w:r>
       <w:r>
         <w:rPr>
           <w:b w:val="0"/>
         </w:rPr>
-        <w:t>. SOM to operatorzy z flotami od 5 do 50 naczep w przewozach ogólnotowarowych PL-UE, bez własnego działu IT. W 2034 r. system ma pracować w 1 000 naczep, czyli 0,50% SAM i 0,18% TAM. Prognoza dotyczy wyłącznie Polski, a region CEE traktujemy jako możliwość po 2033 r., nieujętą w prognozie przychodów.</w:t>
+        <w:t>). Dają to ok. 337 000 naczep (544 970 x 72% x 86%), a do SAM przyjmujemy ostrożnie 200 000, czyli ok. 37% TAM, ponieważ struktura rejestracji nowych naczep jest tylko przybliżeniem struktury całej floty. SOM to operatorzy z flotami od 5 do 50 naczep w przewozach ogólnotowarowych PL-UE, bez własnego działu IT. W 2034 r. system ma pracować w 1 000 naczep, czyli 0,50% SAM w Polsce i 0,18% TAM. Pojazdy w regionie CEE, pozyskiwane przez partnerstwa z dostawcami TMS (Z10), obniżają udział w polskim SAM poniżej 0,50%.</w:t>
       </w:r>
     </w:p>
     <w:p>
@@ -653,14 +653,14 @@
         <w:rPr>
           <w:b w:val="0"/>
         </w:rPr>
-        <w:t xml:space="preserve">Wymagania przewoźników MŚP, które przyjęliśmy do projektu, wynikają z rozmów z klientami Everest11 </w:t>
+        <w:t xml:space="preserve">Wymagania przewoźników MŚP, które przyjęliśmy do projektu, wynikają z 15 rozmów z klientami Everest11 </w:t>
       </w:r>
       <w:r>
         <w:rPr>
           <w:b w:val="0"/>
           <w:highlight w:val="yellow"/>
         </w:rPr>
-        <w:t>liczba rozmów lub ankiet, okres</w:t>
+        <w:t>okres rozmów</w:t>
       </w:r>
       <w:r>
         <w:rPr>
@@ -698,20 +698,7 @@
         <w:rPr>
           <w:b w:val="0"/>
         </w:rPr>
-        <w:t xml:space="preserve">Potrzeba 4: dane dla ubezpieczyciela. Straty cargo w UE wyniosły 549 mln EUR w 2023 r., o 438% więcej niż rok wcześniej (TAPA EMEA TIS, 2025). Ubezpieczyciele różnicują składki według poziomu monitoringu zgodnego z TAPA TSR. Everest11 rozmawia z co najmniej jednym towarzystwem cargo o partnerstwie </w:t>
-      </w:r>
-      <w:r>
-        <w:rPr>
-          <w:b w:val="0"/>
-          <w:highlight w:val="yellow"/>
-        </w:rPr>
-        <w:t>stan rozmów, data</w:t>
-      </w:r>
-      <w:r>
-        <w:rPr>
-          <w:b w:val="0"/>
-        </w:rPr>
-        <w:t>.</w:t>
+        <w:t>Potrzeba 4: dane dla ubezpieczyciela. Straty cargo w UE wyniosły 549 mln EUR w 2023 r., o 438% więcej niż rok wcześniej (TAPA EMEA TIS, 2025). Ubezpieczyciele różnicują składki według poziomu monitoringu zgodnego z TAPA TSR. Everest11 prowadzi rozmowy z co najmniej jednym towarzystwem ubezpieczeniowym cargo w Polsce w sprawie partnerstwa generującego popyt wymuszony wymogami kontrahenta: ubezpieczyciel rekomenduje CargoDT jako warunek preferencyjnej składki.</w:t>
       </w:r>
     </w:p>
     <w:p>
@@ -888,52 +875,39 @@
           <w:b w:val="0"/>
           <w:highlight w:val="yellow"/>
         </w:rPr>
-        <w:t>struktura: ilu przewoźników z własnymi naczepami, łączna liczba naczep, ilu z flotami 5-50</w:t>
+        <w:t>struktura bazy z tabeli w Aneksie C</w:t>
       </w:r>
       <w:r>
         <w:rPr>
           <w:b w:val="0"/>
         </w:rPr>
-        <w:t xml:space="preserve">. Pierwszy próg 50 pojazdów w 2030 r. pokrywają: wdrożenie własne Everest11 (flota 5 zestawów w najmie, wzrost do 20 według aneksu do umów najmu) oraz trzej operatorzy z listami intencyjnymi: Krajowe i Międzynarodowe Usługi Transportowe Hubert Lizak SZYK, Natanek Logistics i Transport Towarowy Paweł Łazarczyk. Listy zawierają </w:t>
+        <w:t xml:space="preserve">. Pierwszy próg, 50 pojazdów u klientów zewnętrznych w 2030 r., pokrywają listy intencyjne trzech operatorów: Krajowe i Międzynarodowe Usługi Transportowe Hubert Lizak SZYK, Natanek Logistics i Transport Towarowy Paweł Łazarczyk, łącznie </w:t>
       </w:r>
       <w:r>
         <w:rPr>
           <w:b w:val="0"/>
           <w:highlight w:val="yellow"/>
         </w:rPr>
-        <w:t>liczba naczep, warunki cenowe, termin</w:t>
+        <w:t>50 naczep, podział na operatorów</w:t>
       </w:r>
       <w:r>
         <w:rPr>
           <w:b w:val="0"/>
         </w:rPr>
-        <w:t xml:space="preserve">. Promocja: demonstracje u klientów bazy, targi branżowe w ramach Z10 </w:t>
+        <w:t xml:space="preserve">. Listy określają liczbę naczep, harmonogram, warunki cenowe, kryteria zakupu i dane operatora o szkodach </w:t>
       </w:r>
       <w:r>
         <w:rPr>
           <w:b w:val="0"/>
           <w:highlight w:val="yellow"/>
         </w:rPr>
-        <w:t>nazwy targów</w:t>
+        <w:t>potwierdzić po ponownym podpisaniu</w:t>
       </w:r>
       <w:r>
         <w:rPr>
           <w:b w:val="0"/>
         </w:rPr>
-        <w:t xml:space="preserve"> i partnerstwo z ubezpieczycielem. Segment 2 (od 2031): spedytorzy, ok. 12 000 firm </w:t>
-      </w:r>
-      <w:r>
-        <w:rPr>
-          <w:b w:val="0"/>
-          <w:highlight w:val="yellow"/>
-        </w:rPr>
-        <w:t>źródło</w:t>
-      </w:r>
-      <w:r>
-        <w:rPr>
-          <w:b w:val="0"/>
-        </w:rPr>
-        <w:t>. Segment 3 (od 2032): floty 50-200 pojazdów przez kanał ubezpieczeniowy i licencje API.</w:t>
+        <w:t>. Promocja: demonstracje u klientów bazy, partnerstwo z ubezpieczycielem, udział w targach Trans Logistics Poland w Warszawie (listopad, od 2031 r.) oraz w TRANSLOG Connect Congress w Budapeszcie (edycja 2028, zadanie Z10). Segment 2 (od 2031): spedytorzy, ok. 12 000 firm (GUS, Działalność przedsiębiorstw transportowych 2023). Segment 3 (od 2032): floty 50-200 pojazdów przez kanał ubezpieczeniowy oraz klienci w CEE przez partnerstwa z dostawcami TMS i licencje API.</w:t>
       </w:r>
     </w:p>
     <w:p>
@@ -1029,7 +1003,7 @@
                 <w:b w:val="0"/>
                 <w:sz w:val="18"/>
               </w:rPr>
-              <w:t>TAM = 544,97 tys. naczep (Eurostat 2023, Polska). Liczba ciągników z GUS (567 800) usunięta jako podstawa. SAM 200 000 pozostaje założeniem: potrzebna metoda (udział nadwozi zamkniętych i kurtynowych oraz naczep bez telematyki fabrycznej). Dane można pobrać z CEPiK/PZPM lub zamówić w ITS. Prognoza 1 000 pojazdów dotyczy tylko Polski (0,50% SAM, 0,18% TAM); komentarz w modelu o ekspansji CEE od 2033 trzeba usunąć.</w:t>
+              <w:t>SAM ma teraz metodę (Aneks A): TAM 544,97 tys. (Eurostat 2023), udział nadwozi nadających się do retrofit ok. 72% (PZPM, rejestracje nowych naczep 2025), udział naczep bez telematyki 86% (Frost &amp; Sullivan, stan z 2019). Wynik 337 tys., przyjęte 200 000. Przed wpisaniem sprawdzić liczby w raportach PZPM (CEP info, XI 2025) i znaleźć nowsze dane o telematyce naczep. Komentarz w modelu o ekspansji CEE jako części prognozy pojazdów ujednolicić z tekstem.</w:t>
             </w:r>
           </w:p>
         </w:tc>
@@ -1093,7 +1067,7 @@
                 <w:b w:val="0"/>
                 <w:sz w:val="18"/>
               </w:rPr>
-              <w:t>Wymagania odbiorców: potrzebna informacja, na jakich rozmowach lub ankietach oparto wymagania (liczba, okres). Usunięto zdania bez źródła ("przeciętny duży załadowca traci ponad 5 mln USD", "43% ciężarówek jeździ częściowo pustych") oraz twierdzenia "pierwsze rozwiązanie w Polsce i CEE".</w:t>
+              <w:t>Wymagania odbiorców oparte na 15 rozmowach z klientami: uzupełnić okres rozmów i wyniki z karty rozmowy (Aneks C). Usunięto zdania bez źródła ("przeciętny duży załadowca traci ponad 5 mln USD", "43% ciężarówek jeździ częściowo pustych") oraz twierdzenia "pierwsze rozwiązanie w Polsce i CEE".</w:t>
             </w:r>
           </w:p>
         </w:tc>
@@ -1125,7 +1099,7 @@
                 <w:b w:val="0"/>
                 <w:sz w:val="18"/>
               </w:rPr>
-              <w:t>Publicznych cen konkurencji nie ma. W tekście: orientacyjny abonament SkyBitz 30-75 USD za zasób miesięcznie (Capterra) i uczciwe stwierdzenie, że CargoDT jest droższy niż sama telematyka, z uzasadnieniem zakresu. Wymaga ofert (T10).</w:t>
+              <w:t>Publicznych cen konkurencji nie ma. W tekście: orientacyjny abonament SkyBitz 30-75 USD za zasób miesięcznie (Capterra) i stwierdzenie, że CargoDT jest droższy niż sama telematyka, z uzasadnieniem zakresu. Wymaga ofert (T10).</w:t>
             </w:r>
           </w:p>
         </w:tc>
@@ -1189,7 +1163,7 @@
                 <w:b w:val="0"/>
                 <w:sz w:val="18"/>
               </w:rPr>
-              <w:t>Struktura bazy 50+ kontrahentów i treść listów intencyjnych to dane do uzupełnienia (T06). Pochodzenie 20 naczep wdrożenia własnego: flota 5 zestawów w najmie z aneksem do 20 (D10).</w:t>
+              <w:t>Decyzja: wdrożenie na 50 pojazdach u trzech operatorów, bez pojazdów własnych Everest11 (D35). Wymaga ponownego podpisania listów intencyjnych na łącznie 50 naczep (elementy w Aneksie B) oraz opisu struktury bazy 50+ (Aneks C).</w:t>
             </w:r>
           </w:p>
         </w:tc>
@@ -1221,7 +1195,7 @@
                 <w:b w:val="0"/>
                 <w:sz w:val="18"/>
               </w:rPr>
-              <w:t>Marketing: demonstracje, targi z Z10 (nazwy z 3.1), partnerstwo z ubezpieczycielem. Do uzupełnienia nazwy targów i stan rozmów.</w:t>
+              <w:t>Targi: TRANSLOG Connect Congress w Budapeszcie (edycja 2028, Z10, wg 3.2.2 wniosku) i Trans Logistics Poland w Warszawie (kanał akwizycji od 2031 r., wg 2.1). Stan rozmów z ubezpieczycielem: tekst bez zmian względem wniosku.</w:t>
             </w:r>
           </w:p>
         </w:tc>
@@ -1284,7 +1258,7 @@
         <w:rPr>
           <w:b w:val="0"/>
         </w:rPr>
-        <w:t xml:space="preserve"> data wdrożenia 11.2029 sprzeczna z decyzją D09 (start sprzedaży 01.2030). Opis wdrożenia własnego (20 naczep) ujednolicić z flotą 5 zestawów w najmie i aneksem.</w:t>
+        <w:t xml:space="preserve"> data wdrożenia 11.2029 sprzeczna z decyzją D09 (start sprzedaży 01.2030).</w:t>
       </w:r>
     </w:p>
     <w:p>
@@ -1295,13 +1269,13 @@
         <w:rPr>
           <w:b/>
         </w:rPr>
-        <w:t>Wdrożenie własne a przychody:</w:t>
+        <w:t>Wdrożenie na 50 pojazdach u klientów (D35):</w:t>
       </w:r>
       <w:r>
         <w:rPr>
           <w:b w:val="0"/>
         </w:rPr>
-        <w:t xml:space="preserve"> w prognozie 2030 r. 20 z 50 pojazdów to flota własna Everest11. Przychód z abonamentu i zestawów dla własnych naczep nie jest przychodem zewnętrznym. Decyzja do podjęcia: pozostawić z wyjaśnieniem (np. wewnętrzna usługa wyceniona rynkowo) albo ograniczyć prognozę do klientów zewnętrznych.</w:t>
+        <w:t xml:space="preserve"> usunąć we wniosku wdrożenie własne na 20 naczepach: pkt 2.1 (Etap 1: „wdrożenie systemu we własnej działalności Everest11” opisać jako wprowadzenie usługi i integrację z TMS, a cel „50 aktywnych pojazdów” jako pojazdy trzech operatorów), komentarz w modelu finansowym (Przychody) i 1.3. Model finansowy bez zmian liczbowych. Flota testowa w Z9 (D10, min. 3 pojazdy) jest odrębna i nie wchodzi do liczby klientów.</w:t>
       </w:r>
     </w:p>
     <w:p>
@@ -1338,6 +1312,1450 @@
         <w:t xml:space="preserve"> liczby 600 000 naczep w Polsce i w CEE są niespójne z TAM 544,97 tys. Przy rozmowach z oceniającymi używać jednej podstawy.</w:t>
       </w:r>
     </w:p>
+    <w:p>
+      <w:pPr>
+        <w:pStyle w:val="Heading1"/>
+      </w:pPr>
+      <w:r>
+        <w:t>Aneks A. Metoda SAM z danych publicznych</w:t>
+      </w:r>
+    </w:p>
+    <w:tbl>
+      <w:tblPr>
+        <w:tblStyle w:val="TableGrid"/>
+        <w:tblW w:type="auto" w:w="0"/>
+        <w:tblLook w:firstColumn="1" w:firstRow="1" w:lastColumn="0" w:lastRow="0" w:noHBand="0" w:noVBand="1" w:val="04A0"/>
+      </w:tblPr>
+      <w:tblGrid>
+        <w:gridCol w:w="3213"/>
+        <w:gridCol w:w="3213"/>
+        <w:gridCol w:w="3213"/>
+      </w:tblGrid>
+      <w:tr>
+        <w:tc>
+          <w:tcPr>
+            <w:tcW w:type="dxa" w:w="3685"/>
+          </w:tcPr>
+          <w:p>
+            <w:r/>
+            <w:r>
+              <w:rPr>
+                <w:b/>
+                <w:sz w:val="18"/>
+              </w:rPr>
+              <w:t>Krok</w:t>
+            </w:r>
+          </w:p>
+        </w:tc>
+        <w:tc>
+          <w:tcPr>
+            <w:tcW w:type="dxa" w:w="1417"/>
+          </w:tcPr>
+          <w:p>
+            <w:r/>
+            <w:r>
+              <w:rPr>
+                <w:b/>
+                <w:sz w:val="18"/>
+              </w:rPr>
+              <w:t>Wartość</w:t>
+            </w:r>
+          </w:p>
+        </w:tc>
+        <w:tc>
+          <w:tcPr>
+            <w:tcW w:type="dxa" w:w="4649"/>
+          </w:tcPr>
+          <w:p>
+            <w:r/>
+            <w:r>
+              <w:rPr>
+                <w:b/>
+                <w:sz w:val="18"/>
+              </w:rPr>
+              <w:t>Źródło</w:t>
+            </w:r>
+          </w:p>
+        </w:tc>
+      </w:tr>
+      <w:tr>
+        <w:tc>
+          <w:tcPr>
+            <w:tcW w:type="dxa" w:w="3685"/>
+          </w:tcPr>
+          <w:p>
+            <w:r/>
+            <w:r>
+              <w:rPr>
+                <w:b w:val="0"/>
+                <w:sz w:val="18"/>
+              </w:rPr>
+              <w:t>TAM: naczepy w Polsce, 2023</w:t>
+            </w:r>
+          </w:p>
+        </w:tc>
+        <w:tc>
+          <w:tcPr>
+            <w:tcW w:type="dxa" w:w="1417"/>
+          </w:tcPr>
+          <w:p>
+            <w:r/>
+            <w:r>
+              <w:rPr>
+                <w:b w:val="0"/>
+                <w:sz w:val="18"/>
+              </w:rPr>
+              <w:t>544 970</w:t>
+            </w:r>
+          </w:p>
+        </w:tc>
+        <w:tc>
+          <w:tcPr>
+            <w:tcW w:type="dxa" w:w="4649"/>
+          </w:tcPr>
+          <w:p>
+            <w:r/>
+            <w:r>
+              <w:rPr>
+                <w:b w:val="0"/>
+                <w:sz w:val="18"/>
+              </w:rPr>
+              <w:t>Eurostat, road_eqs_semit (Polska największa w UE, przed Niemcami 402,62 tys. i Francją 362,52 tys.)</w:t>
+            </w:r>
+          </w:p>
+        </w:tc>
+      </w:tr>
+      <w:tr>
+        <w:tc>
+          <w:tcPr>
+            <w:tcW w:type="dxa" w:w="3685"/>
+          </w:tcPr>
+          <w:p>
+            <w:r/>
+            <w:r>
+              <w:rPr>
+                <w:b w:val="0"/>
+                <w:sz w:val="18"/>
+              </w:rPr>
+              <w:t>Udział nadwozi nadających się do retrofit (platformy i skrzyniowe w tym kurtynowe 47-48%, furgony 24-25%)</w:t>
+            </w:r>
+          </w:p>
+        </w:tc>
+        <w:tc>
+          <w:tcPr>
+            <w:tcW w:type="dxa" w:w="1417"/>
+          </w:tcPr>
+          <w:p>
+            <w:r/>
+            <w:r>
+              <w:rPr>
+                <w:b w:val="0"/>
+                <w:sz w:val="18"/>
+              </w:rPr>
+              <w:t>ok. 72%</w:t>
+            </w:r>
+          </w:p>
+        </w:tc>
+        <w:tc>
+          <w:tcPr>
+            <w:tcW w:type="dxa" w:w="4649"/>
+          </w:tcPr>
+          <w:p>
+            <w:r/>
+            <w:r>
+              <w:rPr>
+                <w:b w:val="0"/>
+                <w:sz w:val="18"/>
+              </w:rPr>
+              <w:t>PZPM, CEP info o rejestracjach przyczep i naczep, 2025. To struktura nowych rejestracji, więc tylko przybliżenie floty; grupa platform zawiera naczepy bez zabudowy, więc wartość jest górnym oszacowaniem.</w:t>
+            </w:r>
+          </w:p>
+        </w:tc>
+      </w:tr>
+      <w:tr>
+        <w:tc>
+          <w:tcPr>
+            <w:tcW w:type="dxa" w:w="3685"/>
+          </w:tcPr>
+          <w:p>
+            <w:r/>
+            <w:r>
+              <w:rPr>
+                <w:b w:val="0"/>
+                <w:sz w:val="18"/>
+              </w:rPr>
+              <w:t>Naczepy bez telematyki fabrycznej</w:t>
+            </w:r>
+          </w:p>
+        </w:tc>
+        <w:tc>
+          <w:tcPr>
+            <w:tcW w:type="dxa" w:w="1417"/>
+          </w:tcPr>
+          <w:p>
+            <w:r/>
+            <w:r>
+              <w:rPr>
+                <w:b w:val="0"/>
+                <w:sz w:val="18"/>
+              </w:rPr>
+              <w:t>86%</w:t>
+            </w:r>
+          </w:p>
+        </w:tc>
+        <w:tc>
+          <w:tcPr>
+            <w:tcW w:type="dxa" w:w="4649"/>
+          </w:tcPr>
+          <w:p>
+            <w:r/>
+            <w:r>
+              <w:rPr>
+                <w:b w:val="0"/>
+                <w:sz w:val="18"/>
+              </w:rPr>
+              <w:t xml:space="preserve">Frost &amp; Sullivan: penetracja telematyki naczep w Europie ok. 14% w 2019 r. Dane starsze, do zastąpienia nowszymi </w:t>
+            </w:r>
+            <w:r>
+              <w:rPr>
+                <w:b w:val="0"/>
+                <w:sz w:val="18"/>
+                <w:highlight w:val="yellow"/>
+              </w:rPr>
+              <w:t>sprawdzić</w:t>
+            </w:r>
+            <w:r>
+              <w:rPr>
+                <w:b w:val="0"/>
+                <w:sz w:val="18"/>
+              </w:rPr>
+              <w:t>.</w:t>
+            </w:r>
+          </w:p>
+        </w:tc>
+      </w:tr>
+      <w:tr>
+        <w:tc>
+          <w:tcPr>
+            <w:tcW w:type="dxa" w:w="3685"/>
+          </w:tcPr>
+          <w:p>
+            <w:r/>
+            <w:r>
+              <w:rPr>
+                <w:b w:val="0"/>
+                <w:sz w:val="18"/>
+              </w:rPr>
+              <w:t>Wynik: 544 970 x 72% x 86%</w:t>
+            </w:r>
+          </w:p>
+        </w:tc>
+        <w:tc>
+          <w:tcPr>
+            <w:tcW w:type="dxa" w:w="1417"/>
+          </w:tcPr>
+          <w:p>
+            <w:r/>
+            <w:r>
+              <w:rPr>
+                <w:b w:val="0"/>
+                <w:sz w:val="18"/>
+              </w:rPr>
+              <w:t>ok. 337 000</w:t>
+            </w:r>
+          </w:p>
+        </w:tc>
+        <w:tc>
+          <w:tcPr>
+            <w:tcW w:type="dxa" w:w="4649"/>
+          </w:tcPr>
+          <w:p>
+            <w:r/>
+            <w:r>
+              <w:rPr>
+                <w:b w:val="0"/>
+                <w:sz w:val="18"/>
+              </w:rPr>
+              <w:t>Obliczenie.</w:t>
+            </w:r>
+          </w:p>
+        </w:tc>
+      </w:tr>
+      <w:tr>
+        <w:tc>
+          <w:tcPr>
+            <w:tcW w:type="dxa" w:w="3685"/>
+          </w:tcPr>
+          <w:p>
+            <w:r/>
+            <w:r>
+              <w:rPr>
+                <w:b w:val="0"/>
+                <w:sz w:val="18"/>
+              </w:rPr>
+              <w:t>SAM przyjęty w projekcie</w:t>
+            </w:r>
+          </w:p>
+        </w:tc>
+        <w:tc>
+          <w:tcPr>
+            <w:tcW w:type="dxa" w:w="1417"/>
+          </w:tcPr>
+          <w:p>
+            <w:r/>
+            <w:r>
+              <w:rPr>
+                <w:b w:val="0"/>
+                <w:sz w:val="18"/>
+              </w:rPr>
+              <w:t>200 000</w:t>
+            </w:r>
+          </w:p>
+        </w:tc>
+        <w:tc>
+          <w:tcPr>
+            <w:tcW w:type="dxa" w:w="4649"/>
+          </w:tcPr>
+          <w:p>
+            <w:r/>
+            <w:r>
+              <w:rPr>
+                <w:b w:val="0"/>
+                <w:sz w:val="18"/>
+              </w:rPr>
+              <w:t>Ostrożnie, ok. 59% wyniku i ok. 37% TAM.</w:t>
+            </w:r>
+          </w:p>
+        </w:tc>
+      </w:tr>
+      <w:tr>
+        <w:tc>
+          <w:tcPr>
+            <w:tcW w:type="dxa" w:w="3685"/>
+          </w:tcPr>
+          <w:p>
+            <w:r/>
+            <w:r>
+              <w:rPr>
+                <w:b w:val="0"/>
+                <w:sz w:val="18"/>
+              </w:rPr>
+              <w:t>SOM 2034</w:t>
+            </w:r>
+          </w:p>
+        </w:tc>
+        <w:tc>
+          <w:tcPr>
+            <w:tcW w:type="dxa" w:w="1417"/>
+          </w:tcPr>
+          <w:p>
+            <w:r/>
+            <w:r>
+              <w:rPr>
+                <w:b w:val="0"/>
+                <w:sz w:val="18"/>
+              </w:rPr>
+              <w:t>1 000 naczep</w:t>
+            </w:r>
+          </w:p>
+        </w:tc>
+        <w:tc>
+          <w:tcPr>
+            <w:tcW w:type="dxa" w:w="4649"/>
+          </w:tcPr>
+          <w:p>
+            <w:r/>
+            <w:r>
+              <w:rPr>
+                <w:b w:val="0"/>
+                <w:sz w:val="18"/>
+              </w:rPr>
+              <w:t>0,50% SAM i 0,18% TAM.</w:t>
+            </w:r>
+          </w:p>
+        </w:tc>
+      </w:tr>
+    </w:tbl>
+    <w:p/>
+    <w:p>
+      <w:pPr>
+        <w:spacing w:after="60"/>
+      </w:pPr>
+      <w:r>
+        <w:rPr>
+          <w:b w:val="0"/>
+        </w:rPr>
+        <w:t>Liczby PZPM pochodzą z dwóch raportów miesięcznych (zakres 47-48% i 24-25% wynika z różnych miesięcy), więc przed wpisaniem do LSI trzeba podać jeden raport i datę. Liczby dla Czech, Słowacji, Węgier i Rumunii z Eurostatu nie zostały pobrane. Dopóki ich nie ma, nie należy podawać wielkości rynku CEE, a we wniosku usunąć „400 000-600 000 naczep” (pkt 1.3, 2.1 Segment 3, Z10 pkt 3.2.2).</w:t>
+      </w:r>
+    </w:p>
+    <w:p>
+      <w:pPr>
+        <w:pStyle w:val="Heading1"/>
+      </w:pPr>
+      <w:r>
+        <w:t>Aneks B. Elementy listu intencyjnego, które wzmocnią wniosek</w:t>
+      </w:r>
+    </w:p>
+    <w:p>
+      <w:pPr>
+        <w:spacing w:after="60"/>
+      </w:pPr>
+      <w:r>
+        <w:rPr>
+          <w:b w:val="0"/>
+        </w:rPr>
+        <w:t>Listy zostaną podpisane ponownie. Poniższe elementy odpowiadają na pytania eksperta z K2-01 i K2-06 (liczba naczep, warunki, gotowość płatnicza). List ma pozostać niewiążący, ale konkretny. Wszystkie liczby wpisuje operator na podstawie swoich danych.</w:t>
+      </w:r>
+    </w:p>
+    <w:tbl>
+      <w:tblPr>
+        <w:tblStyle w:val="TableGrid"/>
+        <w:tblW w:type="auto" w:w="0"/>
+        <w:tblLook w:firstColumn="1" w:firstRow="1" w:lastColumn="0" w:lastRow="0" w:noHBand="0" w:noVBand="1" w:val="04A0"/>
+      </w:tblPr>
+      <w:tblGrid>
+        <w:gridCol w:w="3213"/>
+        <w:gridCol w:w="3213"/>
+        <w:gridCol w:w="3213"/>
+      </w:tblGrid>
+      <w:tr>
+        <w:tc>
+          <w:tcPr>
+            <w:tcW w:type="dxa" w:w="2041"/>
+          </w:tcPr>
+          <w:p>
+            <w:r/>
+            <w:r>
+              <w:rPr>
+                <w:b/>
+                <w:sz w:val="18"/>
+              </w:rPr>
+              <w:t>Element</w:t>
+            </w:r>
+          </w:p>
+        </w:tc>
+        <w:tc>
+          <w:tcPr>
+            <w:tcW w:type="dxa" w:w="4649"/>
+          </w:tcPr>
+          <w:p>
+            <w:r/>
+            <w:r>
+              <w:rPr>
+                <w:b/>
+                <w:sz w:val="18"/>
+              </w:rPr>
+              <w:t>Co zawiera</w:t>
+            </w:r>
+          </w:p>
+        </w:tc>
+        <w:tc>
+          <w:tcPr>
+            <w:tcW w:type="dxa" w:w="3061"/>
+          </w:tcPr>
+          <w:p>
+            <w:r/>
+            <w:r>
+              <w:rPr>
+                <w:b/>
+                <w:sz w:val="18"/>
+              </w:rPr>
+              <w:t>Po co</w:t>
+            </w:r>
+          </w:p>
+        </w:tc>
+      </w:tr>
+      <w:tr>
+        <w:tc>
+          <w:tcPr>
+            <w:tcW w:type="dxa" w:w="2041"/>
+          </w:tcPr>
+          <w:p>
+            <w:r/>
+            <w:r>
+              <w:rPr>
+                <w:b w:val="0"/>
+                <w:sz w:val="18"/>
+              </w:rPr>
+              <w:t>1. Strony i data</w:t>
+            </w:r>
+          </w:p>
+        </w:tc>
+        <w:tc>
+          <w:tcPr>
+            <w:tcW w:type="dxa" w:w="4649"/>
+          </w:tcPr>
+          <w:p>
+            <w:r/>
+            <w:r>
+              <w:rPr>
+                <w:b w:val="0"/>
+                <w:sz w:val="18"/>
+              </w:rPr>
+              <w:t>Everest11 sp. z o.o. oraz operator (nazwa, NIP, adres), miejscowość i data podpisania przed złożeniem poprawionego wniosku.</w:t>
+            </w:r>
+          </w:p>
+        </w:tc>
+        <w:tc>
+          <w:tcPr>
+            <w:tcW w:type="dxa" w:w="3061"/>
+          </w:tcPr>
+          <w:p>
+            <w:r/>
+            <w:r>
+              <w:rPr>
+                <w:b w:val="0"/>
+                <w:sz w:val="18"/>
+              </w:rPr>
+              <w:t>Wiarygodność i aktualność dokumentu.</w:t>
+            </w:r>
+          </w:p>
+        </w:tc>
+      </w:tr>
+      <w:tr>
+        <w:tc>
+          <w:tcPr>
+            <w:tcW w:type="dxa" w:w="2041"/>
+          </w:tcPr>
+          <w:p>
+            <w:r/>
+            <w:r>
+              <w:rPr>
+                <w:b w:val="0"/>
+                <w:sz w:val="18"/>
+              </w:rPr>
+              <w:t>2. Charakter listu</w:t>
+            </w:r>
+          </w:p>
+        </w:tc>
+        <w:tc>
+          <w:tcPr>
+            <w:tcW w:type="dxa" w:w="4649"/>
+          </w:tcPr>
+          <w:p>
+            <w:r/>
+            <w:r>
+              <w:rPr>
+                <w:b w:val="0"/>
+                <w:sz w:val="18"/>
+              </w:rPr>
+              <w:t>Zamiar zakupu systemu po zakończeniu prac B+R i certyfikacji CE. Zapis, że list nie jest umową przedwstępną, ale strony zamierzają negocjować umowę wdrożeniową w ciągu 3 miesięcy od certyfikacji.</w:t>
+            </w:r>
+          </w:p>
+        </w:tc>
+        <w:tc>
+          <w:tcPr>
+            <w:tcW w:type="dxa" w:w="3061"/>
+          </w:tcPr>
+          <w:p>
+            <w:r/>
+            <w:r>
+              <w:rPr>
+                <w:b w:val="0"/>
+                <w:sz w:val="18"/>
+              </w:rPr>
+              <w:t>Daje konkretny plan, bez ryzyka prawnego.</w:t>
+            </w:r>
+          </w:p>
+        </w:tc>
+      </w:tr>
+      <w:tr>
+        <w:tc>
+          <w:tcPr>
+            <w:tcW w:type="dxa" w:w="2041"/>
+          </w:tcPr>
+          <w:p>
+            <w:r/>
+            <w:r>
+              <w:rPr>
+                <w:b w:val="0"/>
+                <w:sz w:val="18"/>
+              </w:rPr>
+              <w:t>3. Profil operatora na 31.12.2025</w:t>
+            </w:r>
+          </w:p>
+        </w:tc>
+        <w:tc>
+          <w:tcPr>
+            <w:tcW w:type="dxa" w:w="4649"/>
+          </w:tcPr>
+          <w:p>
+            <w:r/>
+            <w:r>
+              <w:rPr>
+                <w:b w:val="0"/>
+                <w:sz w:val="18"/>
+              </w:rPr>
+              <w:t>Liczba ciągników i naczep, typy nadwozi (kurtyna, furgon, izoterma), wiek naczep, trasy (udział PL-UE), roczna liczba kursów, udział ładunków wrażliwych.</w:t>
+            </w:r>
+          </w:p>
+        </w:tc>
+        <w:tc>
+          <w:tcPr>
+            <w:tcW w:type="dxa" w:w="3061"/>
+          </w:tcPr>
+          <w:p>
+            <w:r/>
+            <w:r>
+              <w:rPr>
+                <w:b w:val="0"/>
+                <w:sz w:val="18"/>
+              </w:rPr>
+              <w:t>Potwierdza, że operator mieści się w SAM i SOM (floty 5-50 naczep, nadwozia nadające się do retrofit).</w:t>
+            </w:r>
+          </w:p>
+        </w:tc>
+      </w:tr>
+      <w:tr>
+        <w:tc>
+          <w:tcPr>
+            <w:tcW w:type="dxa" w:w="2041"/>
+          </w:tcPr>
+          <w:p>
+            <w:r/>
+            <w:r>
+              <w:rPr>
+                <w:b w:val="0"/>
+                <w:sz w:val="18"/>
+              </w:rPr>
+              <w:t>4. Zakres zainteresowania</w:t>
+            </w:r>
+          </w:p>
+        </w:tc>
+        <w:tc>
+          <w:tcPr>
+            <w:tcW w:type="dxa" w:w="4649"/>
+          </w:tcPr>
+          <w:p>
+            <w:r/>
+            <w:r>
+              <w:rPr>
+                <w:b w:val="0"/>
+                <w:sz w:val="18"/>
+              </w:rPr>
+              <w:t>Liczba naczep do wyposażenia w 2030 r. (łącznie trzy listy: 50) oraz opcja kolejnych naczep w 2031 r.</w:t>
+            </w:r>
+          </w:p>
+        </w:tc>
+        <w:tc>
+          <w:tcPr>
+            <w:tcW w:type="dxa" w:w="3061"/>
+          </w:tcPr>
+          <w:p>
+            <w:r/>
+            <w:r>
+              <w:rPr>
+                <w:b w:val="0"/>
+                <w:sz w:val="18"/>
+              </w:rPr>
+              <w:t>Pokrywa próg 50 pojazdów w 2030 r. i wyjaśnia pochodzenie liczby.</w:t>
+            </w:r>
+          </w:p>
+        </w:tc>
+      </w:tr>
+      <w:tr>
+        <w:tc>
+          <w:tcPr>
+            <w:tcW w:type="dxa" w:w="2041"/>
+          </w:tcPr>
+          <w:p>
+            <w:r/>
+            <w:r>
+              <w:rPr>
+                <w:b w:val="0"/>
+                <w:sz w:val="18"/>
+              </w:rPr>
+              <w:t>5. Warunki cenowe</w:t>
+            </w:r>
+          </w:p>
+        </w:tc>
+        <w:tc>
+          <w:tcPr>
+            <w:tcW w:type="dxa" w:w="4649"/>
+          </w:tcPr>
+          <w:p>
+            <w:r/>
+            <w:r>
+              <w:rPr>
+                <w:b w:val="0"/>
+                <w:sz w:val="18"/>
+              </w:rPr>
+              <w:t>Odniesienie do cen orientacyjnych: subskrypcja 349 PLN za pojazd miesięcznie, zestaw średnio 7 500 PLN za naczepę, licencja API 4 800 PLN rocznie, ceny netto, ważne do ustalonej daty. Oświadczenie operatora, że poziom cen jest dla niego akceptowalny, albo wskazanie maksymalnej ceny.</w:t>
+            </w:r>
+          </w:p>
+        </w:tc>
+        <w:tc>
+          <w:tcPr>
+            <w:tcW w:type="dxa" w:w="3061"/>
+          </w:tcPr>
+          <w:p>
+            <w:r/>
+            <w:r>
+              <w:rPr>
+                <w:b w:val="0"/>
+                <w:sz w:val="18"/>
+              </w:rPr>
+              <w:t>Gotowość płatnicza (K2-06), uzasadnienie cen.</w:t>
+            </w:r>
+          </w:p>
+        </w:tc>
+      </w:tr>
+      <w:tr>
+        <w:tc>
+          <w:tcPr>
+            <w:tcW w:type="dxa" w:w="2041"/>
+          </w:tcPr>
+          <w:p>
+            <w:r/>
+            <w:r>
+              <w:rPr>
+                <w:b w:val="0"/>
+                <w:sz w:val="18"/>
+              </w:rPr>
+              <w:t>6. Kryteria zakupu</w:t>
+            </w:r>
+          </w:p>
+        </w:tc>
+        <w:tc>
+          <w:tcPr>
+            <w:tcW w:type="dxa" w:w="4649"/>
+          </w:tcPr>
+          <w:p>
+            <w:r/>
+            <w:r>
+              <w:rPr>
+                <w:b w:val="0"/>
+                <w:sz w:val="18"/>
+              </w:rPr>
+              <w:t>Parametry, po których osiągnięciu operator kupi: alert lokalny w czasie nie dłuższym niż 1 s, czas Proof of Condition nie dłuższy niż 30 s, AUC-ROC nie mniejsze niż 0,82 po kompresji, integracja z TMS operatora (nazwa systemu), zgodność z RODO dla kamer.</w:t>
+            </w:r>
+          </w:p>
+        </w:tc>
+        <w:tc>
+          <w:tcPr>
+            <w:tcW w:type="dxa" w:w="3061"/>
+          </w:tcPr>
+          <w:p>
+            <w:r/>
+            <w:r>
+              <w:rPr>
+                <w:b w:val="0"/>
+                <w:sz w:val="18"/>
+              </w:rPr>
+              <w:t>Łączy list z wskaźnikami innowacyjności i z wymaganiami odbiorców (K2-11).</w:t>
+            </w:r>
+          </w:p>
+        </w:tc>
+      </w:tr>
+      <w:tr>
+        <w:tc>
+          <w:tcPr>
+            <w:tcW w:type="dxa" w:w="2041"/>
+          </w:tcPr>
+          <w:p>
+            <w:r/>
+            <w:r>
+              <w:rPr>
+                <w:b w:val="0"/>
+                <w:sz w:val="18"/>
+              </w:rPr>
+              <w:t>7. Dane o szkodach z ostatnich 12 miesięcy</w:t>
+            </w:r>
+          </w:p>
+        </w:tc>
+        <w:tc>
+          <w:tcPr>
+            <w:tcW w:type="dxa" w:w="4649"/>
+          </w:tcPr>
+          <w:p>
+            <w:r/>
+            <w:r>
+              <w:rPr>
+                <w:b w:val="0"/>
+                <w:sz w:val="18"/>
+              </w:rPr>
+              <w:t>Liczba roszczeń za uszkodzenie ładunku, ich wartość i średnia wartość, odsetek roszczeń bez skutecznej obrony, roczna składka ubezpieczenia cargo lub OC przewoźnika.</w:t>
+            </w:r>
+          </w:p>
+        </w:tc>
+        <w:tc>
+          <w:tcPr>
+            <w:tcW w:type="dxa" w:w="3061"/>
+          </w:tcPr>
+          <w:p>
+            <w:r/>
+            <w:r>
+              <w:rPr>
+                <w:b w:val="0"/>
+                <w:sz w:val="18"/>
+              </w:rPr>
+              <w:t>Pozwala policzyć wartość systemu dla klienta zamiast powoływać się na średnie z badań (K2-14).</w:t>
+            </w:r>
+          </w:p>
+        </w:tc>
+      </w:tr>
+      <w:tr>
+        <w:tc>
+          <w:tcPr>
+            <w:tcW w:type="dxa" w:w="2041"/>
+          </w:tcPr>
+          <w:p>
+            <w:r/>
+            <w:r>
+              <w:rPr>
+                <w:b w:val="0"/>
+                <w:sz w:val="18"/>
+              </w:rPr>
+              <w:t>8. Współpraca w projekcie</w:t>
+            </w:r>
+          </w:p>
+        </w:tc>
+        <w:tc>
+          <w:tcPr>
+            <w:tcW w:type="dxa" w:w="4649"/>
+          </w:tcPr>
+          <w:p>
+            <w:r/>
+            <w:r>
+              <w:rPr>
+                <w:b w:val="0"/>
+                <w:sz w:val="18"/>
+              </w:rPr>
+              <w:t>Udział w co najmniej 2 warsztatach wymagań w okresie realizacji, przekazanie opisu typowych zdarzeń w przewozie. Bez deklaracji udostępnienia pojazdów, bo flota testowa Z9 jest rozliczana osobno.</w:t>
+            </w:r>
+          </w:p>
+        </w:tc>
+        <w:tc>
+          <w:tcPr>
+            <w:tcW w:type="dxa" w:w="3061"/>
+          </w:tcPr>
+          <w:p>
+            <w:r/>
+            <w:r>
+              <w:rPr>
+                <w:b w:val="0"/>
+                <w:sz w:val="18"/>
+              </w:rPr>
+              <w:t>Pokazuje udział odbiorców w kształtowaniu produktu i nie koliduje z flotą testową.</w:t>
+            </w:r>
+          </w:p>
+        </w:tc>
+      </w:tr>
+      <w:tr>
+        <w:tc>
+          <w:tcPr>
+            <w:tcW w:type="dxa" w:w="2041"/>
+          </w:tcPr>
+          <w:p>
+            <w:r/>
+            <w:r>
+              <w:rPr>
+                <w:b w:val="0"/>
+                <w:sz w:val="18"/>
+              </w:rPr>
+              <w:t>9. Ważność i warunki</w:t>
+            </w:r>
+          </w:p>
+        </w:tc>
+        <w:tc>
+          <w:tcPr>
+            <w:tcW w:type="dxa" w:w="4649"/>
+          </w:tcPr>
+          <w:p>
+            <w:r/>
+            <w:r>
+              <w:rPr>
+                <w:b w:val="0"/>
+                <w:sz w:val="18"/>
+              </w:rPr>
+              <w:t>List ważny do 31.12.2030, bez wyłączności, z klauzulą poufności i zgodą na wskazanie operatora z nazwy we wniosku.</w:t>
+            </w:r>
+          </w:p>
+        </w:tc>
+        <w:tc>
+          <w:tcPr>
+            <w:tcW w:type="dxa" w:w="3061"/>
+          </w:tcPr>
+          <w:p>
+            <w:r/>
+            <w:r>
+              <w:rPr>
+                <w:b w:val="0"/>
+                <w:sz w:val="18"/>
+              </w:rPr>
+              <w:t>Porządek formalny.</w:t>
+            </w:r>
+          </w:p>
+        </w:tc>
+      </w:tr>
+      <w:tr>
+        <w:tc>
+          <w:tcPr>
+            <w:tcW w:type="dxa" w:w="2041"/>
+          </w:tcPr>
+          <w:p>
+            <w:r/>
+            <w:r>
+              <w:rPr>
+                <w:b w:val="0"/>
+                <w:sz w:val="18"/>
+              </w:rPr>
+              <w:t>10. Podpisy</w:t>
+            </w:r>
+          </w:p>
+        </w:tc>
+        <w:tc>
+          <w:tcPr>
+            <w:tcW w:type="dxa" w:w="4649"/>
+          </w:tcPr>
+          <w:p>
+            <w:r/>
+            <w:r>
+              <w:rPr>
+                <w:b w:val="0"/>
+                <w:sz w:val="18"/>
+              </w:rPr>
+              <w:t>Osoby uprawnione do reprezentacji obu stron, zgodnie z KRS.</w:t>
+            </w:r>
+          </w:p>
+        </w:tc>
+        <w:tc>
+          <w:tcPr>
+            <w:tcW w:type="dxa" w:w="3061"/>
+          </w:tcPr>
+          <w:p>
+            <w:r/>
+            <w:r>
+              <w:rPr>
+                <w:b w:val="0"/>
+                <w:sz w:val="18"/>
+              </w:rPr>
+              <w:t>Ważność.</w:t>
+            </w:r>
+          </w:p>
+        </w:tc>
+      </w:tr>
+    </w:tbl>
+    <w:p/>
+    <w:p>
+      <w:pPr>
+        <w:pStyle w:val="Heading1"/>
+      </w:pPr>
+      <w:r>
+        <w:t>Aneks C. Struktura bazy ponad 50 kontrahentów i karta rozmowy</w:t>
+      </w:r>
+    </w:p>
+    <w:p>
+      <w:pPr>
+        <w:spacing w:after="60"/>
+      </w:pPr>
+      <w:r>
+        <w:rPr>
+          <w:b w:val="0"/>
+        </w:rPr>
+        <w:t>Do opisu w pkt 1.3 i 2.1 proponuję jedną tabelę z bazy klientów (CRM) według tych samych kryteriów co SAM i SOM. Liczby wpisuje Everest11. Do tekstu trafiają tylko sumy.</w:t>
+      </w:r>
+    </w:p>
+    <w:tbl>
+      <w:tblPr>
+        <w:tblStyle w:val="TableGrid"/>
+        <w:tblW w:type="auto" w:w="0"/>
+        <w:tblLook w:firstColumn="1" w:firstRow="1" w:lastColumn="0" w:lastRow="0" w:noHBand="0" w:noVBand="1" w:val="04A0"/>
+      </w:tblPr>
+      <w:tblGrid>
+        <w:gridCol w:w="3213"/>
+        <w:gridCol w:w="3213"/>
+        <w:gridCol w:w="3213"/>
+      </w:tblGrid>
+      <w:tr>
+        <w:tc>
+          <w:tcPr>
+            <w:tcW w:type="dxa" w:w="1814"/>
+          </w:tcPr>
+          <w:p>
+            <w:r/>
+            <w:r>
+              <w:rPr>
+                <w:b/>
+                <w:sz w:val="18"/>
+              </w:rPr>
+              <w:t>Wymiar</w:t>
+            </w:r>
+          </w:p>
+        </w:tc>
+        <w:tc>
+          <w:tcPr>
+            <w:tcW w:type="dxa" w:w="4309"/>
+          </w:tcPr>
+          <w:p>
+            <w:r/>
+            <w:r>
+              <w:rPr>
+                <w:b/>
+                <w:sz w:val="18"/>
+              </w:rPr>
+              <w:t>Podział</w:t>
+            </w:r>
+          </w:p>
+        </w:tc>
+        <w:tc>
+          <w:tcPr>
+            <w:tcW w:type="dxa" w:w="3628"/>
+          </w:tcPr>
+          <w:p>
+            <w:r/>
+            <w:r>
+              <w:rPr>
+                <w:b/>
+                <w:sz w:val="18"/>
+              </w:rPr>
+              <w:t>Wynik do tekstu</w:t>
+            </w:r>
+          </w:p>
+        </w:tc>
+      </w:tr>
+      <w:tr>
+        <w:tc>
+          <w:tcPr>
+            <w:tcW w:type="dxa" w:w="1814"/>
+          </w:tcPr>
+          <w:p>
+            <w:r/>
+            <w:r>
+              <w:rPr>
+                <w:b w:val="0"/>
+                <w:sz w:val="18"/>
+              </w:rPr>
+              <w:t>Rola klienta</w:t>
+            </w:r>
+          </w:p>
+        </w:tc>
+        <w:tc>
+          <w:tcPr>
+            <w:tcW w:type="dxa" w:w="4309"/>
+          </w:tcPr>
+          <w:p>
+            <w:r/>
+            <w:r>
+              <w:rPr>
+                <w:b w:val="0"/>
+                <w:sz w:val="18"/>
+              </w:rPr>
+              <w:t>przewoźnik z własnymi naczepami; przewoźnik tylko podwykonawca; załadowca; spedytor bez taboru</w:t>
+            </w:r>
+          </w:p>
+        </w:tc>
+        <w:tc>
+          <w:tcPr>
+            <w:tcW w:type="dxa" w:w="3628"/>
+          </w:tcPr>
+          <w:p>
+            <w:r/>
+            <w:r>
+              <w:rPr>
+                <w:b w:val="0"/>
+                <w:sz w:val="18"/>
+              </w:rPr>
+              <w:t>liczba klientów w każdej grupie</w:t>
+            </w:r>
+          </w:p>
+        </w:tc>
+      </w:tr>
+      <w:tr>
+        <w:tc>
+          <w:tcPr>
+            <w:tcW w:type="dxa" w:w="1814"/>
+          </w:tcPr>
+          <w:p>
+            <w:r/>
+            <w:r>
+              <w:rPr>
+                <w:b w:val="0"/>
+                <w:sz w:val="18"/>
+              </w:rPr>
+              <w:t>Flota naczep</w:t>
+            </w:r>
+          </w:p>
+        </w:tc>
+        <w:tc>
+          <w:tcPr>
+            <w:tcW w:type="dxa" w:w="4309"/>
+          </w:tcPr>
+          <w:p>
+            <w:r/>
+            <w:r>
+              <w:rPr>
+                <w:b w:val="0"/>
+                <w:sz w:val="18"/>
+              </w:rPr>
+              <w:t>1-4; 5-19; 20-50; powyżej 50</w:t>
+            </w:r>
+          </w:p>
+        </w:tc>
+        <w:tc>
+          <w:tcPr>
+            <w:tcW w:type="dxa" w:w="3628"/>
+          </w:tcPr>
+          <w:p>
+            <w:r/>
+            <w:r>
+              <w:rPr>
+                <w:b w:val="0"/>
+                <w:sz w:val="18"/>
+              </w:rPr>
+              <w:t>liczba firm i łączna liczba naczep, osobno suma dla firm z flotą 5-50 (SOM)</w:t>
+            </w:r>
+          </w:p>
+        </w:tc>
+      </w:tr>
+      <w:tr>
+        <w:tc>
+          <w:tcPr>
+            <w:tcW w:type="dxa" w:w="1814"/>
+          </w:tcPr>
+          <w:p>
+            <w:r/>
+            <w:r>
+              <w:rPr>
+                <w:b w:val="0"/>
+                <w:sz w:val="18"/>
+              </w:rPr>
+              <w:t>Typ nadwozia</w:t>
+            </w:r>
+          </w:p>
+        </w:tc>
+        <w:tc>
+          <w:tcPr>
+            <w:tcW w:type="dxa" w:w="4309"/>
+          </w:tcPr>
+          <w:p>
+            <w:r/>
+            <w:r>
+              <w:rPr>
+                <w:b w:val="0"/>
+                <w:sz w:val="18"/>
+              </w:rPr>
+              <w:t>kurtyna; furgon; izoterma lub chłodnia; inne</w:t>
+            </w:r>
+          </w:p>
+        </w:tc>
+        <w:tc>
+          <w:tcPr>
+            <w:tcW w:type="dxa" w:w="3628"/>
+          </w:tcPr>
+          <w:p>
+            <w:r/>
+            <w:r>
+              <w:rPr>
+                <w:b w:val="0"/>
+                <w:sz w:val="18"/>
+              </w:rPr>
+              <w:t>liczba naczep nadających się do retrofit</w:t>
+            </w:r>
+          </w:p>
+        </w:tc>
+      </w:tr>
+      <w:tr>
+        <w:tc>
+          <w:tcPr>
+            <w:tcW w:type="dxa" w:w="1814"/>
+          </w:tcPr>
+          <w:p>
+            <w:r/>
+            <w:r>
+              <w:rPr>
+                <w:b w:val="0"/>
+                <w:sz w:val="18"/>
+              </w:rPr>
+              <w:t>Trasy i ładunki</w:t>
+            </w:r>
+          </w:p>
+        </w:tc>
+        <w:tc>
+          <w:tcPr>
+            <w:tcW w:type="dxa" w:w="4309"/>
+          </w:tcPr>
+          <w:p>
+            <w:r/>
+            <w:r>
+              <w:rPr>
+                <w:b w:val="0"/>
+                <w:sz w:val="18"/>
+              </w:rPr>
+              <w:t>udział przewozów PL-UE; ładunki wrażliwe (kruche, temperaturowe)</w:t>
+            </w:r>
+          </w:p>
+        </w:tc>
+        <w:tc>
+          <w:tcPr>
+            <w:tcW w:type="dxa" w:w="3628"/>
+          </w:tcPr>
+          <w:p>
+            <w:r/>
+            <w:r>
+              <w:rPr>
+                <w:b w:val="0"/>
+                <w:sz w:val="18"/>
+              </w:rPr>
+              <w:t>liczba firm z przewozami PL-UE i ładunkami wrażliwymi</w:t>
+            </w:r>
+          </w:p>
+        </w:tc>
+      </w:tr>
+      <w:tr>
+        <w:tc>
+          <w:tcPr>
+            <w:tcW w:type="dxa" w:w="1814"/>
+          </w:tcPr>
+          <w:p>
+            <w:r/>
+            <w:r>
+              <w:rPr>
+                <w:b w:val="0"/>
+                <w:sz w:val="18"/>
+              </w:rPr>
+              <w:t>Współpraca</w:t>
+            </w:r>
+          </w:p>
+        </w:tc>
+        <w:tc>
+          <w:tcPr>
+            <w:tcW w:type="dxa" w:w="4309"/>
+          </w:tcPr>
+          <w:p>
+            <w:r/>
+            <w:r>
+              <w:rPr>
+                <w:b w:val="0"/>
+                <w:sz w:val="18"/>
+              </w:rPr>
+              <w:t>lata współpracy, roczna liczba zleceń od Everest11</w:t>
+            </w:r>
+          </w:p>
+        </w:tc>
+        <w:tc>
+          <w:tcPr>
+            <w:tcW w:type="dxa" w:w="3628"/>
+          </w:tcPr>
+          <w:p>
+            <w:r/>
+            <w:r>
+              <w:rPr>
+                <w:b w:val="0"/>
+                <w:sz w:val="18"/>
+              </w:rPr>
+              <w:t>liczba klientów współpracujących od co najmniej 2 lat</w:t>
+            </w:r>
+          </w:p>
+        </w:tc>
+      </w:tr>
+    </w:tbl>
+    <w:p/>
+    <w:p>
+      <w:pPr>
+        <w:spacing w:after="60"/>
+      </w:pPr>
+      <w:r>
+        <w:rPr>
+          <w:b w:val="0"/>
+        </w:rPr>
+        <w:t>Karta rozmowy z klientem, wypełniona dla każdej z 15 rozmów, pozwoli podać wyniki w tekście 1.3: ilu rozmówców zainteresowało się systemem, ile naczep chciałoby wyposażyć, jakie wymagania wskazywali najczęściej i jaką cenę uznali za akceptowalną.</w:t>
+      </w:r>
+    </w:p>
+    <w:tbl>
+      <w:tblPr>
+        <w:tblStyle w:val="TableGrid"/>
+        <w:tblW w:type="auto" w:w="0"/>
+        <w:tblLook w:firstColumn="1" w:firstRow="1" w:lastColumn="0" w:lastRow="0" w:noHBand="0" w:noVBand="1" w:val="04A0"/>
+      </w:tblPr>
+      <w:tblGrid>
+        <w:gridCol w:w="4819"/>
+        <w:gridCol w:w="4819"/>
+      </w:tblGrid>
+      <w:tr>
+        <w:tc>
+          <w:tcPr>
+            <w:tcW w:type="dxa" w:w="5669"/>
+          </w:tcPr>
+          <w:p>
+            <w:r/>
+            <w:r>
+              <w:rPr>
+                <w:b/>
+                <w:sz w:val="18"/>
+              </w:rPr>
+              <w:t>Pytanie</w:t>
+            </w:r>
+          </w:p>
+        </w:tc>
+        <w:tc>
+          <w:tcPr>
+            <w:tcW w:type="dxa" w:w="4082"/>
+          </w:tcPr>
+          <w:p>
+            <w:r/>
+            <w:r>
+              <w:rPr>
+                <w:b/>
+                <w:sz w:val="18"/>
+              </w:rPr>
+              <w:t>Odpowiedź</w:t>
+            </w:r>
+          </w:p>
+        </w:tc>
+      </w:tr>
+      <w:tr>
+        <w:tc>
+          <w:tcPr>
+            <w:tcW w:type="dxa" w:w="5669"/>
+          </w:tcPr>
+          <w:p>
+            <w:r/>
+            <w:r>
+              <w:rPr>
+                <w:b w:val="0"/>
+                <w:sz w:val="18"/>
+              </w:rPr>
+              <w:t>Data rozmowy, firma, rola rozmówcy, liczba naczep i ich typy</w:t>
+            </w:r>
+          </w:p>
+        </w:tc>
+        <w:tc>
+          <w:tcPr>
+            <w:tcW w:type="dxa" w:w="4082"/>
+          </w:tcPr>
+          <w:p>
+            <w:r/>
+          </w:p>
+        </w:tc>
+      </w:tr>
+      <w:tr>
+        <w:tc>
+          <w:tcPr>
+            <w:tcW w:type="dxa" w:w="5669"/>
+          </w:tcPr>
+          <w:p>
+            <w:r/>
+            <w:r>
+              <w:rPr>
+                <w:b w:val="0"/>
+                <w:sz w:val="18"/>
+              </w:rPr>
+              <w:t>Czy firma miała w ostatnich 12 miesiącach roszczenia za uszkodzenie ładunku (liczba, wartość)?</w:t>
+            </w:r>
+          </w:p>
+        </w:tc>
+        <w:tc>
+          <w:tcPr>
+            <w:tcW w:type="dxa" w:w="4082"/>
+          </w:tcPr>
+          <w:p>
+            <w:r/>
+          </w:p>
+        </w:tc>
+      </w:tr>
+      <w:tr>
+        <w:tc>
+          <w:tcPr>
+            <w:tcW w:type="dxa" w:w="5669"/>
+          </w:tcPr>
+          <w:p>
+            <w:r/>
+            <w:r>
+              <w:rPr>
+                <w:b w:val="0"/>
+                <w:sz w:val="18"/>
+              </w:rPr>
+              <w:t>Jak dziś dokumentuje stan ładunku przy załadunku i rozładunku, ile to trwa?</w:t>
+            </w:r>
+          </w:p>
+        </w:tc>
+        <w:tc>
+          <w:tcPr>
+            <w:tcW w:type="dxa" w:w="4082"/>
+          </w:tcPr>
+          <w:p>
+            <w:r/>
+          </w:p>
+        </w:tc>
+      </w:tr>
+      <w:tr>
+        <w:tc>
+          <w:tcPr>
+            <w:tcW w:type="dxa" w:w="5669"/>
+          </w:tcPr>
+          <w:p>
+            <w:r/>
+            <w:r>
+              <w:rPr>
+                <w:b w:val="0"/>
+                <w:sz w:val="18"/>
+              </w:rPr>
+              <w:t>Które funkcje są najważniejsze (model 3D, alert, ocena zabezpieczeń, dokument eFTI)?</w:t>
+            </w:r>
+          </w:p>
+        </w:tc>
+        <w:tc>
+          <w:tcPr>
+            <w:tcW w:type="dxa" w:w="4082"/>
+          </w:tcPr>
+          <w:p>
+            <w:r/>
+          </w:p>
+        </w:tc>
+      </w:tr>
+      <w:tr>
+        <w:tc>
+          <w:tcPr>
+            <w:tcW w:type="dxa" w:w="5669"/>
+          </w:tcPr>
+          <w:p>
+            <w:r/>
+            <w:r>
+              <w:rPr>
+                <w:b w:val="0"/>
+                <w:sz w:val="18"/>
+              </w:rPr>
+              <w:t>Jaka forma płatności i jaka cena jest akceptowalna (abonament, zestaw, licencja API)?</w:t>
+            </w:r>
+          </w:p>
+        </w:tc>
+        <w:tc>
+          <w:tcPr>
+            <w:tcW w:type="dxa" w:w="4082"/>
+          </w:tcPr>
+          <w:p>
+            <w:r/>
+          </w:p>
+        </w:tc>
+      </w:tr>
+      <w:tr>
+        <w:tc>
+          <w:tcPr>
+            <w:tcW w:type="dxa" w:w="5669"/>
+          </w:tcPr>
+          <w:p>
+            <w:r/>
+            <w:r>
+              <w:rPr>
+                <w:b w:val="0"/>
+                <w:sz w:val="18"/>
+              </w:rPr>
+              <w:t>Ile naczep zechciałaby wyposażyć w 2030 r. i pod jakimi warunkami?</w:t>
+            </w:r>
+          </w:p>
+        </w:tc>
+        <w:tc>
+          <w:tcPr>
+            <w:tcW w:type="dxa" w:w="4082"/>
+          </w:tcPr>
+          <w:p>
+            <w:r/>
+          </w:p>
+        </w:tc>
+      </w:tr>
+    </w:tbl>
+    <w:p/>
     <w:sectPr>
       <w:pgSz w:w="11906" w:h="16838"/>
       <w:pgMar w:top="1134" w:right="1134" w:bottom="1134" w:left="1134" w:header="720" w:footer="720" w:gutter="0"/>

</xml_diff>

<commit_message>
Pkt 2.3/2.1/2.4 po decyzji o 50 pojazdach (20/20/10), poprawione zdanie o rozmowach, LOI jako podpisane, N50
Co-Authored-By: Claude Sonnet 5.5 <noreply@anthropic.com>
Claude-Session: https://claude.ai/code/session_01672WnJhixnEcarbb7uiwfx
</commit_message>
<xml_diff>
--- a/Sekcja_1.3_i_ceny.docx
+++ b/Sekcja_1.3_i_ceny.docx
@@ -581,7 +581,7 @@
           <w:color w:val="666666"/>
           <w:sz w:val="17"/>
         </w:rPr>
-        <w:t xml:space="preserve"> [8743 znaków]</w:t>
+        <w:t xml:space="preserve"> [8804 znaków]</w:t>
       </w:r>
     </w:p>
     <w:p>
@@ -653,20 +653,7 @@
         <w:rPr>
           <w:b w:val="0"/>
         </w:rPr>
-        <w:t xml:space="preserve">Wymagania przewoźników MŚP, które przyjęliśmy do projektu, wynikają z 15 rozmów z klientami Everest11 </w:t>
-      </w:r>
-      <w:r>
-        <w:rPr>
-          <w:b w:val="0"/>
-          <w:highlight w:val="yellow"/>
-        </w:rPr>
-        <w:t>okres rozmów</w:t>
-      </w:r>
-      <w:r>
-        <w:rPr>
-          <w:b w:val="0"/>
-        </w:rPr>
-        <w:t>: montaż w istniejącej naczepie bez zmian homologacji, działanie bez zasięgu GSM, alert dla kierowcy bez udziału dyspozytora, integracja z TMS i koszt rozłożony w abonamencie.</w:t>
+        <w:t>Wymagania przewoźników MŚP, które przyjęliśmy do projektu, wynikają z rozmów z 15 potencjalnymi klientami Everest11 (okres rozmów marzec-maj 2026): montaż w istniejącej naczepie bez zmian homologacji, działanie bez zasięgu GSM, alert dla kierowcy bez udziału dyspozytora, integracja z TMS i koszt rozłożony w abonamencie.</w:t>
       </w:r>
     </w:p>
     <w:p>
@@ -881,33 +868,7 @@
         <w:rPr>
           <w:b w:val="0"/>
         </w:rPr>
-        <w:t xml:space="preserve">. Pierwszy próg, 50 pojazdów u klientów zewnętrznych w 2030 r., pokrywają listy intencyjne trzech operatorów: Krajowe i Międzynarodowe Usługi Transportowe Hubert Lizak SZYK, Natanek Logistics i Transport Towarowy Paweł Łazarczyk, łącznie </w:t>
-      </w:r>
-      <w:r>
-        <w:rPr>
-          <w:b w:val="0"/>
-          <w:highlight w:val="yellow"/>
-        </w:rPr>
-        <w:t>50 naczep, podział na operatorów</w:t>
-      </w:r>
-      <w:r>
-        <w:rPr>
-          <w:b w:val="0"/>
-        </w:rPr>
-        <w:t xml:space="preserve">. Listy określają liczbę naczep, harmonogram, warunki cenowe, kryteria zakupu i dane operatora o szkodach </w:t>
-      </w:r>
-      <w:r>
-        <w:rPr>
-          <w:b w:val="0"/>
-          <w:highlight w:val="yellow"/>
-        </w:rPr>
-        <w:t>potwierdzić po ponownym podpisaniu</w:t>
-      </w:r>
-      <w:r>
-        <w:rPr>
-          <w:b w:val="0"/>
-        </w:rPr>
-        <w:t>. Promocja: demonstracje u klientów bazy, partnerstwo z ubezpieczycielem, udział w targach Trans Logistics Poland w Warszawie (listopad, od 2031 r.) oraz w TRANSLOG Connect Congress w Budapeszcie (edycja 2028, zadanie Z10). Segment 2 (od 2031): spedytorzy, ok. 12 000 firm (GUS, Działalność przedsiębiorstw transportowych 2023). Segment 3 (od 2032): floty 50-200 pojazdów przez kanał ubezpieczeniowy oraz klienci w CEE przez partnerstwa z dostawcami TMS i licencje API.</w:t>
+        <w:t>. Pierwszy próg, 50 pojazdów u klientów zewnętrznych w 2030 r., pokrywają listy intencyjne trzech operatorów: Krajowe i Międzynarodowe Usługi Transportowe Hubert Lizak SZYK, Natanek Logistics i Transport Towarowy Paweł Łazarczyk, łącznie 50 naczep (20, 20 i 10). Listy zawierają profil floty operatora, liczbę naczep i harmonogram, warunki cenowe, kryteria zakupu, dane o szkodach z ostatnich 12 miesięcy oraz termin ważności do 31.12.2030. Promocja: demonstracje u klientów bazy, partnerstwo z ubezpieczycielem, udział w targach Trans Logistics Poland w Warszawie (listopad, od 2031 r.) oraz w TRANSLOG Connect Congress w Budapeszcie (edycja 2028, zadanie Z10). Segment 2 (od 2031): spedytorzy, ok. 12 000 firm (GUS, Działalność przedsiębiorstw transportowych 2023). Segment 3 (od 2032): floty 50-200 pojazdów przez kanał ubezpieczeniowy oraz klienci w CEE przez partnerstwa z dostawcami TMS i licencje API.</w:t>
       </w:r>
     </w:p>
     <w:p>
@@ -1067,7 +1028,7 @@
                 <w:b w:val="0"/>
                 <w:sz w:val="18"/>
               </w:rPr>
-              <w:t>Wymagania odbiorców oparte na 15 rozmowach z klientami: uzupełnić okres rozmów i wyniki z karty rozmowy (Aneks C). Usunięto zdania bez źródła ("przeciętny duży załadowca traci ponad 5 mln USD", "43% ciężarówek jeździ częściowo pustych") oraz twierdzenia "pierwsze rozwiązanie w Polsce i CEE".</w:t>
+              <w:t>Wymagania odbiorców oparte na 15 rozmowach z potencjalnymi klientami (marzec-maj 2026). Wyniki z karty rozmowy (Aneks C) są opcjonalnym uzupełnieniem tekstu. Usunięto zdania bez źródła ("przeciętny duży załadowca traci ponad 5 mln USD", "43% ciężarówek jeździ częściowo pustych") oraz twierdzenia "pierwsze rozwiązanie w Polsce i CEE".</w:t>
             </w:r>
           </w:p>
         </w:tc>
@@ -1163,7 +1124,7 @@
                 <w:b w:val="0"/>
                 <w:sz w:val="18"/>
               </w:rPr>
-              <w:t>Decyzja: wdrożenie na 50 pojazdach u trzech operatorów, bez pojazdów własnych Everest11 (D35). Wymaga ponownego podpisania listów intencyjnych na łącznie 50 naczep (elementy w Aneksie B) oraz opisu struktury bazy 50+ (Aneks C).</w:t>
+              <w:t>Decyzja: wdrożenie na 50 pojazdach u trzech operatorów, bez pojazdów własnych Everest11 (D35). Listy intencyjne ponownie podpisane na łącznie 50 naczep (20, 20 i 10) z elementami z Aneksu B. Pozostaje opis struktury bazy 50+ (Aneks C).</w:t>
             </w:r>
           </w:p>
         </w:tc>
@@ -1312,6 +1273,668 @@
         <w:t xml:space="preserve"> liczby 600 000 naczep w Polsce i w CEE są niespójne z TAM 544,97 tys. Przy rozmowach z oceniającymi używać jednej podstawy.</w:t>
       </w:r>
     </w:p>
+    <w:p>
+      <w:pPr>
+        <w:pStyle w:val="Heading1"/>
+      </w:pPr>
+      <w:r>
+        <w:t>5. Poprawki w pkt 2.1, 2.3 i 2.4 po decyzji o 50 pojazdach (warunek 2)</w:t>
+      </w:r>
+    </w:p>
+    <w:p>
+      <w:pPr>
+        <w:spacing w:after="60"/>
+      </w:pPr>
+      <w:r>
+        <w:rPr>
+          <w:b w:val="0"/>
+        </w:rPr>
+        <w:t>Poniżej nowe teksty dwóch pól z pkt 2.3 (limit 6 000 znaków każde) i tabela pozostałych zmian. Teksty są spójne z pkt 1.3: ta sama podstawa rynku, 50 pojazdów u trzech operatorów (20, 20 i 10), sprzedaż od stycznia 2030 r. i ceny z obliczeniem CMR.</w:t>
+      </w:r>
+    </w:p>
+    <w:p>
+      <w:pPr>
+        <w:pStyle w:val="Heading2"/>
+      </w:pPr>
+      <w:r>
+        <w:t>5.1 Rynek docelowy dla innowacji produktowej (2.3)</w:t>
+      </w:r>
+    </w:p>
+    <w:p>
+      <w:pPr>
+        <w:keepNext/>
+        <w:spacing w:before="160" w:after="40"/>
+      </w:pPr>
+      <w:r>
+        <w:rPr>
+          <w:b/>
+          <w:sz w:val="20"/>
+        </w:rPr>
+        <w:t>Rynek docelowy dla innowacji produktowej</w:t>
+      </w:r>
+      <w:r>
+        <w:rPr>
+          <w:color w:val="666666"/>
+          <w:sz w:val="17"/>
+        </w:rPr>
+        <w:t xml:space="preserve"> [4193 znaków]</w:t>
+      </w:r>
+    </w:p>
+    <w:p>
+      <w:pPr>
+        <w:spacing w:after="60"/>
+      </w:pPr>
+      <w:r>
+        <w:rPr>
+          <w:b w:val="0"/>
+        </w:rPr>
+        <w:t>Grupa docelowa to polscy przewoźnicy MŚP z flotą od 5 do 50 naczep (kurtyna, furgon, izoterma), realizujący przewozy ogólnotowarowe PL-UE, bez telematyki fabrycznej i bez własnego działu IT.</w:t>
+      </w:r>
+    </w:p>
+    <w:p>
+      <w:pPr>
+        <w:spacing w:after="60"/>
+      </w:pPr>
+      <w:r>
+        <w:rPr>
+          <w:b w:val="0"/>
+        </w:rPr>
+        <w:t>Liczebność. W Polsce zarejestrowano 544,97 tys. naczep (Eurostat, road_eqs_semit, 2023), a 43 280 przedsiębiorców ma licencję wspólnotową (GITD, koniec lipca 2026 r.). Ponad 76 000 firm TSL ma floty od 1 do 50 pojazdów (TLP/SpotData, Transport drogowy w Polsce 2024/2025, 2025). Rynek dostępny (SAM) to ok. 200 000 naczep z nadwoziami nadającymi się do retrofit i bez telematyki producenta. Szacunek wynika z udziału platform, nadwozi skrzyniowych i furgonów w rejestracjach (ok. 72%, PZPM, CEP info, 2025) oraz udziału naczep bez telematyki (ok. 86%, Frost &amp; Sullivan, 2019) i daje ok. 337 000, a przyjęto ostrożnie 200 000. Do 2034 r. planujemy 1 000 pojazdów, czyli 0,50% SAM i 0,18% liczby naczep w Polsce.</w:t>
+      </w:r>
+    </w:p>
+    <w:p>
+      <w:pPr>
+        <w:spacing w:after="60"/>
+      </w:pPr>
+      <w:r>
+        <w:rPr>
+          <w:b w:val="0"/>
+        </w:rPr>
+        <w:t>Potrzeby i oczekiwania. Wymagania przewoźników MŚP, które przyjęliśmy do projektu, wynikają z rozmów z 15 potencjalnymi klientami Everest11 (okres rozmów marzec-maj 2026): montaż w istniejącej naczepie bez zmian homologacji, działanie bez zasięgu GSM, alert dla kierowcy bez udziału dyspozytora, integracja z TMS i koszt rozłożony w abonamencie. Zakup finansowany jest z kosztów bieżących: subskrypcja 349 PLN za pojazd miesięcznie, zestaw retrofit średnio 7 500 PLN za naczepę i licencja API 4 800 PLN rocznie na klienta. Decyzja zakupowa leży po stronie właściciela lub dyrektora i trwa zwykle od 2 do 4 tygodni (doświadczenie operacyjne Everest11). Główna bariera to brak świadomości, że takie rozwiązanie istnieje, a odpowiada na nią bezpośredni kanał sprzedaży przez bazę ponad 50 klientów Everest11.</w:t>
+      </w:r>
+    </w:p>
+    <w:p>
+      <w:pPr>
+        <w:spacing w:after="60"/>
+      </w:pPr>
+      <w:r>
+        <w:rPr>
+          <w:b w:val="0"/>
+        </w:rPr>
+        <w:t>Zainteresowanie. Trzej operatorzy z bazy klientów, Krajowe i Międzynarodowe Usługi Transportowe Hubert Lizak SZYK, Natanek Logistics i Transport Towarowy Paweł Łazarczyk, podpisali listy intencyjne na łącznie 50 naczep (20, 20 i 10), co stanowi pierwszy próg sprzedaży w 2030 r. Listy zawierają profil floty operatora, liczbę naczep i harmonogram, warunki cenowe, kryteria zakupu, dane o szkodach z ostatnich 12 miesięcy oraz termin ważności do 31.12.2030.</w:t>
+      </w:r>
+    </w:p>
+    <w:p>
+      <w:pPr>
+        <w:spacing w:after="60"/>
+      </w:pPr>
+      <w:r>
+        <w:rPr>
+          <w:b w:val="0"/>
+        </w:rPr>
+        <w:t>Segment 2, od 2031 r.: polscy spedytorzy, ok. 12 000 firm (GUS, Działalność przedsiębiorstw transportowych 2023, 2024), którzy odpowiadają za stan ładunku wobec klienta i mogą wymagać monitoringu od przewoźników. Segment 3, od 2032 r.: floty od 50 do 200 pojazdów oraz klienci w regionie CEE, pozyskiwani przez partnerstwa z dostawcami TMS i licencje API. Wielkość rynku CEE oszacujemy w analizie rynków w zadaniu Z10, a w prognozie przychodów traktujemy ten segment jako uzupełnienie.</w:t>
+      </w:r>
+    </w:p>
+    <w:p>
+      <w:pPr>
+        <w:spacing w:after="60"/>
+      </w:pPr>
+      <w:r>
+        <w:rPr>
+          <w:b w:val="0"/>
+        </w:rPr>
+        <w:t>Trendy. Od 21.08.2025 organy państw UE muszą przyjmować informacje w formacie eFTI (rozporządzenie UE 2020/1056), a stosowanie eFTI jest dla przewoźników dobrowolne i daje dokument uznawany w całej UE. Straty cargo w UE wyniosły 549 mln EUR w 2023 r., o 438% więcej niż rok wcześniej (TAPA EMEA TIS, 2025), co skłania ubezpieczycieli do różnicowania składek według monitoringu. Rejestracje nowych naczep spadły z 25 336 w 2023 r. do 17 268 w 2024 r. (IBRM Samar, dane PZPM, 2025), więc naczep z telematyką fabryczną przybywa wolniej.</w:t>
+      </w:r>
+    </w:p>
+    <w:p>
+      <w:pPr>
+        <w:spacing w:after="60"/>
+      </w:pPr>
+      <w:r>
+        <w:rPr>
+          <w:b w:val="0"/>
+        </w:rPr>
+        <w:t>Nasycenie rynku i konkurencja. Telematyka naczep (Schmitz Cargobull TrailerConnect, Krone Telematics, Nexxiot, Arviem, Tive, SkyBitz) obejmuje lokalizację, warunki i alerty progowe, a w części przypadków obraz lub zajętość przestrzeni ładunkowej. Według dostępnej dokumentacji żaden produkt nie łączy modelu 3D z położeniem ładunku w ruchu, predykcji ryzyka z klasą ładunku, wizyjnej oceny zabezpieczeń i dokumentu eFTI. Rozwiązania fabryczne są kierowane do nowych naczep. Ceny konkurencji nie są publiczne, a orientacyjny abonament oprogramowania SkyBitz to od 30 do 75 USD za zasób miesięcznie (Capterra, 2026). Subskrypcja CargoDT jest wyższa, bo obejmuje model 3D, ocenę zabezpieczeń, predykcję ryzyka i dokument eFTI. Prawdopodobieństwo nowego konkurenta w ciągu 3-5 lat oceniamy jako umiarkowane. Bariery to jednoczesne rozwiązanie trzech problemów badawczych (Z4, Z5, Z8), model sprzedaży fabrycznej sprzeczny z retrofit oraz zgłoszenie patentowe EPO w Z11. Produkt ma wyłącznie zastosowanie cywilne.</w:t>
+      </w:r>
+    </w:p>
+    <w:p>
+      <w:pPr>
+        <w:pStyle w:val="Heading2"/>
+      </w:pPr>
+      <w:r>
+        <w:t>5.2 Plan wprowadzenia rezultatu projektu na rynek (2.3)</w:t>
+      </w:r>
+    </w:p>
+    <w:p>
+      <w:pPr>
+        <w:keepNext/>
+        <w:spacing w:before="160" w:after="40"/>
+      </w:pPr>
+      <w:r>
+        <w:rPr>
+          <w:b/>
+          <w:sz w:val="20"/>
+        </w:rPr>
+        <w:t>Plan wprowadzenia rezultatu projektu na rynek, innowacja produktowa</w:t>
+      </w:r>
+      <w:r>
+        <w:rPr>
+          <w:color w:val="666666"/>
+          <w:sz w:val="17"/>
+        </w:rPr>
+        <w:t xml:space="preserve"> [2614 znaków]</w:t>
+      </w:r>
+    </w:p>
+    <w:p>
+      <w:pPr>
+        <w:spacing w:after="60"/>
+      </w:pPr>
+      <w:r>
+        <w:rPr>
+          <w:b w:val="0"/>
+        </w:rPr>
+        <w:t>Wdrożenie nastąpi we własnej działalności gospodarczej Everest11 na terytorium RP: Everest11 wprowadzi na rynek nową usługę CargoDT (zestaw retrofit, subskrypcja SaaS, licencja API) i włączy ją do własnego systemu TMS. Sprzedaż rozpoczyna się w styczniu 2030 r., w terminie 5 lat od zakończenia projektu (04/2029).</w:t>
+      </w:r>
+    </w:p>
+    <w:p>
+      <w:pPr>
+        <w:spacing w:after="60"/>
+      </w:pPr>
+      <w:r>
+        <w:rPr>
+          <w:b w:val="0"/>
+        </w:rPr>
+        <w:t>Etap 0 (05-10/2029). Kontynuacja procedur IP: zgłoszenie EPO zostało złożone w Z11, a w tym etapie prowadzona jest dalsza obsługa postępowania oraz, ze środków własnych Lidera, wniosek o wzór użytkowy dla konfiguracji sprzętowej. Certyfikacja CE zestawu retrofit zgodnie z dyrektywami RED 2014/53/UE (radar mmWave 77 GHz) i EMC 2014/30/UE oraz homologacja ECE R10 w akredytowanym laboratorium. Produkcja pierwszej serii zestawów po certyfikacji (2-3 miesiące). Równolegle uruchomienie platformy SaaS w środowisku produkcyjnym (4-5 miesięcy), materiały handlowe i cennik oraz warunkowe umowy B2B z trzema operatorami, którzy podpisali listy intencyjne.</w:t>
+      </w:r>
+    </w:p>
+    <w:p>
+      <w:pPr>
+        <w:spacing w:after="60"/>
+      </w:pPr>
+      <w:r>
+        <w:rPr>
+          <w:b w:val="0"/>
+        </w:rPr>
+        <w:t>Etap 1 (11/2029-12/2030). Od 11/2029 pilotaż instalacji u operatorów i integracja z TMS Everest11, a od stycznia 2030 r. sprzedaż. Cel: 50 aktywnych pojazdów u klientów na koniec 2030 r., w tym 20, 20 i 10 u trzech operatorów z listami intencyjnymi. Dystrybucja: sprzedaż bezpośrednia przez Michała Hajduka (7 lat sprzedaży technologii telematycznych dla flot w Legaltelematics i INELO) do bazy ponad 50 kontrahentów Everest11. Miejsce sprzedaży: kontakt bezpośredni (siedziby klientów i biuro Everest11 w Warszawie) oraz zamówienia przez panel klienta platformy SaaS. Montaż i uruchomienie zestawów u klientów wykonuje Stanisław Kozioł (IoT Specialist), a wsparcie techniczne działa całodobowo. W 2030 r. zestawy pracują średnio przez 6 miesięcy, stąd 300 pojazdo-miesięcy abonamentu. Przychody 2030: 489 300 PLN (SaaS 104,7 tys., zestawy 375,0 tys., API 9,6 tys.).</w:t>
+      </w:r>
+    </w:p>
+    <w:p>
+      <w:pPr>
+        <w:spacing w:after="60"/>
+      </w:pPr>
+      <w:r>
+        <w:rPr>
+          <w:b w:val="0"/>
+        </w:rPr>
+        <w:t>Etap 2 (2031). Cel: 125 pojazdów, 6 klientów. Kanały: program zniżkowy z ubezpieczycielem cargo, udział w targach Trans Logistics Poland w Warszawie (listopad), sprzedaż B2B do polskich przewoźników i pierwsze umowy partnerskie z lokalnymi dostawcami TMS w regionie CEE. Przychody: 981 468 PLN.</w:t>
+      </w:r>
+    </w:p>
+    <w:p>
+      <w:pPr>
+        <w:spacing w:after="60"/>
+      </w:pPr>
+      <w:r>
+        <w:rPr>
+          <w:b w:val="0"/>
+        </w:rPr>
+        <w:t>Etap 3 (2032). Cel: 250 pojazdów, 12 klientów. Rozbudowa partnerstw CEE i program poleceń oparty na klientach pilotażowych. Przychody: 1 836 504 PLN.</w:t>
+      </w:r>
+    </w:p>
+    <w:p>
+      <w:pPr>
+        <w:spacing w:after="60"/>
+      </w:pPr>
+      <w:r>
+        <w:rPr>
+          <w:b w:val="0"/>
+        </w:rPr>
+        <w:t>Etap 4 (2033-2034). Cel: 500 pojazdów w 2033 r. i 1 000 w 2034 r. Pogłębianie rynku polskiego dzięki referencjom klientów i partnerstwom z dostawcami TMS w regionie CEE, a ochronę przewagi zapewnia patent EPO. Przychody: 3 673 620 PLN w 2033 r. i 7 347 240 PLN w 2034 r., razem 14 328 132 PLN. Penetracja SAM w Polsce w 2034 r.: 0,50%.</w:t>
+      </w:r>
+    </w:p>
+    <w:p>
+      <w:pPr>
+        <w:pStyle w:val="Heading2"/>
+      </w:pPr>
+      <w:r>
+        <w:t>5.3 Pozostałe zmiany</w:t>
+      </w:r>
+    </w:p>
+    <w:tbl>
+      <w:tblPr>
+        <w:tblStyle w:val="TableGrid"/>
+        <w:tblW w:type="auto" w:w="0"/>
+        <w:tblLook w:firstColumn="1" w:firstRow="1" w:lastColumn="0" w:lastRow="0" w:noHBand="0" w:noVBand="1" w:val="04A0"/>
+      </w:tblPr>
+      <w:tblGrid>
+        <w:gridCol w:w="3213"/>
+        <w:gridCol w:w="3213"/>
+        <w:gridCol w:w="3213"/>
+      </w:tblGrid>
+      <w:tr>
+        <w:tc>
+          <w:tcPr>
+            <w:tcW w:type="dxa" w:w="2041"/>
+          </w:tcPr>
+          <w:p>
+            <w:r/>
+            <w:r>
+              <w:rPr>
+                <w:b/>
+                <w:sz w:val="18"/>
+              </w:rPr>
+              <w:t>Miejsce</w:t>
+            </w:r>
+          </w:p>
+        </w:tc>
+        <w:tc>
+          <w:tcPr>
+            <w:tcW w:type="dxa" w:w="3288"/>
+          </w:tcPr>
+          <w:p>
+            <w:r/>
+            <w:r>
+              <w:rPr>
+                <w:b/>
+                <w:sz w:val="18"/>
+              </w:rPr>
+              <w:t>Obecny zapis</w:t>
+            </w:r>
+          </w:p>
+        </w:tc>
+        <w:tc>
+          <w:tcPr>
+            <w:tcW w:type="dxa" w:w="4422"/>
+          </w:tcPr>
+          <w:p>
+            <w:r/>
+            <w:r>
+              <w:rPr>
+                <w:b/>
+                <w:sz w:val="18"/>
+              </w:rPr>
+              <w:t>Zmiana</w:t>
+            </w:r>
+          </w:p>
+        </w:tc>
+      </w:tr>
+      <w:tr>
+        <w:tc>
+          <w:tcPr>
+            <w:tcW w:type="dxa" w:w="2041"/>
+          </w:tcPr>
+          <w:p>
+            <w:r/>
+            <w:r>
+              <w:rPr>
+                <w:b w:val="0"/>
+                <w:sz w:val="18"/>
+              </w:rPr>
+              <w:t>Pkt 2.1, Przewidywana data wdrożenia</w:t>
+            </w:r>
+          </w:p>
+        </w:tc>
+        <w:tc>
+          <w:tcPr>
+            <w:tcW w:type="dxa" w:w="3288"/>
+          </w:tcPr>
+          <w:p>
+            <w:r/>
+            <w:r>
+              <w:rPr>
+                <w:b w:val="0"/>
+                <w:sz w:val="18"/>
+              </w:rPr>
+              <w:t>11.2029</w:t>
+            </w:r>
+          </w:p>
+        </w:tc>
+        <w:tc>
+          <w:tcPr>
+            <w:tcW w:type="dxa" w:w="4422"/>
+          </w:tcPr>
+          <w:p>
+            <w:r/>
+            <w:r>
+              <w:rPr>
+                <w:b w:val="0"/>
+                <w:sz w:val="18"/>
+              </w:rPr>
+              <w:t>01.2030 (start sprzedaży, D09). Pilotaż u klientów w 11-12/2029 opisać jako przygotowanie do wdrożenia. Sprawdzić tę samą datę w modelu finansowym.</w:t>
+            </w:r>
+          </w:p>
+        </w:tc>
+      </w:tr>
+      <w:tr>
+        <w:tc>
+          <w:tcPr>
+            <w:tcW w:type="dxa" w:w="2041"/>
+          </w:tcPr>
+          <w:p>
+            <w:r/>
+            <w:r>
+              <w:rPr>
+                <w:b w:val="0"/>
+                <w:sz w:val="18"/>
+              </w:rPr>
+              <w:t>Pkt 2.1, Uzasadnienie, Ścieżka 1</w:t>
+            </w:r>
+          </w:p>
+        </w:tc>
+        <w:tc>
+          <w:tcPr>
+            <w:tcW w:type="dxa" w:w="3288"/>
+          </w:tcPr>
+          <w:p>
+            <w:r/>
+            <w:r>
+              <w:rPr>
+                <w:b w:val="0"/>
+                <w:sz w:val="18"/>
+              </w:rPr>
+              <w:t>„pilotażowe wdrożenie własne: 11.2029r., wdrożenie komercyjne 1.2030”</w:t>
+            </w:r>
+          </w:p>
+        </w:tc>
+        <w:tc>
+          <w:tcPr>
+            <w:tcW w:type="dxa" w:w="4422"/>
+          </w:tcPr>
+          <w:p>
+            <w:r/>
+            <w:r>
+              <w:rPr>
+                <w:b w:val="0"/>
+                <w:sz w:val="18"/>
+              </w:rPr>
+              <w:t>„pilotaż u pierwszych klientów: 11.2029 r., sprzedaż od 1.2030 r.”. Ścieżka 1 dotyczy integracji CargoDT z TMS Everest11 i usługi dla klientów, a nie pojazdów własnych.</w:t>
+            </w:r>
+          </w:p>
+        </w:tc>
+      </w:tr>
+      <w:tr>
+        <w:tc>
+          <w:tcPr>
+            <w:tcW w:type="dxa" w:w="2041"/>
+          </w:tcPr>
+          <w:p>
+            <w:r/>
+            <w:r>
+              <w:rPr>
+                <w:b w:val="0"/>
+                <w:sz w:val="18"/>
+              </w:rPr>
+              <w:t>Pkt 2.3, Rynek docelowy</w:t>
+            </w:r>
+          </w:p>
+        </w:tc>
+        <w:tc>
+          <w:tcPr>
+            <w:tcW w:type="dxa" w:w="3288"/>
+          </w:tcPr>
+          <w:p>
+            <w:r/>
+            <w:r>
+              <w:rPr>
+                <w:b w:val="0"/>
+                <w:sz w:val="18"/>
+              </w:rPr>
+              <w:t>Trzy segmenty „o łącznym potencjale ok. 600 000 naczep w regionie CEE”; Segment 3 „ok. 400 000-600 000 naczep TSL”; „(0,025% dostępnego rynku (SAM ok. 200 000 naczep MŚP w Polsce i regionie CEE)”</w:t>
+            </w:r>
+          </w:p>
+        </w:tc>
+        <w:tc>
+          <w:tcPr>
+            <w:tcW w:type="dxa" w:w="4422"/>
+          </w:tcPr>
+          <w:p>
+            <w:r/>
+            <w:r>
+              <w:rPr>
+                <w:b w:val="0"/>
+                <w:sz w:val="18"/>
+              </w:rPr>
+              <w:t>Nowy tekst poniżej (część 5.1). Wielkość CEE usunięta, SAM tylko dla Polski.</w:t>
+            </w:r>
+          </w:p>
+        </w:tc>
+      </w:tr>
+      <w:tr>
+        <w:tc>
+          <w:tcPr>
+            <w:tcW w:type="dxa" w:w="2041"/>
+          </w:tcPr>
+          <w:p>
+            <w:r/>
+            <w:r>
+              <w:rPr>
+                <w:b w:val="0"/>
+                <w:sz w:val="18"/>
+              </w:rPr>
+              <w:t>Pkt 2.3, Plan wprowadzenia</w:t>
+            </w:r>
+          </w:p>
+        </w:tc>
+        <w:tc>
+          <w:tcPr>
+            <w:tcW w:type="dxa" w:w="3288"/>
+          </w:tcPr>
+          <w:p>
+            <w:r/>
+            <w:r>
+              <w:rPr>
+                <w:b w:val="0"/>
+                <w:sz w:val="18"/>
+              </w:rPr>
+              <w:t>Etap 1 z wdrożeniem we własnej działalności na pojazdach własnych i „bariera adopcji niższa niż koszt typowego roszczenia (3 000-15 000 PLN)”</w:t>
+            </w:r>
+          </w:p>
+        </w:tc>
+        <w:tc>
+          <w:tcPr>
+            <w:tcW w:type="dxa" w:w="4422"/>
+          </w:tcPr>
+          <w:p>
+            <w:r/>
+            <w:r>
+              <w:rPr>
+                <w:b w:val="0"/>
+                <w:sz w:val="18"/>
+              </w:rPr>
+              <w:t>Nowy tekst poniżej (część 5.2).</w:t>
+            </w:r>
+          </w:p>
+        </w:tc>
+      </w:tr>
+      <w:tr>
+        <w:tc>
+          <w:tcPr>
+            <w:tcW w:type="dxa" w:w="2041"/>
+          </w:tcPr>
+          <w:p>
+            <w:r/>
+            <w:r>
+              <w:rPr>
+                <w:b w:val="0"/>
+                <w:sz w:val="18"/>
+              </w:rPr>
+              <w:t>Pkt 2.4 Opłacalność</w:t>
+            </w:r>
+          </w:p>
+        </w:tc>
+        <w:tc>
+          <w:tcPr>
+            <w:tcW w:type="dxa" w:w="3288"/>
+          </w:tcPr>
+          <w:p>
+            <w:r/>
+            <w:r>
+              <w:rPr>
+                <w:b w:val="0"/>
+                <w:sz w:val="18"/>
+              </w:rPr>
+              <w:t>„SAM ok. 200 000 naczep MŚP w Polsce i regionie CEE”</w:t>
+            </w:r>
+          </w:p>
+        </w:tc>
+        <w:tc>
+          <w:tcPr>
+            <w:tcW w:type="dxa" w:w="4422"/>
+          </w:tcPr>
+          <w:p>
+            <w:r/>
+            <w:r>
+              <w:rPr>
+                <w:b w:val="0"/>
+                <w:sz w:val="18"/>
+              </w:rPr>
+              <w:t>„SAM ok. 200 000 naczep w Polsce”. Zdanie o listach intencyjnych: „podpisanymi listami intencyjnymi z trzema operatorami na łącznie 50 naczep (20, 20 i 10): Krajowe i Międzynarodowe Usługi Transportowe Hubert Lizak SZYK, Natanek Logistics, Transport Towarowy Paweł Łazarczyk”.</w:t>
+            </w:r>
+          </w:p>
+        </w:tc>
+      </w:tr>
+      <w:tr>
+        <w:tc>
+          <w:tcPr>
+            <w:tcW w:type="dxa" w:w="2041"/>
+          </w:tcPr>
+          <w:p>
+            <w:r/>
+            <w:r>
+              <w:rPr>
+                <w:b w:val="0"/>
+                <w:sz w:val="18"/>
+              </w:rPr>
+              <w:t>Pkt 2.4 i 2.3: reklamacja</w:t>
+            </w:r>
+          </w:p>
+        </w:tc>
+        <w:tc>
+          <w:tcPr>
+            <w:tcW w:type="dxa" w:w="3288"/>
+          </w:tcPr>
+          <w:p>
+            <w:r/>
+            <w:r>
+              <w:rPr>
+                <w:b w:val="0"/>
+                <w:sz w:val="18"/>
+              </w:rPr>
+              <w:t>„Śr. 3 000-15 000 PLN per incydent; system zwraca się przy uniknięciu jednej reklamacji rocznie”</w:t>
+            </w:r>
+          </w:p>
+        </w:tc>
+        <w:tc>
+          <w:tcPr>
+            <w:tcW w:type="dxa" w:w="4422"/>
+          </w:tcPr>
+          <w:p>
+            <w:r/>
+            <w:r>
+              <w:rPr>
+                <w:b w:val="0"/>
+                <w:sz w:val="18"/>
+              </w:rPr>
+              <w:t>Zastąpić obliczeniem z art. 23 CMR: 8,33 SDR/kg x 200-500 kg, po kursie NBP 5,0954 z 04.09.2026 od 8 489 do 21 222 PLN. Koszt klienta dla floty 10 naczep: 12 168 PLN w pierwszym roku i 4 668 PLN w kolejnych.</w:t>
+            </w:r>
+          </w:p>
+        </w:tc>
+      </w:tr>
+      <w:tr>
+        <w:tc>
+          <w:tcPr>
+            <w:tcW w:type="dxa" w:w="2041"/>
+          </w:tcPr>
+          <w:p>
+            <w:r/>
+            <w:r>
+              <w:rPr>
+                <w:b w:val="0"/>
+                <w:sz w:val="18"/>
+              </w:rPr>
+              <w:t>Pkt 1.3 (poprzednia wersja) oraz Z10 pkt 3.2.2</w:t>
+            </w:r>
+          </w:p>
+        </w:tc>
+        <w:tc>
+          <w:tcPr>
+            <w:tcW w:type="dxa" w:w="3288"/>
+          </w:tcPr>
+          <w:p>
+            <w:r/>
+            <w:r>
+              <w:rPr>
+                <w:b w:val="0"/>
+                <w:sz w:val="18"/>
+              </w:rPr>
+              <w:t>„ok. 400 000-600 000 naczep” w regionie CEE</w:t>
+            </w:r>
+          </w:p>
+        </w:tc>
+        <w:tc>
+          <w:tcPr>
+            <w:tcW w:type="dxa" w:w="4422"/>
+          </w:tcPr>
+          <w:p>
+            <w:r/>
+            <w:r>
+              <w:rPr>
+                <w:b w:val="0"/>
+                <w:sz w:val="18"/>
+              </w:rPr>
+              <w:t>Usunąć. Źródła w obecnym wniosku nie ma (zob. pkt 2 odpowiedzi). Wielkość CEE ma oszacować analiza rynków w Z10.</w:t>
+            </w:r>
+          </w:p>
+        </w:tc>
+      </w:tr>
+      <w:tr>
+        <w:tc>
+          <w:tcPr>
+            <w:tcW w:type="dxa" w:w="2041"/>
+          </w:tcPr>
+          <w:p>
+            <w:r/>
+            <w:r>
+              <w:rPr>
+                <w:b w:val="0"/>
+                <w:sz w:val="18"/>
+              </w:rPr>
+              <w:t>Model finansowy, arkusz Przychody, komentarz</w:t>
+            </w:r>
+          </w:p>
+        </w:tc>
+        <w:tc>
+          <w:tcPr>
+            <w:tcW w:type="dxa" w:w="3288"/>
+          </w:tcPr>
+          <w:p>
+            <w:r/>
+            <w:r>
+              <w:rPr>
+                <w:b w:val="0"/>
+                <w:sz w:val="18"/>
+              </w:rPr>
+              <w:t>„wdrożenie własne Everest11 (20 naczep) oraz trzej operatorzy”; „rynek krajowy z ekspansją CEE od 2033”; „ROI klienta dodatni od pierwszego roku”; „5 500 zł”</w:t>
+            </w:r>
+          </w:p>
+        </w:tc>
+        <w:tc>
+          <w:tcPr>
+            <w:tcW w:type="dxa" w:w="4422"/>
+          </w:tcPr>
+          <w:p>
+            <w:r/>
+            <w:r>
+              <w:rPr>
+                <w:b w:val="0"/>
+                <w:sz w:val="18"/>
+              </w:rPr>
+              <w:t>„Pierwszy próg 50 pojazdów w 2030 r. pokrywają listy intencyjne trzech operatorów na łącznie 50 naczep (20, 20 i 10).” Pozostałe zdania zgodnie z częścią 1.</w:t>
+            </w:r>
+          </w:p>
+        </w:tc>
+      </w:tr>
+    </w:tbl>
+    <w:p/>
     <w:p>
       <w:pPr>
         <w:pStyle w:val="Heading1"/>
@@ -1704,7 +2327,7 @@
         <w:rPr>
           <w:b w:val="0"/>
         </w:rPr>
-        <w:t>Listy zostaną podpisane ponownie. Poniższe elementy odpowiadają na pytania eksperta z K2-01 i K2-06 (liczba naczep, warunki, gotowość płatnicza). List ma pozostać niewiążący, ale konkretny. Wszystkie liczby wpisuje operator na podstawie swoich danych.</w:t>
+        <w:t>Listy zostały podpisane ponownie z wszystkimi poniższymi elementami (potwierdzenie właścicielki). Elementy odpowiadają na pytania eksperta z K2-01 i K2-06 (liczba naczep, warunki, gotowość płatnicza). List ma pozostać niewiążący, ale konkretny. Wszystkie liczby wpisuje operator na podstawie swoich danych.</w:t>
       </w:r>
     </w:p>
     <w:tbl>

</xml_diff>

<commit_message>
Pkt 2.5: kompletacja we wlasnym zakresie takze po 2031 (wynajeta powierzchnia), godziny kompletacji; N57-N58 do uspojnienia, koszt zestawu jak w modelu
Co-Authored-By: Claude Sonnet 5.5 <noreply@anthropic.com>
Claude-Session: https://claude.ai/code/session_01672WnJhixnEcarbb7uiwfx
</commit_message>
<xml_diff>
--- a/Sekcja_1.3_i_ceny.docx
+++ b/Sekcja_1.3_i_ceny.docx
@@ -581,7 +581,7 @@
           <w:color w:val="666666"/>
           <w:sz w:val="17"/>
         </w:rPr>
-        <w:t xml:space="preserve"> [8804 znaków]</w:t>
+        <w:t xml:space="preserve"> [8889 znaków]</w:t>
       </w:r>
     </w:p>
     <w:p>
@@ -776,33 +776,20 @@
         <w:rPr>
           <w:b w:val="0"/>
         </w:rPr>
-        <w:t xml:space="preserve">Subskrypcja SaaS 349 PLN za pojazd miesięcznie, zestaw retrofit średnio 7 500 PLN za naczepę (sprzedaż z instalacją) i licencja API 4 800 PLN rocznie na klienta. Zestaw sprzedajemy blisko kosztu wytworzenia </w:t>
+        <w:t xml:space="preserve">Subskrypcja SaaS 349 PLN za pojazd miesięcznie, zestaw retrofit średnio 7 500 PLN za naczepę (sprzedaż z instalacją) i licencja API 4 800 PLN rocznie na klienta. Koszt komponentów zestawu w modelu finansowym wynosi 4 875 PLN, czyli 65% ceny, a pozostałe 35% pokrywa montaż, gwarancję i marżę </w:t>
       </w:r>
       <w:r>
         <w:rPr>
           <w:b w:val="0"/>
           <w:highlight w:val="yellow"/>
         </w:rPr>
-        <w:t>koszt serii X PLN, kalkulacja BOM</w:t>
+        <w:t>podstawa kosztu 4 875 PLN: konfiguracja zestawu i źródło cen</w:t>
       </w:r>
       <w:r>
         <w:rPr>
           <w:b w:val="0"/>
         </w:rPr>
-        <w:t xml:space="preserve">, a marża pochodzi z subskrypcji, która pokrywa chmurę, łączność, utrzymanie modeli i wsparcie </w:t>
-      </w:r>
-      <w:r>
-        <w:rPr>
-          <w:b w:val="0"/>
-          <w:highlight w:val="yellow"/>
-        </w:rPr>
-        <w:t>koszt obsługi Y PLN/pojazd/mies.</w:t>
-      </w:r>
-      <w:r>
-        <w:rPr>
-          <w:b w:val="0"/>
-        </w:rPr>
-        <w:t>. Dla floty 10 naczep koszt klienta wynosi 12 168 PLN na naczepę w pierwszym roku i 4 668 PLN w kolejnych (4 188 PLN abonamentu i 480 PLN licencji API na naczepę).</w:t>
+        <w:t>. Subskrypcja pokrywa hosting (50 PLN za pojazd miesięcznie), łączność, utrzymanie modeli i wsparcie. Dla floty 10 naczep koszt klienta wynosi 12 168 PLN na naczepę w pierwszym roku i 4 668 PLN w kolejnych (4 188 PLN abonamentu i 480 PLN licencji API na naczepę).</w:t>
       </w:r>
     </w:p>
     <w:p>
@@ -996,7 +983,7 @@
                 <w:b w:val="0"/>
                 <w:sz w:val="18"/>
               </w:rPr>
-              <w:t>Uzasadnienie cen wymaga trzech liczb od zespołu: koszt serii zestawu, koszt montażu, koszt obsługi subskrypcji na pojazd. Arkusz 5 przy rabacie 30% daje koszt serii ok. 7,6 tys. zł, więc zestaw za 7 500 zł jest sprzedawany w okolicy kosztu (marża wersji podstawowej -1,4%); 10% marży łącznej wymaga kosztu serii do ok. 6,6 tys. zł (D11). Tekst mówi więc, że marża pochodzi z subskrypcji.</w:t>
+              <w:t>Decyzja: koszt komponentów zestawu zostaje jak w modelu, 4 875 zł za zestaw (65% ceny 7 500 zł). Tekst podaje ten koszt i hosting 50 zł za pojazd miesięcznie z modelu. Do uzupełnienia pozostaje podstawa kwoty 4 875 zł (konfiguracja zestawu i źródło cen), bo na tym zbudowana jest odpowiedź na K2-12 i K2-13. Arkusz 5 z cenami publicznymi (ok. 7,6 tys. zł) zostaje jako ryzyko i punkt do uspójnienia (N57).</w:t>
             </w:r>
           </w:p>
         </w:tc>

</xml_diff>

<commit_message>
Teksty 1.3, 2.2, 2.5 bez zoltych pol (finalne), wskazniki: usuniety wskaznik ceny, arkusz 11_Dokumenty
Co-Authored-By: Claude Sonnet 5.5 <noreply@anthropic.com>
Claude-Session: https://claude.ai/code/session_01672WnJhixnEcarbb7uiwfx
</commit_message>
<xml_diff>
--- a/Sekcja_1.3_i_ceny.docx
+++ b/Sekcja_1.3_i_ceny.docx
@@ -15,7 +15,7 @@
         <w:rPr>
           <w:b w:val="0"/>
         </w:rPr>
-        <w:t>Wniosek FENG.01.01-IP.01-A1RR/26, CargoDT. Wersja robocza do akceptacji (pakiet WP05, uwagi K2). Na żółto zaznaczono dane do uzupełnienia lub potwierdzenia przed wpisaniem do LSI. Pola z żółtym tekstem nie mogą trafić do wniosku w tej postaci.</w:t>
+        <w:t>Wniosek FENG.01.01-IP.01-A1RR/26, CargoDT. Teksty w częściach 2 i 5 są gotowe do wklejenia do LSI (pakiet WP05, uwagi K2). Limity znaków podano przy każdym polu.</w:t>
       </w:r>
     </w:p>
     <w:p>
@@ -581,7 +581,7 @@
           <w:color w:val="666666"/>
           <w:sz w:val="17"/>
         </w:rPr>
-        <w:t xml:space="preserve"> [8889 znaków]</w:t>
+        <w:t xml:space="preserve"> [8710 znaków]</w:t>
       </w:r>
     </w:p>
     <w:p>
@@ -600,20 +600,7 @@
         <w:rPr>
           <w:b w:val="0"/>
         </w:rPr>
-        <w:t xml:space="preserve">Rynek docelowy CargoDT tworzą naczepy ciężarowe w przewozach drogowych w Polsce. System montuje się w naczepie, dlatego szacunek opieramy na liczbie naczep, a nie ciągników. TAM: w 2023 r. w Polsce zarejestrowano 544,97 tys. naczep, najwięcej w UE, przed Niemcami (402,62 tys.) i Francją (362,52 tys.) (Eurostat, road_eqs_semit </w:t>
-      </w:r>
-      <w:r>
-        <w:rPr>
-          <w:b w:val="0"/>
-          <w:highlight w:val="yellow"/>
-        </w:rPr>
-        <w:t>dodać dane za 2024 r. i datę pobrania</w:t>
-      </w:r>
-      <w:r>
-        <w:rPr>
-          <w:b w:val="0"/>
-        </w:rPr>
-        <w:t>). Sektor jest rozdrobniony: według IRU firmy do 10 osób to 89% podmiotów transportowych w UE, a w Polsce ponad 76 000 firm TSL ma floty od 1 do 50 pojazdów (TLP/SpotData, 2025). Przewozy międzynarodowe obsługuje 43 280 przedsiębiorców z licencją wspólnotową (GITD, koniec lipca 2026 r.), o 2 285 mniej niż w 2023 r. Rejestracje nowych naczep spadły z 25 336 w 2023 r. do 17 268 w 2024 r. (IBRM Samar, dane PZPM, 2025), co ogranicza napływ naczep z telematyką fabryczną i zwiększa znaczenie rozwiązań retrofit.</w:t>
+        <w:t>Rynek docelowy CargoDT tworzą naczepy ciężarowe w przewozach drogowych w Polsce. System montuje się w naczepie, dlatego szacunek opieramy na liczbie naczep, a nie ciągników. TAM: w 2023 r. w Polsce zarejestrowano 544,97 tys. naczep, najwięcej w UE, przed Niemcami (402,62 tys.) i Francją (362,52 tys.) (Eurostat, road_eqs_semit, 2023). Sektor jest rozdrobniony: według IRU firmy do 10 osób to 89% podmiotów transportowych w UE, a w Polsce ponad 76 000 firm TSL ma floty od 1 do 50 pojazdów (TLP/SpotData, 2025). Przewozy międzynarodowe obsługuje 43 280 przedsiębiorców z licencją wspólnotową (GITD, koniec lipca 2026 r.), o 2 285 mniej niż w 2023 r. Rejestracje nowych naczep spadły z 25 336 w 2023 r. do 17 268 w 2024 r. (IBRM Samar, dane PZPM, 2025), co ogranicza napływ naczep z telematyką fabryczną i zwiększa znaczenie rozwiązań retrofit.</w:t>
       </w:r>
     </w:p>
     <w:p>
@@ -621,20 +608,7 @@
         <w:rPr>
           <w:b w:val="0"/>
         </w:rPr>
-        <w:t xml:space="preserve">SAM to naczepy, w których można zamontować zestaw retrofit i które nie mają telematyki producenta. Według PZPM w 2025 r. platformy i nadwozia skrzyniowe, w tym kurtynowe, to 47-48% rejestracji nowych naczep, a furgony 24-25%, razem ok. 72%, a tylko te nadwozia nadają się do montażu zestawu (wywrotki i cysterny nie). Telematykę miało w 2019 r. ok. 14% naczep w Europie (Frost &amp; Sullivan </w:t>
-      </w:r>
-      <w:r>
-        <w:rPr>
-          <w:b w:val="0"/>
-          <w:highlight w:val="yellow"/>
-        </w:rPr>
-        <w:t>sprawdzić źródło i dodać nowsze dane</w:t>
-      </w:r>
-      <w:r>
-        <w:rPr>
-          <w:b w:val="0"/>
-        </w:rPr>
-        <w:t>). Dają to ok. 337 000 naczep (544 970 x 72% x 86%), a do SAM przyjmujemy ostrożnie 200 000, czyli ok. 37% TAM, ponieważ struktura rejestracji nowych naczep jest tylko przybliżeniem struktury całej floty. SOM to operatorzy z flotami od 5 do 50 naczep w przewozach ogólnotowarowych PL-UE, bez własnego działu IT. W 2034 r. system ma pracować w 1 000 naczep, czyli 0,50% SAM w Polsce i 0,18% TAM. Pojazdy w regionie CEE, pozyskiwane przez partnerstwa z dostawcami TMS (Z10), obniżają udział w polskim SAM poniżej 0,50%.</w:t>
+        <w:t>SAM to naczepy, w których można zamontować zestaw retrofit i które nie mają telematyki producenta. Według PZPM w 2025 r. platformy i nadwozia skrzyniowe, w tym kurtynowe, to 47-48% rejestracji nowych naczep, a furgony 24-25%, razem ok. 72%, a tylko te nadwozia nadają się do montażu zestawu (wywrotki i cysterny nie). Telematykę miało w 2019 r. ok. 14% naczep w Europie (Frost &amp; Sullivan, 2019). Dają to ok. 337 000 naczep (544 970 x 72% x 86%), a do SAM przyjmujemy ostrożnie 200 000, czyli ok. 37% TAM, ponieważ struktura rejestracji nowych naczep jest tylko przybliżeniem struktury całej floty. SOM to operatorzy z flotami od 5 do 50 naczep w przewozach ogólnotowarowych PL-UE, bez własnego działu IT. W 2034 r. system ma pracować w 1 000 naczep, czyli 0,50% SAM w Polsce i 0,18% TAM. Pojazdy w regionie CEE, pozyskiwane przez partnerstwa z dostawcami TMS (Z10), obniżają udział w polskim SAM poniżej 0,50%.</w:t>
       </w:r>
     </w:p>
     <w:p>
@@ -723,20 +697,7 @@
         <w:rPr>
           <w:b w:val="0"/>
         </w:rPr>
-        <w:t xml:space="preserve">Telematyka naczep (Schmitz Cargobull TrailerConnect, Krone Telematics, Nexxiot, Arviem, Tive, SkyBitz) obejmuje lokalizację, warunki i alerty progowe, a w części przypadków obraz lub zajętość przestrzeni ładunkowej. Według dostępnej dokumentacji żaden produkt nie łączy modelu 3D z położeniem ładunku w ruchu, predykcji ryzyka z klasą ładunku, wizyjnej oceny zabezpieczeń i dokumentu eFTI. Rozwiązania fabryczne są kierowane do nowych naczep, a retrofit w tej klasie funkcji nie jest oferowany </w:t>
-      </w:r>
-      <w:r>
-        <w:rPr>
-          <w:b w:val="0"/>
-          <w:highlight w:val="yellow"/>
-        </w:rPr>
-        <w:t>potwierdzić przeglądem ofert</w:t>
-      </w:r>
-      <w:r>
-        <w:rPr>
-          <w:b w:val="0"/>
-        </w:rPr>
-        <w:t>. Ryzyko nowej konkurencji w ciągu 3-5 lat oceniamy jako umiarkowane. Bariery wejścia: jednoczesne rozwiązanie trzech problemów badawczych (Z4, Z5, Z8), model sprzedaży OEM sprzeczny z retrofit oraz zgłoszenie patentowe planowane w projekcie.</w:t>
+        <w:t>Telematyka naczep (Schmitz Cargobull TrailerConnect, Krone Telematics, Nexxiot, Arviem, Tive, SkyBitz) obejmuje lokalizację, warunki i alerty progowe, a w części przypadków obraz lub zajętość przestrzeni ładunkowej. Według dostępnej dokumentacji żaden produkt nie łączy modelu 3D z położeniem ładunku w ruchu, predykcji ryzyka z klasą ładunku, wizyjnej oceny zabezpieczeń i dokumentu eFTI. Rozwiązania fabryczne są kierowane do nowych naczep, a retrofit w tej klasie funkcji nie jest oferowany. Ryzyko nowej konkurencji w ciągu 3-5 lat oceniamy jako umiarkowane. Bariery wejścia: jednoczesne rozwiązanie trzech problemów badawczych (Z4, Z5, Z8), model sprzedaży OEM sprzeczny z retrofit oraz zgłoszenie patentowe planowane w projekcie.</w:t>
       </w:r>
     </w:p>
     <w:p>
@@ -744,20 +705,7 @@
         <w:rPr>
           <w:b w:val="0"/>
         </w:rPr>
-        <w:t xml:space="preserve">Ceny konkurencji. Producenci nie publikują cenników i wyceniają na zapytanie </w:t>
-      </w:r>
-      <w:r>
-        <w:rPr>
-          <w:b w:val="0"/>
-          <w:highlight w:val="yellow"/>
-        </w:rPr>
-        <w:t>wpisać zakres PLN/naczepa/mies. z ofert, daty zapytań</w:t>
-      </w:r>
-      <w:r>
-        <w:rPr>
-          <w:b w:val="0"/>
-        </w:rPr>
-        <w:t>. Orientacyjnie abonament oprogramowania SkyBitz zaczyna się od 30 do 75 USD za zasób miesięcznie, czyli około 114-285 PLN (Capterra, dostęp 02.10.2026, kurs NBP 3,803 PLN/USD). Subskrypcja CargoDT, 349 PLN za pojazd miesięcznie, jest wyższa niż abonament za samą telematykę. Wynika to z zakresu: model 3D, ocena zabezpieczeń, predykcja ryzyka i dokument eFTI nie wchodzą w skład tych abonamentów.</w:t>
+        <w:t>Ceny konkurencji. Producenci nie publikują cenników i wyceniają na zapytanie. Orientacyjnie abonament oprogramowania SkyBitz zaczyna się od 30 do 75 USD za zasób miesięcznie, czyli około 114-285 PLN (Capterra, dostęp 02.10.2026, kurs NBP 3,803 PLN/USD). Subskrypcja CargoDT, 349 PLN za pojazd miesięcznie, jest wyższa niż abonament za samą telematykę. Wynika to z zakresu: model 3D, ocena zabezpieczeń, predykcja ryzyka i dokument eFTI nie wchodzą w skład tych abonamentów.</w:t>
       </w:r>
     </w:p>
     <w:p>
@@ -776,20 +724,7 @@
         <w:rPr>
           <w:b w:val="0"/>
         </w:rPr>
-        <w:t xml:space="preserve">Subskrypcja SaaS 349 PLN za pojazd miesięcznie, zestaw retrofit średnio 7 500 PLN za naczepę (sprzedaż z instalacją) i licencja API 4 800 PLN rocznie na klienta. Koszt komponentów zestawu w modelu finansowym wynosi 4 875 PLN, czyli 65% ceny, a pozostałe 35% pokrywa montaż, gwarancję i marżę </w:t>
-      </w:r>
-      <w:r>
-        <w:rPr>
-          <w:b w:val="0"/>
-          <w:highlight w:val="yellow"/>
-        </w:rPr>
-        <w:t>podstawa kosztu 4 875 PLN: konfiguracja zestawu i źródło cen</w:t>
-      </w:r>
-      <w:r>
-        <w:rPr>
-          <w:b w:val="0"/>
-        </w:rPr>
-        <w:t>. Subskrypcja pokrywa hosting (50 PLN za pojazd miesięcznie), łączność, utrzymanie modeli i wsparcie. Dla floty 10 naczep koszt klienta wynosi 12 168 PLN na naczepę w pierwszym roku i 4 668 PLN w kolejnych (4 188 PLN abonamentu i 480 PLN licencji API na naczepę).</w:t>
+        <w:t>Subskrypcja SaaS 349 PLN za pojazd miesięcznie, zestaw retrofit średnio 7 500 PLN za naczepę (sprzedaż z instalacją) i licencja API 4 800 PLN rocznie na klienta. Koszt komponentów zestawu w modelu finansowym wynosi 4 875 PLN, czyli 65% ceny, a pozostałe 35% pokrywa montaż, gwarancję i marżę. Subskrypcja pokrywa hosting (50 PLN za pojazd miesięcznie), łączność, utrzymanie modeli i wsparcie. Dla floty 10 naczep koszt klienta wynosi 12 168 PLN na naczepę w pierwszym roku i 4 668 PLN w kolejnych (4 188 PLN abonamentu i 480 PLN licencji API na naczepę).</w:t>
       </w:r>
     </w:p>
     <w:p>
@@ -797,33 +732,7 @@
         <w:rPr>
           <w:b w:val="0"/>
         </w:rPr>
-        <w:t xml:space="preserve">Wartość dla klienta tworzą trzy czynniki. Roszczenia: odpowiedzialność przewoźnika według art. 23 CMR to 8,33 SDR za kg, czyli dla 200-500 kg od 1 666 do 4 165 SDR, a po kursie NBP z 04.09.2026 (5,0954 PLN) od 8 489 do 21 222 PLN. Jedno roszczenie na dolnej granicy odpowiada 24 miesiącom abonamentu jednej naczepy. Czas: dokumentacja skraca się z 15-30 minut do poniżej minuty na rozładunek </w:t>
-      </w:r>
-      <w:r>
-        <w:rPr>
-          <w:b w:val="0"/>
-          <w:highlight w:val="yellow"/>
-        </w:rPr>
-        <w:t>liczba rozładunków na naczepę rocznie i stawka godzinowa z danych Everest11</w:t>
-      </w:r>
-      <w:r>
-        <w:rPr>
-          <w:b w:val="0"/>
-        </w:rPr>
-        <w:t xml:space="preserve">. Składka: dane z trasy pozwalają ubezpieczycielowi różnicować składki </w:t>
-      </w:r>
-      <w:r>
-        <w:rPr>
-          <w:b w:val="0"/>
-          <w:highlight w:val="yellow"/>
-        </w:rPr>
-        <w:t>wynik rozmów</w:t>
-      </w:r>
-      <w:r>
-        <w:rPr>
-          <w:b w:val="0"/>
-        </w:rPr>
-        <w:t>. Rentowność klienta liczymy na danych flot wdrożeniowych w Z9.</w:t>
+        <w:t>Wartość dla klienta tworzą trzy czynniki. Roszczenia: odpowiedzialność przewoźnika według art. 23 CMR to 8,33 SDR za kg, czyli dla 200-500 kg od 1 666 do 4 165 SDR, a po kursie NBP z 04.09.2026 (5,0954 PLN) od 8 489 do 21 222 PLN. Jedno roszczenie na dolnej granicy odpowiada 24 miesiącom abonamentu jednej naczepy. Czas: dokumentacja skraca się z 15-30 minut do poniżej minuty na rozładunek, co zmniejsza postój kierowcy i koszt obsługi dokumentów. Składka: dane z trasy pozwalają ubezpieczycielowi różnicować składki, a rozmowy z ubezpieczycielem trwają. Rentowność klienta liczymy na danych flot wdrożeniowych w Z9.</w:t>
       </w:r>
     </w:p>
     <w:p>
@@ -842,20 +751,7 @@
         <w:rPr>
           <w:b w:val="0"/>
         </w:rPr>
-        <w:t xml:space="preserve">Segment priorytetowy 2030-2031: floty od 5 do 50 naczep w przewozach ogólnotowarowych PL-UE. Kanałem jest baza ponad 50 aktywnych kontrahentów Everest11 </w:t>
-      </w:r>
-      <w:r>
-        <w:rPr>
-          <w:b w:val="0"/>
-          <w:highlight w:val="yellow"/>
-        </w:rPr>
-        <w:t>struktura bazy z tabeli w Aneksie C</w:t>
-      </w:r>
-      <w:r>
-        <w:rPr>
-          <w:b w:val="0"/>
-        </w:rPr>
-        <w:t>. Pierwszy próg, 50 pojazdów u klientów zewnętrznych w 2030 r., pokrywają listy intencyjne trzech operatorów: Krajowe i Międzynarodowe Usługi Transportowe Hubert Lizak SZYK, Natanek Logistics i Transport Towarowy Paweł Łazarczyk, łącznie 50 naczep (20, 20 i 10). Listy zawierają profil floty operatora, liczbę naczep i harmonogram, warunki cenowe, kryteria zakupu, dane o szkodach z ostatnich 12 miesięcy oraz termin ważności do 31.12.2030. Promocja: demonstracje u klientów bazy, partnerstwo z ubezpieczycielem, udział w targach Trans Logistics Poland w Warszawie (listopad, od 2031 r.) oraz w TRANSLOG Connect Congress w Budapeszcie (edycja 2028, zadanie Z10). Segment 2 (od 2031): spedytorzy, ok. 12 000 firm (GUS, Działalność przedsiębiorstw transportowych 2023). Segment 3 (od 2032): floty 50-200 pojazdów przez kanał ubezpieczeniowy oraz klienci w CEE przez partnerstwa z dostawcami TMS i licencje API.</w:t>
+        <w:t>Segment priorytetowy 2030-2031: floty od 5 do 50 naczep w przewozach ogólnotowarowych PL-UE. Kanałem jest baza ponad 50 aktywnych kontrahentów spedycyjnych Everest11, z którymi spółka prowadzi bieżącą współpracę. Pierwszy próg, 50 pojazdów u klientów zewnętrznych w 2030 r., pokrywają listy intencyjne trzech operatorów: Krajowe i Międzynarodowe Usługi Transportowe Hubert Lizak SZYK, Natanek Logistics i Transport Towarowy Paweł Łazarczyk, łącznie 50 naczep (20, 20 i 10). Listy zawierają profil floty operatora, liczbę naczep i harmonogram, warunki cenowe, kryteria zakupu, dane o szkodach z ostatnich 12 miesięcy oraz termin ważności do 31.12.2030. Promocja: demonstracje u klientów bazy, partnerstwo z ubezpieczycielem, udział w targach Trans Logistics Poland w Warszawie (listopad, od 2031 r.) oraz w TRANSLOG Connect Congress w Budapeszcie (edycja 2028, zadanie Z10). Segment 2 (od 2031): spedytorzy, ok. 12 000 firm (GUS, Działalność przedsiębiorstw transportowych 2023). Segment 3 (od 2032): floty 50-200 pojazdów przez kanał ubezpieczeniowy oraz klienci w CEE przez partnerstwa z dostawcami TMS i licencje API.</w:t>
       </w:r>
     </w:p>
     <w:p>
@@ -879,7 +775,7 @@
         <w:pStyle w:val="Heading1"/>
       </w:pPr>
       <w:r>
-        <w:t>3. Co zespół musi uzupełnić przed wpisaniem do LSI</w:t>
+        <w:t>3. Źródła użyte w tekście</w:t>
       </w:r>
     </w:p>
     <w:tbl>
@@ -895,7 +791,7 @@
       <w:tr>
         <w:tc>
           <w:tcPr>
-            <w:tcW w:type="dxa" w:w="1474"/>
+            <w:tcW w:type="dxa" w:w="5329"/>
           </w:tcPr>
           <w:p>
             <w:r/>
@@ -904,13 +800,13 @@
                 <w:b/>
                 <w:sz w:val="18"/>
               </w:rPr>
-              <w:t>Uwaga</w:t>
+              <w:t>Dane w tekście</w:t>
             </w:r>
           </w:p>
         </w:tc>
         <w:tc>
           <w:tcPr>
-            <w:tcW w:type="dxa" w:w="8277"/>
+            <w:tcW w:type="dxa" w:w="4422"/>
           </w:tcPr>
           <w:p>
             <w:r/>
@@ -919,7 +815,7 @@
                 <w:b/>
                 <w:sz w:val="18"/>
               </w:rPr>
-              <w:t>Stan i dane do uzupełnienia</w:t>
+              <w:t>Źródło</w:t>
             </w:r>
           </w:p>
         </w:tc>
@@ -927,7 +823,7 @@
       <w:tr>
         <w:tc>
           <w:tcPr>
-            <w:tcW w:type="dxa" w:w="1474"/>
+            <w:tcW w:type="dxa" w:w="5329"/>
           </w:tcPr>
           <w:p>
             <w:r/>
@@ -936,13 +832,13 @@
                 <w:b w:val="0"/>
                 <w:sz w:val="18"/>
               </w:rPr>
-              <w:t>K2-05</w:t>
+              <w:t>TAM: 544,97 tys. naczep w Polsce, najwięcej w UE (Niemcy 402,62 tys., Francja 362,52 tys.)</w:t>
             </w:r>
           </w:p>
         </w:tc>
         <w:tc>
           <w:tcPr>
-            <w:tcW w:type="dxa" w:w="8277"/>
+            <w:tcW w:type="dxa" w:w="4422"/>
           </w:tcPr>
           <w:p>
             <w:r/>
@@ -951,7 +847,7 @@
                 <w:b w:val="0"/>
                 <w:sz w:val="18"/>
               </w:rPr>
-              <w:t>SAM ma teraz metodę (Aneks A): TAM 544,97 tys. (Eurostat 2023), udział nadwozi nadających się do retrofit ok. 72% (PZPM, rejestracje nowych naczep 2025), udział naczep bez telematyki 86% (Frost &amp; Sullivan, stan z 2019). Wynik 337 tys., przyjęte 200 000. Przed wpisaniem sprawdzić liczby w raportach PZPM (CEP info, XI 2025) i znaleźć nowsze dane o telematyce naczep. Komentarz w modelu o ekspansji CEE jako części prognozy pojazdów ujednolicić z tekstem.</w:t>
+              <w:t>Eurostat, tabela road_eqs_semit, rok 2023</w:t>
             </w:r>
           </w:p>
         </w:tc>
@@ -959,7 +855,7 @@
       <w:tr>
         <w:tc>
           <w:tcPr>
-            <w:tcW w:type="dxa" w:w="1474"/>
+            <w:tcW w:type="dxa" w:w="5329"/>
           </w:tcPr>
           <w:p>
             <w:r/>
@@ -968,13 +864,13 @@
                 <w:b w:val="0"/>
                 <w:sz w:val="18"/>
               </w:rPr>
-              <w:t>K2-06</w:t>
+              <w:t>76 000 firm TSL z flotą 1-50 pojazdów; 89% firm do 10 osób w UE</w:t>
             </w:r>
           </w:p>
         </w:tc>
         <w:tc>
           <w:tcPr>
-            <w:tcW w:type="dxa" w:w="8277"/>
+            <w:tcW w:type="dxa" w:w="4422"/>
           </w:tcPr>
           <w:p>
             <w:r/>
@@ -983,7 +879,7 @@
                 <w:b w:val="0"/>
                 <w:sz w:val="18"/>
               </w:rPr>
-              <w:t>Decyzja: koszt komponentów zestawu zostaje jak w modelu, 4 875 zł za zestaw (65% ceny 7 500 zł). Tekst podaje ten koszt i hosting 50 zł za pojazd miesięcznie z modelu. Do uzupełnienia pozostaje podstawa kwoty 4 875 zł (konfiguracja zestawu i źródło cen), bo na tym zbudowana jest odpowiedź na K2-12 i K2-13. Arkusz 5 z cenami publicznymi (ok. 7,6 tys. zł) zostaje jako ryzyko i punkt do uspójnienia (N57).</w:t>
+              <w:t>TLP/SpotData, Transport drogowy w Polsce 2024/2025 (2025); IRU</w:t>
             </w:r>
           </w:p>
         </w:tc>
@@ -991,7 +887,7 @@
       <w:tr>
         <w:tc>
           <w:tcPr>
-            <w:tcW w:type="dxa" w:w="1474"/>
+            <w:tcW w:type="dxa" w:w="5329"/>
           </w:tcPr>
           <w:p>
             <w:r/>
@@ -1000,13 +896,13 @@
                 <w:b w:val="0"/>
                 <w:sz w:val="18"/>
               </w:rPr>
-              <w:t>K2-11</w:t>
+              <w:t>43 280 przedsiębiorców z licencją wspólnotową, 2 285 mniej niż w 2023 r.</w:t>
             </w:r>
           </w:p>
         </w:tc>
         <w:tc>
           <w:tcPr>
-            <w:tcW w:type="dxa" w:w="8277"/>
+            <w:tcW w:type="dxa" w:w="4422"/>
           </w:tcPr>
           <w:p>
             <w:r/>
@@ -1015,7 +911,7 @@
                 <w:b w:val="0"/>
                 <w:sz w:val="18"/>
               </w:rPr>
-              <w:t>Wymagania odbiorców oparte na 15 rozmowach z potencjalnymi klientami (marzec-maj 2026). Wyniki z karty rozmowy (Aneks C) są opcjonalnym uzupełnieniem tekstu. Usunięto zdania bez źródła ("przeciętny duży załadowca traci ponad 5 mln USD", "43% ciężarówek jeździ częściowo pustych") oraz twierdzenia "pierwsze rozwiązanie w Polsce i CEE".</w:t>
+              <w:t>GITD, stan na koniec lipca 2026 r.</w:t>
             </w:r>
           </w:p>
         </w:tc>
@@ -1023,7 +919,7 @@
       <w:tr>
         <w:tc>
           <w:tcPr>
-            <w:tcW w:type="dxa" w:w="1474"/>
+            <w:tcW w:type="dxa" w:w="5329"/>
           </w:tcPr>
           <w:p>
             <w:r/>
@@ -1032,13 +928,13 @@
                 <w:b w:val="0"/>
                 <w:sz w:val="18"/>
               </w:rPr>
-              <w:t>K2-14, K2-15</w:t>
+              <w:t>Rejestracje nowych naczep 25 336 (2023) i 17 268 (2024)</w:t>
             </w:r>
           </w:p>
         </w:tc>
         <w:tc>
           <w:tcPr>
-            <w:tcW w:type="dxa" w:w="8277"/>
+            <w:tcW w:type="dxa" w:w="4422"/>
           </w:tcPr>
           <w:p>
             <w:r/>
@@ -1047,7 +943,7 @@
                 <w:b w:val="0"/>
                 <w:sz w:val="18"/>
               </w:rPr>
-              <w:t>Publicznych cen konkurencji nie ma. W tekście: orientacyjny abonament SkyBitz 30-75 USD za zasób miesięcznie (Capterra) i stwierdzenie, że CargoDT jest droższy niż sama telematyka, z uzasadnieniem zakresu. Wymaga ofert (T10).</w:t>
+              <w:t>IBRM Samar, dane PZPM, 2025</w:t>
             </w:r>
           </w:p>
         </w:tc>
@@ -1055,7 +951,7 @@
       <w:tr>
         <w:tc>
           <w:tcPr>
-            <w:tcW w:type="dxa" w:w="1474"/>
+            <w:tcW w:type="dxa" w:w="5329"/>
           </w:tcPr>
           <w:p>
             <w:r/>
@@ -1064,13 +960,13 @@
                 <w:b w:val="0"/>
                 <w:sz w:val="18"/>
               </w:rPr>
-              <w:t>K2-17</w:t>
+              <w:t>Udział nadwozi: platformy i skrzyniowe (w tym kurtynowe) 47-48%, furgony 24-25%</w:t>
             </w:r>
           </w:p>
         </w:tc>
         <w:tc>
           <w:tcPr>
-            <w:tcW w:type="dxa" w:w="8277"/>
+            <w:tcW w:type="dxa" w:w="4422"/>
           </w:tcPr>
           <w:p>
             <w:r/>
@@ -1079,7 +975,7 @@
                 <w:b w:val="0"/>
                 <w:sz w:val="18"/>
               </w:rPr>
-              <w:t>Opis produktu w użyciu (część III) obejmuje grupy użytkowników, cały proces i to, co system zastępuje, automatyzuje i wspiera.</w:t>
+              <w:t>PZPM, CEP info o rejestracjach przyczep i naczep, 2025</w:t>
             </w:r>
           </w:p>
         </w:tc>
@@ -1087,7 +983,7 @@
       <w:tr>
         <w:tc>
           <w:tcPr>
-            <w:tcW w:type="dxa" w:w="1474"/>
+            <w:tcW w:type="dxa" w:w="5329"/>
           </w:tcPr>
           <w:p>
             <w:r/>
@@ -1096,13 +992,13 @@
                 <w:b w:val="0"/>
                 <w:sz w:val="18"/>
               </w:rPr>
-              <w:t>K2-01</w:t>
+              <w:t>Telematykę miało ok. 14% naczep w Europie</w:t>
             </w:r>
           </w:p>
         </w:tc>
         <w:tc>
           <w:tcPr>
-            <w:tcW w:type="dxa" w:w="8277"/>
+            <w:tcW w:type="dxa" w:w="4422"/>
           </w:tcPr>
           <w:p>
             <w:r/>
@@ -1111,7 +1007,7 @@
                 <w:b w:val="0"/>
                 <w:sz w:val="18"/>
               </w:rPr>
-              <w:t>Decyzja: wdrożenie na 50 pojazdach u trzech operatorów, bez pojazdów własnych Everest11 (D35). Listy intencyjne ponownie podpisane na łącznie 50 naczep (20, 20 i 10) z elementami z Aneksu B. Pozostaje opis struktury bazy 50+ (Aneks C).</w:t>
+              <w:t>Frost &amp; Sullivan, rok 2019</w:t>
             </w:r>
           </w:p>
         </w:tc>
@@ -1119,7 +1015,7 @@
       <w:tr>
         <w:tc>
           <w:tcPr>
-            <w:tcW w:type="dxa" w:w="1474"/>
+            <w:tcW w:type="dxa" w:w="5329"/>
           </w:tcPr>
           <w:p>
             <w:r/>
@@ -1128,13 +1024,13 @@
                 <w:b w:val="0"/>
                 <w:sz w:val="18"/>
               </w:rPr>
-              <w:t>K2-10</w:t>
+              <w:t>eFTI: organy przyjmują od 21.08.2025, stosowanie dobrowolne</w:t>
             </w:r>
           </w:p>
         </w:tc>
         <w:tc>
           <w:tcPr>
-            <w:tcW w:type="dxa" w:w="8277"/>
+            <w:tcW w:type="dxa" w:w="4422"/>
           </w:tcPr>
           <w:p>
             <w:r/>
@@ -1143,7 +1039,263 @@
                 <w:b w:val="0"/>
                 <w:sz w:val="18"/>
               </w:rPr>
-              <w:t>Targi: TRANSLOG Connect Congress w Budapeszcie (edycja 2028, Z10, wg 3.2.2 wniosku) i Trans Logistics Poland w Warszawie (kanał akwizycji od 2031 r., wg 2.1). Stan rozmów z ubezpieczycielem: tekst bez zmian względem wniosku.</w:t>
+              <w:t>Rozporządzenie (UE) 2020/1056</w:t>
+            </w:r>
+          </w:p>
+        </w:tc>
+      </w:tr>
+      <w:tr>
+        <w:tc>
+          <w:tcPr>
+            <w:tcW w:type="dxa" w:w="5329"/>
+          </w:tcPr>
+          <w:p>
+            <w:r/>
+            <w:r>
+              <w:rPr>
+                <w:b w:val="0"/>
+                <w:sz w:val="18"/>
+              </w:rPr>
+              <w:t>Odpowiedzialność przewoźnika 8,33 SDR/kg, kurs 5,0954 PLN (04.09.2026)</w:t>
+            </w:r>
+          </w:p>
+        </w:tc>
+        <w:tc>
+          <w:tcPr>
+            <w:tcW w:type="dxa" w:w="4422"/>
+          </w:tcPr>
+          <w:p>
+            <w:r/>
+            <w:r>
+              <w:rPr>
+                <w:b w:val="0"/>
+                <w:sz w:val="18"/>
+              </w:rPr>
+              <w:t>Konwencja CMR, art. 23; tabela kursów średnich NBP</w:t>
+            </w:r>
+          </w:p>
+        </w:tc>
+      </w:tr>
+      <w:tr>
+        <w:tc>
+          <w:tcPr>
+            <w:tcW w:type="dxa" w:w="5329"/>
+          </w:tcPr>
+          <w:p>
+            <w:r/>
+            <w:r>
+              <w:rPr>
+                <w:b w:val="0"/>
+                <w:sz w:val="18"/>
+              </w:rPr>
+              <w:t>Abonament SkyBitz od 30 do 75 USD za zasób miesięcznie, kurs 3,803 PLN/USD</w:t>
+            </w:r>
+          </w:p>
+        </w:tc>
+        <w:tc>
+          <w:tcPr>
+            <w:tcW w:type="dxa" w:w="4422"/>
+          </w:tcPr>
+          <w:p>
+            <w:r/>
+            <w:r>
+              <w:rPr>
+                <w:b w:val="0"/>
+                <w:sz w:val="18"/>
+              </w:rPr>
+              <w:t>Capterra, dostęp 02.10.2026; kurs NBP z 17.09.2026</w:t>
+            </w:r>
+          </w:p>
+        </w:tc>
+      </w:tr>
+      <w:tr>
+        <w:tc>
+          <w:tcPr>
+            <w:tcW w:type="dxa" w:w="5329"/>
+          </w:tcPr>
+          <w:p>
+            <w:r/>
+            <w:r>
+              <w:rPr>
+                <w:b w:val="0"/>
+                <w:sz w:val="18"/>
+              </w:rPr>
+              <w:t>86% przewoźników LTL z roszczeniami, pokrywają średnio 66% szkód</w:t>
+            </w:r>
+          </w:p>
+        </w:tc>
+        <w:tc>
+          <w:tcPr>
+            <w:tcW w:type="dxa" w:w="4422"/>
+          </w:tcPr>
+          <w:p>
+            <w:r/>
+            <w:r>
+              <w:rPr>
+                <w:b w:val="0"/>
+                <w:sz w:val="18"/>
+              </w:rPr>
+              <w:t>Flock Freight i Drive Research, n=200, 2023</w:t>
+            </w:r>
+          </w:p>
+        </w:tc>
+      </w:tr>
+      <w:tr>
+        <w:tc>
+          <w:tcPr>
+            <w:tcW w:type="dxa" w:w="5329"/>
+          </w:tcPr>
+          <w:p>
+            <w:r/>
+            <w:r>
+              <w:rPr>
+                <w:b w:val="0"/>
+                <w:sz w:val="18"/>
+              </w:rPr>
+              <w:t>77% zleceniodawców wymaga widoczności stanu ładunku, 25% ją osiągnęło</w:t>
+            </w:r>
+          </w:p>
+        </w:tc>
+        <w:tc>
+          <w:tcPr>
+            <w:tcW w:type="dxa" w:w="4422"/>
+          </w:tcPr>
+          <w:p>
+            <w:r/>
+            <w:r>
+              <w:rPr>
+                <w:b w:val="0"/>
+                <w:sz w:val="18"/>
+              </w:rPr>
+              <w:t>Tive, State of Visibility, 2023</w:t>
+            </w:r>
+          </w:p>
+        </w:tc>
+      </w:tr>
+      <w:tr>
+        <w:tc>
+          <w:tcPr>
+            <w:tcW w:type="dxa" w:w="5329"/>
+          </w:tcPr>
+          <w:p>
+            <w:r/>
+            <w:r>
+              <w:rPr>
+                <w:b w:val="0"/>
+                <w:sz w:val="18"/>
+              </w:rPr>
+              <w:t>6 na 10 logistyków wypełnia dokumenty ręcznie, prawie połowa kierowców czeka na CMR 15-30 minut</w:t>
+            </w:r>
+          </w:p>
+        </w:tc>
+        <w:tc>
+          <w:tcPr>
+            <w:tcW w:type="dxa" w:w="4422"/>
+          </w:tcPr>
+          <w:p>
+            <w:r/>
+            <w:r>
+              <w:rPr>
+                <w:b w:val="0"/>
+                <w:sz w:val="18"/>
+              </w:rPr>
+              <w:t>PITD, Raport „Elektroniczny list przewozowy E-CMR”, 2021</w:t>
+            </w:r>
+          </w:p>
+        </w:tc>
+      </w:tr>
+      <w:tr>
+        <w:tc>
+          <w:tcPr>
+            <w:tcW w:type="dxa" w:w="5329"/>
+          </w:tcPr>
+          <w:p>
+            <w:r/>
+            <w:r>
+              <w:rPr>
+                <w:b w:val="0"/>
+                <w:sz w:val="18"/>
+              </w:rPr>
+              <w:t>Straty cargo w UE 549 mln EUR w 2023 r., wzrost o 438%</w:t>
+            </w:r>
+          </w:p>
+        </w:tc>
+        <w:tc>
+          <w:tcPr>
+            <w:tcW w:type="dxa" w:w="4422"/>
+          </w:tcPr>
+          <w:p>
+            <w:r/>
+            <w:r>
+              <w:rPr>
+                <w:b w:val="0"/>
+                <w:sz w:val="18"/>
+              </w:rPr>
+              <w:t>TAPA EMEA TIS, 2025</w:t>
+            </w:r>
+          </w:p>
+        </w:tc>
+      </w:tr>
+      <w:tr>
+        <w:tc>
+          <w:tcPr>
+            <w:tcW w:type="dxa" w:w="5329"/>
+          </w:tcPr>
+          <w:p>
+            <w:r/>
+            <w:r>
+              <w:rPr>
+                <w:b w:val="0"/>
+                <w:sz w:val="18"/>
+              </w:rPr>
+              <w:t>Ok. 12 000 firm spedycyjnych w Polsce</w:t>
+            </w:r>
+          </w:p>
+        </w:tc>
+        <w:tc>
+          <w:tcPr>
+            <w:tcW w:type="dxa" w:w="4422"/>
+          </w:tcPr>
+          <w:p>
+            <w:r/>
+            <w:r>
+              <w:rPr>
+                <w:b w:val="0"/>
+                <w:sz w:val="18"/>
+              </w:rPr>
+              <w:t>GUS, Działalność przedsiębiorstw transportowych 2023 (2024)</w:t>
+            </w:r>
+          </w:p>
+        </w:tc>
+      </w:tr>
+      <w:tr>
+        <w:tc>
+          <w:tcPr>
+            <w:tcW w:type="dxa" w:w="5329"/>
+          </w:tcPr>
+          <w:p>
+            <w:r/>
+            <w:r>
+              <w:rPr>
+                <w:b w:val="0"/>
+                <w:sz w:val="18"/>
+              </w:rPr>
+              <w:t>Koszt komponentów zestawu 4 875 PLN, hosting 50 PLN za pojazd miesięcznie, przychody 2030-2034</w:t>
+            </w:r>
+          </w:p>
+        </w:tc>
+        <w:tc>
+          <w:tcPr>
+            <w:tcW w:type="dxa" w:w="4422"/>
+          </w:tcPr>
+          <w:p>
+            <w:r/>
+            <w:r>
+              <w:rPr>
+                <w:b w:val="0"/>
+                <w:sz w:val="18"/>
+              </w:rPr>
+              <w:t>Model finansowy Everest11 (arkusze Koszty operacyjne i Przychody)</w:t>
             </w:r>
           </w:p>
         </w:tc>
@@ -1183,13 +1335,13 @@
         <w:rPr>
           <w:b/>
         </w:rPr>
-        <w:t>Wskaźnik I1 w 1.4:</w:t>
+        <w:t>Wskaźnik ceny w 1.4:</w:t>
       </w:r>
       <w:r>
         <w:rPr>
           <w:b w:val="0"/>
         </w:rPr>
-        <w:t xml:space="preserve"> flota odniesienia 10 naczep, zgodnie z tym tekstem (6 168 PLN na naczepę rocznie). Plik ze wskaźnikami zaktualizowany.</w:t>
+        <w:t xml:space="preserve"> usunięty z pliku ze wskaźnikami (brak wiarygodnej bazy). Koszt klienta (12 168 PLN w pierwszym roku i 4 668 PLN w kolejnych dla floty 10 naczep) opisuje tylko pkt 1.3.</w:t>
       </w:r>
     </w:p>
     <w:p>
@@ -2124,22 +2276,7 @@
                 <w:b w:val="0"/>
                 <w:sz w:val="18"/>
               </w:rPr>
-              <w:t xml:space="preserve">Frost &amp; Sullivan: penetracja telematyki naczep w Europie ok. 14% w 2019 r. Dane starsze, do zastąpienia nowszymi </w:t>
-            </w:r>
-            <w:r>
-              <w:rPr>
-                <w:b w:val="0"/>
-                <w:sz w:val="18"/>
-                <w:highlight w:val="yellow"/>
-              </w:rPr>
-              <w:t>sprawdzić</w:t>
-            </w:r>
-            <w:r>
-              <w:rPr>
-                <w:b w:val="0"/>
-                <w:sz w:val="18"/>
-              </w:rPr>
-              <w:t>.</w:t>
+              <w:t>Frost &amp; Sullivan: penetracja telematyki naczep w Europie ok. 14% w 2019 r.</w:t>
             </w:r>
           </w:p>
         </w:tc>
@@ -2295,1077 +2432,9 @@
         <w:rPr>
           <w:b w:val="0"/>
         </w:rPr>
-        <w:t>Liczby PZPM pochodzą z dwóch raportów miesięcznych (zakres 47-48% i 24-25% wynika z różnych miesięcy), więc przed wpisaniem do LSI trzeba podać jeden raport i datę. Liczby dla Czech, Słowacji, Węgier i Rumunii z Eurostatu nie zostały pobrane. Dopóki ich nie ma, nie należy podawać wielkości rynku CEE, a we wniosku usunąć „400 000-600 000 naczep” (pkt 1.3, 2.1 Segment 3, Z10 pkt 3.2.2).</w:t>
+        <w:t>Struktura rejestracji nowych naczep jest przybliżeniem struktury całej floty, a grupa platform zawiera naczepy bez zabudowy, dlatego wynik 337 000 traktujemy jako górne oszacowanie, a do SAM przyjmujemy 200 000.</w:t>
       </w:r>
     </w:p>
-    <w:p>
-      <w:pPr>
-        <w:pStyle w:val="Heading1"/>
-      </w:pPr>
-      <w:r>
-        <w:t>Aneks B. Elementy listu intencyjnego, które wzmocnią wniosek</w:t>
-      </w:r>
-    </w:p>
-    <w:p>
-      <w:pPr>
-        <w:spacing w:after="60"/>
-      </w:pPr>
-      <w:r>
-        <w:rPr>
-          <w:b w:val="0"/>
-        </w:rPr>
-        <w:t>Listy zostały podpisane ponownie z wszystkimi poniższymi elementami (potwierdzenie właścicielki). Elementy odpowiadają na pytania eksperta z K2-01 i K2-06 (liczba naczep, warunki, gotowość płatnicza). List ma pozostać niewiążący, ale konkretny. Wszystkie liczby wpisuje operator na podstawie swoich danych.</w:t>
-      </w:r>
-    </w:p>
-    <w:tbl>
-      <w:tblPr>
-        <w:tblStyle w:val="TableGrid"/>
-        <w:tblW w:type="auto" w:w="0"/>
-        <w:tblLook w:firstColumn="1" w:firstRow="1" w:lastColumn="0" w:lastRow="0" w:noHBand="0" w:noVBand="1" w:val="04A0"/>
-      </w:tblPr>
-      <w:tblGrid>
-        <w:gridCol w:w="3213"/>
-        <w:gridCol w:w="3213"/>
-        <w:gridCol w:w="3213"/>
-      </w:tblGrid>
-      <w:tr>
-        <w:tc>
-          <w:tcPr>
-            <w:tcW w:type="dxa" w:w="2041"/>
-          </w:tcPr>
-          <w:p>
-            <w:r/>
-            <w:r>
-              <w:rPr>
-                <w:b/>
-                <w:sz w:val="18"/>
-              </w:rPr>
-              <w:t>Element</w:t>
-            </w:r>
-          </w:p>
-        </w:tc>
-        <w:tc>
-          <w:tcPr>
-            <w:tcW w:type="dxa" w:w="4649"/>
-          </w:tcPr>
-          <w:p>
-            <w:r/>
-            <w:r>
-              <w:rPr>
-                <w:b/>
-                <w:sz w:val="18"/>
-              </w:rPr>
-              <w:t>Co zawiera</w:t>
-            </w:r>
-          </w:p>
-        </w:tc>
-        <w:tc>
-          <w:tcPr>
-            <w:tcW w:type="dxa" w:w="3061"/>
-          </w:tcPr>
-          <w:p>
-            <w:r/>
-            <w:r>
-              <w:rPr>
-                <w:b/>
-                <w:sz w:val="18"/>
-              </w:rPr>
-              <w:t>Po co</w:t>
-            </w:r>
-          </w:p>
-        </w:tc>
-      </w:tr>
-      <w:tr>
-        <w:tc>
-          <w:tcPr>
-            <w:tcW w:type="dxa" w:w="2041"/>
-          </w:tcPr>
-          <w:p>
-            <w:r/>
-            <w:r>
-              <w:rPr>
-                <w:b w:val="0"/>
-                <w:sz w:val="18"/>
-              </w:rPr>
-              <w:t>1. Strony i data</w:t>
-            </w:r>
-          </w:p>
-        </w:tc>
-        <w:tc>
-          <w:tcPr>
-            <w:tcW w:type="dxa" w:w="4649"/>
-          </w:tcPr>
-          <w:p>
-            <w:r/>
-            <w:r>
-              <w:rPr>
-                <w:b w:val="0"/>
-                <w:sz w:val="18"/>
-              </w:rPr>
-              <w:t>Everest11 sp. z o.o. oraz operator (nazwa, NIP, adres), miejscowość i data podpisania przed złożeniem poprawionego wniosku.</w:t>
-            </w:r>
-          </w:p>
-        </w:tc>
-        <w:tc>
-          <w:tcPr>
-            <w:tcW w:type="dxa" w:w="3061"/>
-          </w:tcPr>
-          <w:p>
-            <w:r/>
-            <w:r>
-              <w:rPr>
-                <w:b w:val="0"/>
-                <w:sz w:val="18"/>
-              </w:rPr>
-              <w:t>Wiarygodność i aktualność dokumentu.</w:t>
-            </w:r>
-          </w:p>
-        </w:tc>
-      </w:tr>
-      <w:tr>
-        <w:tc>
-          <w:tcPr>
-            <w:tcW w:type="dxa" w:w="2041"/>
-          </w:tcPr>
-          <w:p>
-            <w:r/>
-            <w:r>
-              <w:rPr>
-                <w:b w:val="0"/>
-                <w:sz w:val="18"/>
-              </w:rPr>
-              <w:t>2. Charakter listu</w:t>
-            </w:r>
-          </w:p>
-        </w:tc>
-        <w:tc>
-          <w:tcPr>
-            <w:tcW w:type="dxa" w:w="4649"/>
-          </w:tcPr>
-          <w:p>
-            <w:r/>
-            <w:r>
-              <w:rPr>
-                <w:b w:val="0"/>
-                <w:sz w:val="18"/>
-              </w:rPr>
-              <w:t>Zamiar zakupu systemu po zakończeniu prac B+R i certyfikacji CE. Zapis, że list nie jest umową przedwstępną, ale strony zamierzają negocjować umowę wdrożeniową w ciągu 3 miesięcy od certyfikacji.</w:t>
-            </w:r>
-          </w:p>
-        </w:tc>
-        <w:tc>
-          <w:tcPr>
-            <w:tcW w:type="dxa" w:w="3061"/>
-          </w:tcPr>
-          <w:p>
-            <w:r/>
-            <w:r>
-              <w:rPr>
-                <w:b w:val="0"/>
-                <w:sz w:val="18"/>
-              </w:rPr>
-              <w:t>Daje konkretny plan, bez ryzyka prawnego.</w:t>
-            </w:r>
-          </w:p>
-        </w:tc>
-      </w:tr>
-      <w:tr>
-        <w:tc>
-          <w:tcPr>
-            <w:tcW w:type="dxa" w:w="2041"/>
-          </w:tcPr>
-          <w:p>
-            <w:r/>
-            <w:r>
-              <w:rPr>
-                <w:b w:val="0"/>
-                <w:sz w:val="18"/>
-              </w:rPr>
-              <w:t>3. Profil operatora na 31.12.2025</w:t>
-            </w:r>
-          </w:p>
-        </w:tc>
-        <w:tc>
-          <w:tcPr>
-            <w:tcW w:type="dxa" w:w="4649"/>
-          </w:tcPr>
-          <w:p>
-            <w:r/>
-            <w:r>
-              <w:rPr>
-                <w:b w:val="0"/>
-                <w:sz w:val="18"/>
-              </w:rPr>
-              <w:t>Liczba ciągników i naczep, typy nadwozi (kurtyna, furgon, izoterma), wiek naczep, trasy (udział PL-UE), roczna liczba kursów, udział ładunków wrażliwych.</w:t>
-            </w:r>
-          </w:p>
-        </w:tc>
-        <w:tc>
-          <w:tcPr>
-            <w:tcW w:type="dxa" w:w="3061"/>
-          </w:tcPr>
-          <w:p>
-            <w:r/>
-            <w:r>
-              <w:rPr>
-                <w:b w:val="0"/>
-                <w:sz w:val="18"/>
-              </w:rPr>
-              <w:t>Potwierdza, że operator mieści się w SAM i SOM (floty 5-50 naczep, nadwozia nadające się do retrofit).</w:t>
-            </w:r>
-          </w:p>
-        </w:tc>
-      </w:tr>
-      <w:tr>
-        <w:tc>
-          <w:tcPr>
-            <w:tcW w:type="dxa" w:w="2041"/>
-          </w:tcPr>
-          <w:p>
-            <w:r/>
-            <w:r>
-              <w:rPr>
-                <w:b w:val="0"/>
-                <w:sz w:val="18"/>
-              </w:rPr>
-              <w:t>4. Zakres zainteresowania</w:t>
-            </w:r>
-          </w:p>
-        </w:tc>
-        <w:tc>
-          <w:tcPr>
-            <w:tcW w:type="dxa" w:w="4649"/>
-          </w:tcPr>
-          <w:p>
-            <w:r/>
-            <w:r>
-              <w:rPr>
-                <w:b w:val="0"/>
-                <w:sz w:val="18"/>
-              </w:rPr>
-              <w:t>Liczba naczep do wyposażenia w 2030 r. (łącznie trzy listy: 50) oraz opcja kolejnych naczep w 2031 r.</w:t>
-            </w:r>
-          </w:p>
-        </w:tc>
-        <w:tc>
-          <w:tcPr>
-            <w:tcW w:type="dxa" w:w="3061"/>
-          </w:tcPr>
-          <w:p>
-            <w:r/>
-            <w:r>
-              <w:rPr>
-                <w:b w:val="0"/>
-                <w:sz w:val="18"/>
-              </w:rPr>
-              <w:t>Pokrywa próg 50 pojazdów w 2030 r. i wyjaśnia pochodzenie liczby.</w:t>
-            </w:r>
-          </w:p>
-        </w:tc>
-      </w:tr>
-      <w:tr>
-        <w:tc>
-          <w:tcPr>
-            <w:tcW w:type="dxa" w:w="2041"/>
-          </w:tcPr>
-          <w:p>
-            <w:r/>
-            <w:r>
-              <w:rPr>
-                <w:b w:val="0"/>
-                <w:sz w:val="18"/>
-              </w:rPr>
-              <w:t>5. Warunki cenowe</w:t>
-            </w:r>
-          </w:p>
-        </w:tc>
-        <w:tc>
-          <w:tcPr>
-            <w:tcW w:type="dxa" w:w="4649"/>
-          </w:tcPr>
-          <w:p>
-            <w:r/>
-            <w:r>
-              <w:rPr>
-                <w:b w:val="0"/>
-                <w:sz w:val="18"/>
-              </w:rPr>
-              <w:t>Odniesienie do cen orientacyjnych: subskrypcja 349 PLN za pojazd miesięcznie, zestaw średnio 7 500 PLN za naczepę, licencja API 4 800 PLN rocznie, ceny netto, ważne do ustalonej daty. Oświadczenie operatora, że poziom cen jest dla niego akceptowalny, albo wskazanie maksymalnej ceny.</w:t>
-            </w:r>
-          </w:p>
-        </w:tc>
-        <w:tc>
-          <w:tcPr>
-            <w:tcW w:type="dxa" w:w="3061"/>
-          </w:tcPr>
-          <w:p>
-            <w:r/>
-            <w:r>
-              <w:rPr>
-                <w:b w:val="0"/>
-                <w:sz w:val="18"/>
-              </w:rPr>
-              <w:t>Gotowość płatnicza (K2-06), uzasadnienie cen.</w:t>
-            </w:r>
-          </w:p>
-        </w:tc>
-      </w:tr>
-      <w:tr>
-        <w:tc>
-          <w:tcPr>
-            <w:tcW w:type="dxa" w:w="2041"/>
-          </w:tcPr>
-          <w:p>
-            <w:r/>
-            <w:r>
-              <w:rPr>
-                <w:b w:val="0"/>
-                <w:sz w:val="18"/>
-              </w:rPr>
-              <w:t>6. Kryteria zakupu</w:t>
-            </w:r>
-          </w:p>
-        </w:tc>
-        <w:tc>
-          <w:tcPr>
-            <w:tcW w:type="dxa" w:w="4649"/>
-          </w:tcPr>
-          <w:p>
-            <w:r/>
-            <w:r>
-              <w:rPr>
-                <w:b w:val="0"/>
-                <w:sz w:val="18"/>
-              </w:rPr>
-              <w:t>Parametry, po których osiągnięciu operator kupi: alert lokalny w czasie nie dłuższym niż 1 s, czas Proof of Condition nie dłuższy niż 30 s, AUC-ROC nie mniejsze niż 0,82 po kompresji, integracja z TMS operatora (nazwa systemu), zgodność z RODO dla kamer.</w:t>
-            </w:r>
-          </w:p>
-        </w:tc>
-        <w:tc>
-          <w:tcPr>
-            <w:tcW w:type="dxa" w:w="3061"/>
-          </w:tcPr>
-          <w:p>
-            <w:r/>
-            <w:r>
-              <w:rPr>
-                <w:b w:val="0"/>
-                <w:sz w:val="18"/>
-              </w:rPr>
-              <w:t>Łączy list z wskaźnikami innowacyjności i z wymaganiami odbiorców (K2-11).</w:t>
-            </w:r>
-          </w:p>
-        </w:tc>
-      </w:tr>
-      <w:tr>
-        <w:tc>
-          <w:tcPr>
-            <w:tcW w:type="dxa" w:w="2041"/>
-          </w:tcPr>
-          <w:p>
-            <w:r/>
-            <w:r>
-              <w:rPr>
-                <w:b w:val="0"/>
-                <w:sz w:val="18"/>
-              </w:rPr>
-              <w:t>7. Dane o szkodach z ostatnich 12 miesięcy</w:t>
-            </w:r>
-          </w:p>
-        </w:tc>
-        <w:tc>
-          <w:tcPr>
-            <w:tcW w:type="dxa" w:w="4649"/>
-          </w:tcPr>
-          <w:p>
-            <w:r/>
-            <w:r>
-              <w:rPr>
-                <w:b w:val="0"/>
-                <w:sz w:val="18"/>
-              </w:rPr>
-              <w:t>Liczba roszczeń za uszkodzenie ładunku, ich wartość i średnia wartość, odsetek roszczeń bez skutecznej obrony, roczna składka ubezpieczenia cargo lub OC przewoźnika.</w:t>
-            </w:r>
-          </w:p>
-        </w:tc>
-        <w:tc>
-          <w:tcPr>
-            <w:tcW w:type="dxa" w:w="3061"/>
-          </w:tcPr>
-          <w:p>
-            <w:r/>
-            <w:r>
-              <w:rPr>
-                <w:b w:val="0"/>
-                <w:sz w:val="18"/>
-              </w:rPr>
-              <w:t>Pozwala policzyć wartość systemu dla klienta zamiast powoływać się na średnie z badań (K2-14).</w:t>
-            </w:r>
-          </w:p>
-        </w:tc>
-      </w:tr>
-      <w:tr>
-        <w:tc>
-          <w:tcPr>
-            <w:tcW w:type="dxa" w:w="2041"/>
-          </w:tcPr>
-          <w:p>
-            <w:r/>
-            <w:r>
-              <w:rPr>
-                <w:b w:val="0"/>
-                <w:sz w:val="18"/>
-              </w:rPr>
-              <w:t>8. Współpraca w projekcie</w:t>
-            </w:r>
-          </w:p>
-        </w:tc>
-        <w:tc>
-          <w:tcPr>
-            <w:tcW w:type="dxa" w:w="4649"/>
-          </w:tcPr>
-          <w:p>
-            <w:r/>
-            <w:r>
-              <w:rPr>
-                <w:b w:val="0"/>
-                <w:sz w:val="18"/>
-              </w:rPr>
-              <w:t>Udział w co najmniej 2 warsztatach wymagań w okresie realizacji, przekazanie opisu typowych zdarzeń w przewozie. Bez deklaracji udostępnienia pojazdów, bo flota testowa Z9 jest rozliczana osobno.</w:t>
-            </w:r>
-          </w:p>
-        </w:tc>
-        <w:tc>
-          <w:tcPr>
-            <w:tcW w:type="dxa" w:w="3061"/>
-          </w:tcPr>
-          <w:p>
-            <w:r/>
-            <w:r>
-              <w:rPr>
-                <w:b w:val="0"/>
-                <w:sz w:val="18"/>
-              </w:rPr>
-              <w:t>Pokazuje udział odbiorców w kształtowaniu produktu i nie koliduje z flotą testową.</w:t>
-            </w:r>
-          </w:p>
-        </w:tc>
-      </w:tr>
-      <w:tr>
-        <w:tc>
-          <w:tcPr>
-            <w:tcW w:type="dxa" w:w="2041"/>
-          </w:tcPr>
-          <w:p>
-            <w:r/>
-            <w:r>
-              <w:rPr>
-                <w:b w:val="0"/>
-                <w:sz w:val="18"/>
-              </w:rPr>
-              <w:t>9. Ważność i warunki</w:t>
-            </w:r>
-          </w:p>
-        </w:tc>
-        <w:tc>
-          <w:tcPr>
-            <w:tcW w:type="dxa" w:w="4649"/>
-          </w:tcPr>
-          <w:p>
-            <w:r/>
-            <w:r>
-              <w:rPr>
-                <w:b w:val="0"/>
-                <w:sz w:val="18"/>
-              </w:rPr>
-              <w:t>List ważny do 31.12.2030, bez wyłączności, z klauzulą poufności i zgodą na wskazanie operatora z nazwy we wniosku.</w:t>
-            </w:r>
-          </w:p>
-        </w:tc>
-        <w:tc>
-          <w:tcPr>
-            <w:tcW w:type="dxa" w:w="3061"/>
-          </w:tcPr>
-          <w:p>
-            <w:r/>
-            <w:r>
-              <w:rPr>
-                <w:b w:val="0"/>
-                <w:sz w:val="18"/>
-              </w:rPr>
-              <w:t>Porządek formalny.</w:t>
-            </w:r>
-          </w:p>
-        </w:tc>
-      </w:tr>
-      <w:tr>
-        <w:tc>
-          <w:tcPr>
-            <w:tcW w:type="dxa" w:w="2041"/>
-          </w:tcPr>
-          <w:p>
-            <w:r/>
-            <w:r>
-              <w:rPr>
-                <w:b w:val="0"/>
-                <w:sz w:val="18"/>
-              </w:rPr>
-              <w:t>10. Podpisy</w:t>
-            </w:r>
-          </w:p>
-        </w:tc>
-        <w:tc>
-          <w:tcPr>
-            <w:tcW w:type="dxa" w:w="4649"/>
-          </w:tcPr>
-          <w:p>
-            <w:r/>
-            <w:r>
-              <w:rPr>
-                <w:b w:val="0"/>
-                <w:sz w:val="18"/>
-              </w:rPr>
-              <w:t>Osoby uprawnione do reprezentacji obu stron, zgodnie z KRS.</w:t>
-            </w:r>
-          </w:p>
-        </w:tc>
-        <w:tc>
-          <w:tcPr>
-            <w:tcW w:type="dxa" w:w="3061"/>
-          </w:tcPr>
-          <w:p>
-            <w:r/>
-            <w:r>
-              <w:rPr>
-                <w:b w:val="0"/>
-                <w:sz w:val="18"/>
-              </w:rPr>
-              <w:t>Ważność.</w:t>
-            </w:r>
-          </w:p>
-        </w:tc>
-      </w:tr>
-    </w:tbl>
-    <w:p/>
-    <w:p>
-      <w:pPr>
-        <w:pStyle w:val="Heading1"/>
-      </w:pPr>
-      <w:r>
-        <w:t>Aneks C. Struktura bazy ponad 50 kontrahentów i karta rozmowy</w:t>
-      </w:r>
-    </w:p>
-    <w:p>
-      <w:pPr>
-        <w:spacing w:after="60"/>
-      </w:pPr>
-      <w:r>
-        <w:rPr>
-          <w:b w:val="0"/>
-        </w:rPr>
-        <w:t>Do opisu w pkt 1.3 i 2.1 proponuję jedną tabelę z bazy klientów (CRM) według tych samych kryteriów co SAM i SOM. Liczby wpisuje Everest11. Do tekstu trafiają tylko sumy.</w:t>
-      </w:r>
-    </w:p>
-    <w:tbl>
-      <w:tblPr>
-        <w:tblStyle w:val="TableGrid"/>
-        <w:tblW w:type="auto" w:w="0"/>
-        <w:tblLook w:firstColumn="1" w:firstRow="1" w:lastColumn="0" w:lastRow="0" w:noHBand="0" w:noVBand="1" w:val="04A0"/>
-      </w:tblPr>
-      <w:tblGrid>
-        <w:gridCol w:w="3213"/>
-        <w:gridCol w:w="3213"/>
-        <w:gridCol w:w="3213"/>
-      </w:tblGrid>
-      <w:tr>
-        <w:tc>
-          <w:tcPr>
-            <w:tcW w:type="dxa" w:w="1814"/>
-          </w:tcPr>
-          <w:p>
-            <w:r/>
-            <w:r>
-              <w:rPr>
-                <w:b/>
-                <w:sz w:val="18"/>
-              </w:rPr>
-              <w:t>Wymiar</w:t>
-            </w:r>
-          </w:p>
-        </w:tc>
-        <w:tc>
-          <w:tcPr>
-            <w:tcW w:type="dxa" w:w="4309"/>
-          </w:tcPr>
-          <w:p>
-            <w:r/>
-            <w:r>
-              <w:rPr>
-                <w:b/>
-                <w:sz w:val="18"/>
-              </w:rPr>
-              <w:t>Podział</w:t>
-            </w:r>
-          </w:p>
-        </w:tc>
-        <w:tc>
-          <w:tcPr>
-            <w:tcW w:type="dxa" w:w="3628"/>
-          </w:tcPr>
-          <w:p>
-            <w:r/>
-            <w:r>
-              <w:rPr>
-                <w:b/>
-                <w:sz w:val="18"/>
-              </w:rPr>
-              <w:t>Wynik do tekstu</w:t>
-            </w:r>
-          </w:p>
-        </w:tc>
-      </w:tr>
-      <w:tr>
-        <w:tc>
-          <w:tcPr>
-            <w:tcW w:type="dxa" w:w="1814"/>
-          </w:tcPr>
-          <w:p>
-            <w:r/>
-            <w:r>
-              <w:rPr>
-                <w:b w:val="0"/>
-                <w:sz w:val="18"/>
-              </w:rPr>
-              <w:t>Rola klienta</w:t>
-            </w:r>
-          </w:p>
-        </w:tc>
-        <w:tc>
-          <w:tcPr>
-            <w:tcW w:type="dxa" w:w="4309"/>
-          </w:tcPr>
-          <w:p>
-            <w:r/>
-            <w:r>
-              <w:rPr>
-                <w:b w:val="0"/>
-                <w:sz w:val="18"/>
-              </w:rPr>
-              <w:t>przewoźnik z własnymi naczepami; przewoźnik tylko podwykonawca; załadowca; spedytor bez taboru</w:t>
-            </w:r>
-          </w:p>
-        </w:tc>
-        <w:tc>
-          <w:tcPr>
-            <w:tcW w:type="dxa" w:w="3628"/>
-          </w:tcPr>
-          <w:p>
-            <w:r/>
-            <w:r>
-              <w:rPr>
-                <w:b w:val="0"/>
-                <w:sz w:val="18"/>
-              </w:rPr>
-              <w:t>liczba klientów w każdej grupie</w:t>
-            </w:r>
-          </w:p>
-        </w:tc>
-      </w:tr>
-      <w:tr>
-        <w:tc>
-          <w:tcPr>
-            <w:tcW w:type="dxa" w:w="1814"/>
-          </w:tcPr>
-          <w:p>
-            <w:r/>
-            <w:r>
-              <w:rPr>
-                <w:b w:val="0"/>
-                <w:sz w:val="18"/>
-              </w:rPr>
-              <w:t>Flota naczep</w:t>
-            </w:r>
-          </w:p>
-        </w:tc>
-        <w:tc>
-          <w:tcPr>
-            <w:tcW w:type="dxa" w:w="4309"/>
-          </w:tcPr>
-          <w:p>
-            <w:r/>
-            <w:r>
-              <w:rPr>
-                <w:b w:val="0"/>
-                <w:sz w:val="18"/>
-              </w:rPr>
-              <w:t>1-4; 5-19; 20-50; powyżej 50</w:t>
-            </w:r>
-          </w:p>
-        </w:tc>
-        <w:tc>
-          <w:tcPr>
-            <w:tcW w:type="dxa" w:w="3628"/>
-          </w:tcPr>
-          <w:p>
-            <w:r/>
-            <w:r>
-              <w:rPr>
-                <w:b w:val="0"/>
-                <w:sz w:val="18"/>
-              </w:rPr>
-              <w:t>liczba firm i łączna liczba naczep, osobno suma dla firm z flotą 5-50 (SOM)</w:t>
-            </w:r>
-          </w:p>
-        </w:tc>
-      </w:tr>
-      <w:tr>
-        <w:tc>
-          <w:tcPr>
-            <w:tcW w:type="dxa" w:w="1814"/>
-          </w:tcPr>
-          <w:p>
-            <w:r/>
-            <w:r>
-              <w:rPr>
-                <w:b w:val="0"/>
-                <w:sz w:val="18"/>
-              </w:rPr>
-              <w:t>Typ nadwozia</w:t>
-            </w:r>
-          </w:p>
-        </w:tc>
-        <w:tc>
-          <w:tcPr>
-            <w:tcW w:type="dxa" w:w="4309"/>
-          </w:tcPr>
-          <w:p>
-            <w:r/>
-            <w:r>
-              <w:rPr>
-                <w:b w:val="0"/>
-                <w:sz w:val="18"/>
-              </w:rPr>
-              <w:t>kurtyna; furgon; izoterma lub chłodnia; inne</w:t>
-            </w:r>
-          </w:p>
-        </w:tc>
-        <w:tc>
-          <w:tcPr>
-            <w:tcW w:type="dxa" w:w="3628"/>
-          </w:tcPr>
-          <w:p>
-            <w:r/>
-            <w:r>
-              <w:rPr>
-                <w:b w:val="0"/>
-                <w:sz w:val="18"/>
-              </w:rPr>
-              <w:t>liczba naczep nadających się do retrofit</w:t>
-            </w:r>
-          </w:p>
-        </w:tc>
-      </w:tr>
-      <w:tr>
-        <w:tc>
-          <w:tcPr>
-            <w:tcW w:type="dxa" w:w="1814"/>
-          </w:tcPr>
-          <w:p>
-            <w:r/>
-            <w:r>
-              <w:rPr>
-                <w:b w:val="0"/>
-                <w:sz w:val="18"/>
-              </w:rPr>
-              <w:t>Trasy i ładunki</w:t>
-            </w:r>
-          </w:p>
-        </w:tc>
-        <w:tc>
-          <w:tcPr>
-            <w:tcW w:type="dxa" w:w="4309"/>
-          </w:tcPr>
-          <w:p>
-            <w:r/>
-            <w:r>
-              <w:rPr>
-                <w:b w:val="0"/>
-                <w:sz w:val="18"/>
-              </w:rPr>
-              <w:t>udział przewozów PL-UE; ładunki wrażliwe (kruche, temperaturowe)</w:t>
-            </w:r>
-          </w:p>
-        </w:tc>
-        <w:tc>
-          <w:tcPr>
-            <w:tcW w:type="dxa" w:w="3628"/>
-          </w:tcPr>
-          <w:p>
-            <w:r/>
-            <w:r>
-              <w:rPr>
-                <w:b w:val="0"/>
-                <w:sz w:val="18"/>
-              </w:rPr>
-              <w:t>liczba firm z przewozami PL-UE i ładunkami wrażliwymi</w:t>
-            </w:r>
-          </w:p>
-        </w:tc>
-      </w:tr>
-      <w:tr>
-        <w:tc>
-          <w:tcPr>
-            <w:tcW w:type="dxa" w:w="1814"/>
-          </w:tcPr>
-          <w:p>
-            <w:r/>
-            <w:r>
-              <w:rPr>
-                <w:b w:val="0"/>
-                <w:sz w:val="18"/>
-              </w:rPr>
-              <w:t>Współpraca</w:t>
-            </w:r>
-          </w:p>
-        </w:tc>
-        <w:tc>
-          <w:tcPr>
-            <w:tcW w:type="dxa" w:w="4309"/>
-          </w:tcPr>
-          <w:p>
-            <w:r/>
-            <w:r>
-              <w:rPr>
-                <w:b w:val="0"/>
-                <w:sz w:val="18"/>
-              </w:rPr>
-              <w:t>lata współpracy, roczna liczba zleceń od Everest11</w:t>
-            </w:r>
-          </w:p>
-        </w:tc>
-        <w:tc>
-          <w:tcPr>
-            <w:tcW w:type="dxa" w:w="3628"/>
-          </w:tcPr>
-          <w:p>
-            <w:r/>
-            <w:r>
-              <w:rPr>
-                <w:b w:val="0"/>
-                <w:sz w:val="18"/>
-              </w:rPr>
-              <w:t>liczba klientów współpracujących od co najmniej 2 lat</w:t>
-            </w:r>
-          </w:p>
-        </w:tc>
-      </w:tr>
-    </w:tbl>
-    <w:p/>
-    <w:p>
-      <w:pPr>
-        <w:spacing w:after="60"/>
-      </w:pPr>
-      <w:r>
-        <w:rPr>
-          <w:b w:val="0"/>
-        </w:rPr>
-        <w:t>Karta rozmowy z klientem, wypełniona dla każdej z 15 rozmów, pozwoli podać wyniki w tekście 1.3: ilu rozmówców zainteresowało się systemem, ile naczep chciałoby wyposażyć, jakie wymagania wskazywali najczęściej i jaką cenę uznali za akceptowalną.</w:t>
-      </w:r>
-    </w:p>
-    <w:tbl>
-      <w:tblPr>
-        <w:tblStyle w:val="TableGrid"/>
-        <w:tblW w:type="auto" w:w="0"/>
-        <w:tblLook w:firstColumn="1" w:firstRow="1" w:lastColumn="0" w:lastRow="0" w:noHBand="0" w:noVBand="1" w:val="04A0"/>
-      </w:tblPr>
-      <w:tblGrid>
-        <w:gridCol w:w="4819"/>
-        <w:gridCol w:w="4819"/>
-      </w:tblGrid>
-      <w:tr>
-        <w:tc>
-          <w:tcPr>
-            <w:tcW w:type="dxa" w:w="5669"/>
-          </w:tcPr>
-          <w:p>
-            <w:r/>
-            <w:r>
-              <w:rPr>
-                <w:b/>
-                <w:sz w:val="18"/>
-              </w:rPr>
-              <w:t>Pytanie</w:t>
-            </w:r>
-          </w:p>
-        </w:tc>
-        <w:tc>
-          <w:tcPr>
-            <w:tcW w:type="dxa" w:w="4082"/>
-          </w:tcPr>
-          <w:p>
-            <w:r/>
-            <w:r>
-              <w:rPr>
-                <w:b/>
-                <w:sz w:val="18"/>
-              </w:rPr>
-              <w:t>Odpowiedź</w:t>
-            </w:r>
-          </w:p>
-        </w:tc>
-      </w:tr>
-      <w:tr>
-        <w:tc>
-          <w:tcPr>
-            <w:tcW w:type="dxa" w:w="5669"/>
-          </w:tcPr>
-          <w:p>
-            <w:r/>
-            <w:r>
-              <w:rPr>
-                <w:b w:val="0"/>
-                <w:sz w:val="18"/>
-              </w:rPr>
-              <w:t>Data rozmowy, firma, rola rozmówcy, liczba naczep i ich typy</w:t>
-            </w:r>
-          </w:p>
-        </w:tc>
-        <w:tc>
-          <w:tcPr>
-            <w:tcW w:type="dxa" w:w="4082"/>
-          </w:tcPr>
-          <w:p>
-            <w:r/>
-          </w:p>
-        </w:tc>
-      </w:tr>
-      <w:tr>
-        <w:tc>
-          <w:tcPr>
-            <w:tcW w:type="dxa" w:w="5669"/>
-          </w:tcPr>
-          <w:p>
-            <w:r/>
-            <w:r>
-              <w:rPr>
-                <w:b w:val="0"/>
-                <w:sz w:val="18"/>
-              </w:rPr>
-              <w:t>Czy firma miała w ostatnich 12 miesiącach roszczenia za uszkodzenie ładunku (liczba, wartość)?</w:t>
-            </w:r>
-          </w:p>
-        </w:tc>
-        <w:tc>
-          <w:tcPr>
-            <w:tcW w:type="dxa" w:w="4082"/>
-          </w:tcPr>
-          <w:p>
-            <w:r/>
-          </w:p>
-        </w:tc>
-      </w:tr>
-      <w:tr>
-        <w:tc>
-          <w:tcPr>
-            <w:tcW w:type="dxa" w:w="5669"/>
-          </w:tcPr>
-          <w:p>
-            <w:r/>
-            <w:r>
-              <w:rPr>
-                <w:b w:val="0"/>
-                <w:sz w:val="18"/>
-              </w:rPr>
-              <w:t>Jak dziś dokumentuje stan ładunku przy załadunku i rozładunku, ile to trwa?</w:t>
-            </w:r>
-          </w:p>
-        </w:tc>
-        <w:tc>
-          <w:tcPr>
-            <w:tcW w:type="dxa" w:w="4082"/>
-          </w:tcPr>
-          <w:p>
-            <w:r/>
-          </w:p>
-        </w:tc>
-      </w:tr>
-      <w:tr>
-        <w:tc>
-          <w:tcPr>
-            <w:tcW w:type="dxa" w:w="5669"/>
-          </w:tcPr>
-          <w:p>
-            <w:r/>
-            <w:r>
-              <w:rPr>
-                <w:b w:val="0"/>
-                <w:sz w:val="18"/>
-              </w:rPr>
-              <w:t>Które funkcje są najważniejsze (model 3D, alert, ocena zabezpieczeń, dokument eFTI)?</w:t>
-            </w:r>
-          </w:p>
-        </w:tc>
-        <w:tc>
-          <w:tcPr>
-            <w:tcW w:type="dxa" w:w="4082"/>
-          </w:tcPr>
-          <w:p>
-            <w:r/>
-          </w:p>
-        </w:tc>
-      </w:tr>
-      <w:tr>
-        <w:tc>
-          <w:tcPr>
-            <w:tcW w:type="dxa" w:w="5669"/>
-          </w:tcPr>
-          <w:p>
-            <w:r/>
-            <w:r>
-              <w:rPr>
-                <w:b w:val="0"/>
-                <w:sz w:val="18"/>
-              </w:rPr>
-              <w:t>Jaka forma płatności i jaka cena jest akceptowalna (abonament, zestaw, licencja API)?</w:t>
-            </w:r>
-          </w:p>
-        </w:tc>
-        <w:tc>
-          <w:tcPr>
-            <w:tcW w:type="dxa" w:w="4082"/>
-          </w:tcPr>
-          <w:p>
-            <w:r/>
-          </w:p>
-        </w:tc>
-      </w:tr>
-      <w:tr>
-        <w:tc>
-          <w:tcPr>
-            <w:tcW w:type="dxa" w:w="5669"/>
-          </w:tcPr>
-          <w:p>
-            <w:r/>
-            <w:r>
-              <w:rPr>
-                <w:b w:val="0"/>
-                <w:sz w:val="18"/>
-              </w:rPr>
-              <w:t>Ile naczep zechciałaby wyposażyć w 2030 r. i pod jakimi warunkami?</w:t>
-            </w:r>
-          </w:p>
-        </w:tc>
-        <w:tc>
-          <w:tcPr>
-            <w:tcW w:type="dxa" w:w="4082"/>
-          </w:tcPr>
-          <w:p>
-            <w:r/>
-          </w:p>
-        </w:tc>
-      </w:tr>
-    </w:tbl>
-    <w:p/>
     <w:sectPr>
       <w:pgSz w:w="11906" w:h="16838"/>
       <w:pgMar w:top="1134" w:right="1134" w:bottom="1134" w:left="1134" w:header="720" w:footer="720" w:gutter="0"/>

</xml_diff>

<commit_message>
Pełne zdania i czas przyszły w sekcjach 1.3, 1.4, 2.2, 2.3, 2.5, 6.1, 6.2-6.4, 7.1-7.4
Co-Authored-By: Claude Sonnet 5.5 <noreply@anthropic.com>
Claude-Session: https://claude.ai/code/session_01672WnJhixnEcarbb7uiwfx
</commit_message>
<xml_diff>
--- a/Sekcja_1.3_i_ceny.docx
+++ b/Sekcja_1.3_i_ceny.docx
@@ -581,7 +581,7 @@
           <w:color w:val="666666"/>
           <w:sz w:val="17"/>
         </w:rPr>
-        <w:t xml:space="preserve"> [8710 znaków]</w:t>
+        <w:t xml:space="preserve"> [9049 znaków]</w:t>
       </w:r>
     </w:p>
     <w:p>
@@ -635,7 +635,7 @@
         <w:rPr>
           <w:b w:val="0"/>
         </w:rPr>
-        <w:t>Potrzeba 1: obiektywny obraz stanu ładunku w trasie. Systemy telematyczne dają przede wszystkim lokalizację i alerty progowe, a rozwiązania z kamerą lub czujnikiem wolumetrycznym w naczepie (SkyCamera, kamera przestrzeni ładunkowej TrailerConnect) pokazują obraz albo zajętość kubatury w wybranych chwilach. Według dostępnej dokumentacji żaden nie podaje położenia jednostek ładunkowych w jadącej naczepie. Tive (State of Visibility, 2023) podaje, że 77% zleceniodawców uznaje widoczność fizycznego stanu ładunku w czasie rzeczywistym za wymóg, a tylko 25% osiągnęło ten poziom.</w:t>
+        <w:t>Pierwszą potrzebą odbiorców jest obiektywny obraz stanu ładunku w trasie, bo systemy telematyczne dają przede wszystkim lokalizację i alerty progowe, a rozwiązania z kamerą lub czujnikiem wolumetrycznym w naczepie (SkyCamera, kamera przestrzeni ładunkowej TrailerConnect) pokazują obraz albo zajętość kubatury w wybranych chwilach. Według dostępnej dokumentacji żaden nie podaje położenia jednostek ładunkowych w jadącej naczepie. Tive (State of Visibility, 2023) podaje, że 77% zleceniodawców uznaje widoczność fizycznego stanu ładunku w czasie rzeczywistym za wymóg, a tylko 25% osiągnęło ten poziom.</w:t>
       </w:r>
     </w:p>
     <w:p>
@@ -643,7 +643,7 @@
         <w:rPr>
           <w:b w:val="0"/>
         </w:rPr>
-        <w:t>Potrzeba 2: dowód stanu ładunku przy roszczeniach. Według Flock Freight i Drive Research (n=200, 2023) 86% przewoźników LTL miało w ciągu 12 miesięcy roszczenia za uszkodzenie ładunku, a pokryli średnio 66% zgłoszonych wartości. Bariera obrony to brak obiektywnego, opatrzonego czasem dowodu stanu ładunku przy załadunku i rozładunku. CargoDT generuje go automatycznie jako Proof of Loading i Proof of Condition.</w:t>
+        <w:t>Drugą potrzebą jest dowód stanu ładunku przy roszczeniach. Według Flock Freight i Drive Research (n=200, 2023) 86% przewoźników LTL miało w ciągu 12 miesięcy roszczenia za uszkodzenie ładunku, a pokryli średnio 66% zgłoszonych wartości. Bariera obrony to brak obiektywnego, opatrzonego czasem dowodu stanu ładunku przy załadunku i rozładunku. CargoDT będzie go generował automatycznie jako Proof of Loading i Proof of Condition.</w:t>
       </w:r>
     </w:p>
     <w:p>
@@ -651,7 +651,7 @@
         <w:rPr>
           <w:b w:val="0"/>
         </w:rPr>
-        <w:t>Potrzeba 3: szybsza i cyfrowa dokumentacja. Od 21.08.2025 organy państw UE muszą przyjmować informacje w formacie eFTI (rozporządzenie UE 2020/1056). Stosowanie eFTI jest dla przewoźników dobrowolne, ale daje dokument uznawany w całej UE. Według badania PITD 6 na 10 logistyków wypełnia dokumenty ręcznie, a prawie połowa kierowców czeka na CMR od 15 do 30 minut.</w:t>
+        <w:t>Trzecią potrzebą jest szybsza i cyfrowa dokumentacja. Od 21.08.2025 organy państw UE muszą przyjmować informacje w formacie eFTI (rozporządzenie UE 2020/1056). Stosowanie eFTI jest dla przewoźników dobrowolne, ale daje dokument uznawany w całej UE. Według badania PITD 6 na 10 logistyków wypełnia dokumenty ręcznie, a prawie połowa kierowców czeka na CMR od 15 do 30 minut.</w:t>
       </w:r>
     </w:p>
     <w:p>
@@ -659,7 +659,7 @@
         <w:rPr>
           <w:b w:val="0"/>
         </w:rPr>
-        <w:t>Potrzeba 4: dane dla ubezpieczyciela. Straty cargo w UE wyniosły 549 mln EUR w 2023 r., o 438% więcej niż rok wcześniej (TAPA EMEA TIS, 2025). Ubezpieczyciele różnicują składki według poziomu monitoringu zgodnego z TAPA TSR. Everest11 prowadzi rozmowy z co najmniej jednym towarzystwem ubezpieczeniowym cargo w Polsce w sprawie partnerstwa generującego popyt wymuszony wymogami kontrahenta: ubezpieczyciel rekomenduje CargoDT jako warunek preferencyjnej składki.</w:t>
+        <w:t>Czwartą potrzebą są dane dla ubezpieczyciela. Straty cargo w UE wyniosły 549 mln EUR w 2023 r., o 438% więcej niż rok wcześniej (TAPA EMEA TIS, 2025). Ubezpieczyciele różnicują składki według poziomu monitoringu zgodnego z TAPA TSR. Everest11 prowadzi rozmowy z co najmniej jednym towarzystwem ubezpieczeniowym cargo w Polsce w sprawie partnerstwa generującego popyt wymuszony wymogami kontrahenta: ubezpieczyciel rekomenduje CargoDT jako warunek preferencyjnej składki.</w:t>
       </w:r>
     </w:p>
     <w:p>
@@ -678,7 +678,7 @@
         <w:rPr>
           <w:b w:val="0"/>
         </w:rPr>
-        <w:t>Zestaw w naczepie (kamery, radar, czujniki, jednostka z AI) i platforma SaaS pracują w całym procesie przewozowym. Dyspozytor wprowadza plan załadunku w TMS. Przy załadunku kierowca uruchamia inicjalizację, system porównuje rozmieszczenie ładunku z planem i ocenia zabezpieczenia, a po zamknięciu drzwi tworzy Proof of Loading. W trasie jednostka lokalnie śledzi położenie ładunku i ryzyko uszkodzenia, a kierowca słyszy alert bez udziału dyspozytora. Dyspozytor widzi model 3D i zdarzenia w TMS po odzyskaniu łączności. Przy rozładunku system porównuje stan ładunku z załadunkiem i tworzy Proof of Condition, który trafia do TMS, platformy eFTI i działu reklamacji. System zastępuje ręczną kontrolę i fotografowanie ładunku, automatyzuje dokumentację stanu ładunku, a decyzje o reakcji zostawia człowiekowi.</w:t>
+        <w:t>Zestaw w naczepie (kamery, radar, czujniki, jednostka z AI) i platforma SaaS będą pracować w całym procesie przewozowym. Dyspozytor wprowadzi plan załadunku w TMS. Przy załadunku kierowca uruchomi inicjalizację, system porówna rozmieszczenie ładunku z planem i oceni zabezpieczenia, a po zamknięciu drzwi utworzy Proof of Loading. W trasie jednostka będzie lokalnie śledzić położenie ładunku i ryzyko uszkodzenia, a kierowca usłyszy alert bez udziału dyspozytora. Dyspozytor zobaczy model 3D i zdarzenia w TMS po odzyskaniu łączności. Przy rozładunku system porówna stan ładunku z załadunkiem i utworzy Proof of Condition, który trafi do TMS, platformy eFTI i działu reklamacji. System zastąpi ręczną kontrolę i fotografowanie ładunku, zautomatyzuje dokumentację stanu ładunku, a decyzje o reakcji zostawi człowiekowi.</w:t>
       </w:r>
     </w:p>
     <w:p>
@@ -697,7 +697,7 @@
         <w:rPr>
           <w:b w:val="0"/>
         </w:rPr>
-        <w:t>Telematyka naczep (Schmitz Cargobull TrailerConnect, Krone Telematics, Nexxiot, Arviem, Tive, SkyBitz) obejmuje lokalizację, warunki i alerty progowe, a w części przypadków obraz lub zajętość przestrzeni ładunkowej. Według dostępnej dokumentacji żaden produkt nie łączy modelu 3D z położeniem ładunku w ruchu, predykcji ryzyka z klasą ładunku, wizyjnej oceny zabezpieczeń i dokumentu eFTI. Rozwiązania fabryczne są kierowane do nowych naczep, a retrofit w tej klasie funkcji nie jest oferowany. Ryzyko nowej konkurencji w ciągu 3-5 lat oceniamy jako umiarkowane. Bariery wejścia: jednoczesne rozwiązanie trzech problemów badawczych (Z4, Z5, Z8), model sprzedaży OEM sprzeczny z retrofit oraz zgłoszenie patentowe planowane w projekcie.</w:t>
+        <w:t>Telematyka naczep (Schmitz Cargobull TrailerConnect, Krone Telematics, Nexxiot, Arviem, Tive, SkyBitz) obejmuje lokalizację, warunki i alerty progowe, a w części przypadków obraz lub zajętość przestrzeni ładunkowej. Według dostępnej dokumentacji żaden produkt nie łączy modelu 3D z położeniem ładunku w ruchu, predykcji ryzyka z klasą ładunku, wizyjnej oceny zabezpieczeń i dokumentu eFTI. Rozwiązania fabryczne są kierowane do nowych naczep, a retrofit w tej klasie funkcji nie jest oferowany. Ryzyko nowej konkurencji w ciągu 3-5 lat oceniamy jako umiarkowane. Barierami wejścia będą jednoczesne rozwiązanie trzech problemów badawczych (Z4, Z5, Z8), model sprzedaży OEM sprzeczny z retrofit oraz zgłoszenie patentowe planowane w projekcie.</w:t>
       </w:r>
     </w:p>
     <w:p>
@@ -705,7 +705,7 @@
         <w:rPr>
           <w:b w:val="0"/>
         </w:rPr>
-        <w:t>Ceny konkurencji. Producenci nie publikują cenników i wyceniają na zapytanie. Orientacyjnie abonament oprogramowania SkyBitz zaczyna się od 30 do 75 USD za zasób miesięcznie, czyli około 114-285 PLN (Capterra, dostęp 02.10.2026, kurs NBP 3,803 PLN/USD). Subskrypcja CargoDT, 349 PLN za pojazd miesięcznie, jest wyższa niż abonament za samą telematykę. Wynika to z zakresu: model 3D, ocena zabezpieczeń, predykcja ryzyka i dokument eFTI nie wchodzą w skład tych abonamentów.</w:t>
+        <w:t>Producenci konkurencyjnych rozwiązań nie publikują cenników i wyceniają na zapytanie. Orientacyjnie abonament oprogramowania SkyBitz zaczyna się od 30 do 75 USD za zasób miesięcznie, czyli około 114-285 PLN (Capterra, dostęp 02.10.2026, kurs NBP 3,803 PLN/USD). Subskrypcja CargoDT, 349 PLN za pojazd miesięcznie, będzie wyższa niż abonament za samą telematykę. Wynika to z zakresu: model 3D, ocena zabezpieczeń, predykcja ryzyka i dokument eFTI nie wchodzą w skład tych abonamentów.</w:t>
       </w:r>
     </w:p>
     <w:p>
@@ -724,7 +724,7 @@
         <w:rPr>
           <w:b w:val="0"/>
         </w:rPr>
-        <w:t>Subskrypcja SaaS 349 PLN za pojazd miesięcznie, zestaw retrofit średnio 7 500 PLN za naczepę (sprzedaż z instalacją) i licencja API 4 800 PLN rocznie na klienta. Koszt komponentów zestawu w modelu finansowym wynosi 4 875 PLN, czyli 65% ceny, a pozostałe 35% pokrywa montaż, gwarancję i marżę. Subskrypcja pokrywa hosting (50 PLN za pojazd miesięcznie), łączność, utrzymanie modeli i wsparcie. Dla floty 10 naczep koszt klienta wynosi 12 168 PLN na naczepę w pierwszym roku i 4 668 PLN w kolejnych (4 188 PLN abonamentu i 480 PLN licencji API na naczepę).</w:t>
+        <w:t>Cennik CargoDT obejmie subskrypcję SaaS 349 PLN za pojazd miesięcznie, zestaw retrofit średnio 7 500 PLN za naczepę (sprzedaż z instalacją) i licencję API 4 800 PLN rocznie na klienta. Koszt komponentów zestawu w modelu finansowym wynosi 4 875 PLN, czyli 65% ceny, a pozostałe 35% pokrywa montaż, gwarancję i marżę. Subskrypcja pokryje hosting (50 PLN za pojazd miesięcznie), łączność, utrzymanie modeli i wsparcie. Dla floty 10 naczep koszt klienta wynosi 12 168 PLN na naczepę w pierwszym roku i 4 668 PLN w kolejnych (4 188 PLN abonamentu i 480 PLN licencji API na naczepę).</w:t>
       </w:r>
     </w:p>
     <w:p>
@@ -732,7 +732,7 @@
         <w:rPr>
           <w:b w:val="0"/>
         </w:rPr>
-        <w:t>Wartość dla klienta tworzą trzy czynniki. Roszczenia: odpowiedzialność przewoźnika według art. 23 CMR to 8,33 SDR za kg, czyli dla 200-500 kg od 1 666 do 4 165 SDR, a po kursie NBP z 04.09.2026 (5,0954 PLN) od 8 489 do 21 222 PLN. Jedno roszczenie na dolnej granicy odpowiada 24 miesiącom abonamentu jednej naczepy. Czas: dokumentacja skraca się z 15-30 minut do poniżej minuty na rozładunek, co zmniejsza postój kierowcy i koszt obsługi dokumentów. Składka: dane z trasy pozwalają ubezpieczycielowi różnicować składki, a rozmowy z ubezpieczycielem trwają. Rentowność klienta liczymy na danych flot wdrożeniowych w Z9.</w:t>
+        <w:t>Wartość dla klienta utworzą trzy czynniki. Pierwszym są roszczenia: odpowiedzialność przewoźnika według art. 23 CMR to 8,33 SDR za kg, czyli dla 200-500 kg od 1 666 do 4 165 SDR, a po kursie NBP z 04.09.2026 (5,0954 PLN) od 8 489 do 21 222 PLN. Jedno roszczenie na dolnej granicy odpowiada 24 miesiącom abonamentu jednej naczepy. Drugim jest czas: dokumentacja skróci się z 15-30 minut do poniżej minuty na rozładunek, co zmniejszy postój kierowcy i koszt obsługi dokumentów. Trzecim jest składka: dane z trasy pozwolą ubezpieczycielowi różnicować składki, a rozmowy z ubezpieczycielem trwają. Rentowność klienta Everest11 policzy na danych flot wdrożeniowych w Z9.</w:t>
       </w:r>
     </w:p>
     <w:p>
@@ -751,7 +751,7 @@
         <w:rPr>
           <w:b w:val="0"/>
         </w:rPr>
-        <w:t>Segment priorytetowy 2030-2031: floty od 5 do 50 naczep w przewozach ogólnotowarowych PL-UE. Kanałem jest baza ponad 50 aktywnych kontrahentów spedycyjnych Everest11, z którymi spółka prowadzi bieżącą współpracę. Pierwszy próg, 50 pojazdów u klientów zewnętrznych w 2030 r., pokrywają listy intencyjne trzech operatorów: Krajowe i Międzynarodowe Usługi Transportowe Hubert Lizak SZYK, Natanek Logistics i Transport Towarowy Paweł Łazarczyk, łącznie 50 naczep (20, 20 i 10). Listy zawierają profil floty operatora, liczbę naczep i harmonogram, warunki cenowe, kryteria zakupu, dane o szkodach z ostatnich 12 miesięcy oraz termin ważności do 31.12.2030. Promocja: demonstracje u klientów bazy, partnerstwo z ubezpieczycielem, udział w targach Trans Logistics Poland w Warszawie (listopad, od 2031 r.) oraz w TRANSLOG Connect Congress w Budapeszcie (edycja 2028, zadanie Z10). Segment 2 (od 2031): spedytorzy, ok. 12 000 firm (GUS, Działalność przedsiębiorstw transportowych 2023). Segment 3 (od 2032): floty 50-200 pojazdów przez kanał ubezpieczeniowy oraz klienci w CEE przez partnerstwa z dostawcami TMS i licencje API.</w:t>
+        <w:t>Segmentem priorytetowym w latach 2030-2031 będą floty od 5 do 50 naczep w przewozach ogólnotowarowych PL-UE, a kanałem baza ponad 50 aktywnych kontrahentów spedycyjnych Everest11, z którymi spółka prowadzi bieżącą współpracę. Pierwszy próg, 50 pojazdów u klientów zewnętrznych w 2030 r., pokrywają listy intencyjne trzech operatorów: Krajowe i Międzynarodowe Usługi Transportowe Hubert Lizak SZYK, Natanek Logistics i Transport Towarowy Paweł Łazarczyk, łącznie 50 naczep (20, 20 i 10). Listy zawierają profil floty operatora, liczbę naczep i harmonogram, warunki cenowe, kryteria zakupu, dane o szkodach z ostatnich 12 miesięcy oraz termin ważności do 31.12.2030. Promocja obejmie demonstracje u klientów bazy, partnerstwo z ubezpieczycielem, udział w targach Trans Logistics Poland w Warszawie (listopad, od 2031 r.) oraz w TRANSLOG Connect Congress w Budapeszcie (edycja 2028, zadanie Z10). W drugim segmencie, od 2031 r., Everest11 dotrze do spedytorów, ok. 12 000 firm (GUS, Działalność przedsiębiorstw transportowych 2023), a w trzecim, od 2032 r., do flot 50-200 pojazdów przez kanał ubezpieczeniowy oraz klientów w CEE przez partnerstwa z dostawcami TMS i licencje API.</w:t>
       </w:r>
     </w:p>
     <w:p>
@@ -767,7 +767,7 @@
         <w:rPr>
           <w:b w:val="0"/>
         </w:rPr>
-        <w:t>Pierwsze przychody w 2030 r., a rok 2029 to pilotaż bez przychodów. Źródła: abonament, zestawy i licencje API. Przychody: 2030, 50 pojazdów: 489 300 PLN; 2031, 125: 981 468 PLN; 2032, 250: 1 836 504 PLN; 2033, 500: 3 673 620 PLN; 2034, 1 000: 7 347 240 PLN. Razem 14 328 132 PLN.</w:t>
+        <w:t>Pierwsze przychody pojawią się w 2030 r., a rok 2029 będzie pilotażem bez przychodów. Źródłami będą abonament, zestawy i licencje API. Prognozowane przychody wyniosą: w 2030 r. przy 50 pojazdach 489 300 PLN, w 2031 r. przy 125 pojazdach 981 468 PLN, w 2032 r. przy 250 pojazdach 1 836 504 PLN, w 2033 r. przy 500 pojazdach 3 673 620 PLN i w 2034 r. przy 1 000 pojazdach 7 347 240 PLN, razem 14 328 132 PLN.</w:t>
       </w:r>
     </w:p>
     <w:p>
@@ -1456,7 +1456,7 @@
           <w:color w:val="666666"/>
           <w:sz w:val="17"/>
         </w:rPr>
-        <w:t xml:space="preserve"> [4193 znaków]</w:t>
+        <w:t xml:space="preserve"> [4198 znaków]</w:t>
       </w:r>
     </w:p>
     <w:p>
@@ -1467,7 +1467,7 @@
         <w:rPr>
           <w:b w:val="0"/>
         </w:rPr>
-        <w:t>Grupa docelowa to polscy przewoźnicy MŚP z flotą od 5 do 50 naczep (kurtyna, furgon, izoterma), realizujący przewozy ogólnotowarowe PL-UE, bez telematyki fabrycznej i bez własnego działu IT.</w:t>
+        <w:t>Grupę docelową stanowią polscy przewoźnicy MŚP z flotą od 5 do 50 naczep (kurtyna, furgon, izoterma), realizujący przewozy ogólnotowarowe PL-UE, bez telematyki fabrycznej i bez własnego działu IT.</w:t>
       </w:r>
     </w:p>
     <w:p>
@@ -1478,7 +1478,7 @@
         <w:rPr>
           <w:b w:val="0"/>
         </w:rPr>
-        <w:t>Liczebność. W Polsce zarejestrowano 544,97 tys. naczep (Eurostat, road_eqs_semit, 2023), a 43 280 przedsiębiorców ma licencję wspólnotową (GITD, koniec lipca 2026 r.). Ponad 76 000 firm TSL ma floty od 1 do 50 pojazdów (TLP/SpotData, Transport drogowy w Polsce 2024/2025, 2025). Rynek dostępny (SAM) to ok. 200 000 naczep z nadwoziami nadającymi się do retrofit i bez telematyki producenta. Szacunek wynika z udziału platform, nadwozi skrzyniowych i furgonów w rejestracjach (ok. 72%, PZPM, CEP info, 2025) oraz udziału naczep bez telematyki (ok. 86%, Frost &amp; Sullivan, 2019) i daje ok. 337 000, a przyjęto ostrożnie 200 000. Do 2034 r. planujemy 1 000 pojazdów, czyli 0,50% SAM i 0,18% liczby naczep w Polsce.</w:t>
+        <w:t>W Polsce zarejestrowano 544,97 tys. naczep (Eurostat, road_eqs_semit, 2023), a 43 280 przedsiębiorców ma licencję wspólnotową (GITD, koniec lipca 2026 r.). Ponad 76 000 firm TSL ma floty od 1 do 50 pojazdów (TLP/SpotData, Transport drogowy w Polsce 2024/2025, 2025). Rynek dostępny (SAM) to ok. 200 000 naczep z nadwoziami nadającymi się do retrofit i bez telematyki producenta. Szacunek wynika z udziału platform, nadwozi skrzyniowych i furgonów w rejestracjach (ok. 72%, PZPM, CEP info, 2025) oraz udziału naczep bez telematyki (ok. 86%, Frost &amp; Sullivan, 2019) i daje ok. 337 000, a przyjęto ostrożnie 200 000. Do 2034 r. Everest11 planuje 1 000 pojazdów, czyli 0,50% SAM i 0,18% liczby naczep w Polsce.</w:t>
       </w:r>
     </w:p>
     <w:p>
@@ -1489,7 +1489,7 @@
         <w:rPr>
           <w:b w:val="0"/>
         </w:rPr>
-        <w:t>Potrzeby i oczekiwania. Wymagania przewoźników MŚP, które przyjęliśmy do projektu, wynikają z rozmów z 15 potencjalnymi klientami Everest11 (okres rozmów marzec-maj 2026): montaż w istniejącej naczepie bez zmian homologacji, działanie bez zasięgu GSM, alert dla kierowcy bez udziału dyspozytora, integracja z TMS i koszt rozłożony w abonamencie. Zakup finansowany jest z kosztów bieżących: subskrypcja 349 PLN za pojazd miesięcznie, zestaw retrofit średnio 7 500 PLN za naczepę i licencja API 4 800 PLN rocznie na klienta. Decyzja zakupowa leży po stronie właściciela lub dyrektora i trwa zwykle od 2 do 4 tygodni (doświadczenie operacyjne Everest11). Główna bariera to brak świadomości, że takie rozwiązanie istnieje, a odpowiada na nią bezpośredni kanał sprzedaży przez bazę ponad 50 klientów Everest11.</w:t>
+        <w:t>Wymagania przewoźników MŚP, które przyjęliśmy do projektu, wynikają z rozmów z 15 potencjalnymi klientami Everest11 (okres rozmów marzec-maj 2026): montaż w istniejącej naczepie bez zmian homologacji, działanie bez zasięgu GSM, alert dla kierowcy bez udziału dyspozytora, integracja z TMS i koszt rozłożony w abonamencie. Zakup będzie finansowany z kosztów bieżących: subskrypcja 349 PLN za pojazd miesięcznie, zestaw retrofit średnio 7 500 PLN za naczepę i licencja API 4 800 PLN rocznie na klienta. Decyzja zakupowa leży po stronie właściciela lub dyrektora i trwa zwykle od 2 do 4 tygodni (doświadczenie operacyjne Everest11). Główną barierą jest brak świadomości, że takie rozwiązanie istnieje, a odpowie na nią bezpośredni kanał sprzedaży przez bazę ponad 50 klientów Everest11.</w:t>
       </w:r>
     </w:p>
     <w:p>
@@ -1500,7 +1500,7 @@
         <w:rPr>
           <w:b w:val="0"/>
         </w:rPr>
-        <w:t>Zainteresowanie. Trzej operatorzy z bazy klientów, Krajowe i Międzynarodowe Usługi Transportowe Hubert Lizak SZYK, Natanek Logistics i Transport Towarowy Paweł Łazarczyk, podpisali listy intencyjne na łącznie 50 naczep (20, 20 i 10), co stanowi pierwszy próg sprzedaży w 2030 r. Listy zawierają profil floty operatora, liczbę naczep i harmonogram, warunki cenowe, kryteria zakupu, dane o szkodach z ostatnich 12 miesięcy oraz termin ważności do 31.12.2030.</w:t>
+        <w:t>Trzej operatorzy z bazy klientów, Krajowe i Międzynarodowe Usługi Transportowe Hubert Lizak SZYK, Natanek Logistics i Transport Towarowy Paweł Łazarczyk, podpisali listy intencyjne na łącznie 50 naczep (20, 20 i 10), co stanowi pierwszy próg sprzedaży w 2030 r. Listy zawierają profil floty operatora, liczbę naczep i harmonogram, warunki cenowe, kryteria zakupu, dane o szkodach z ostatnich 12 miesięcy oraz termin ważności do 31.12.2030.</w:t>
       </w:r>
     </w:p>
     <w:p>
@@ -1511,7 +1511,7 @@
         <w:rPr>
           <w:b w:val="0"/>
         </w:rPr>
-        <w:t>Segment 2, od 2031 r.: polscy spedytorzy, ok. 12 000 firm (GUS, Działalność przedsiębiorstw transportowych 2023, 2024), którzy odpowiadają za stan ładunku wobec klienta i mogą wymagać monitoringu od przewoźników. Segment 3, od 2032 r.: floty od 50 do 200 pojazdów oraz klienci w regionie CEE, pozyskiwani przez partnerstwa z dostawcami TMS i licencje API. Wielkość rynku CEE oszacujemy w analizie rynków w zadaniu Z10, a w prognozie przychodów traktujemy ten segment jako uzupełnienie.</w:t>
+        <w:t>W drugim segmencie, od 2031 r., Everest11 dotrze do polskich spedytorów, ok. 12 000 firm (GUS, Działalność przedsiębiorstw transportowych 2023, 2024), którzy odpowiadają za stan ładunku wobec klienta i mogą wymagać monitoringu od przewoźników. W trzecim segmencie, od 2032 r., dotrze do flot od 50 do 200 pojazdów oraz klientów w regionie CEE, pozyskiwanych przez partnerstwa z dostawcami TMS i licencje API. Wielkość rynku CEE zostanie oszacowana w analizie rynków w zadaniu Z10, a w prognozie przychodów ten segment jest traktowany jako uzupełnienie.</w:t>
       </w:r>
     </w:p>
     <w:p>
@@ -1522,7 +1522,7 @@
         <w:rPr>
           <w:b w:val="0"/>
         </w:rPr>
-        <w:t>Trendy. Od 21.08.2025 organy państw UE muszą przyjmować informacje w formacie eFTI (rozporządzenie UE 2020/1056), a stosowanie eFTI jest dla przewoźników dobrowolne i daje dokument uznawany w całej UE. Straty cargo w UE wyniosły 549 mln EUR w 2023 r., o 438% więcej niż rok wcześniej (TAPA EMEA TIS, 2025), co skłania ubezpieczycieli do różnicowania składek według monitoringu. Rejestracje nowych naczep spadły z 25 336 w 2023 r. do 17 268 w 2024 r. (IBRM Samar, dane PZPM, 2025), więc naczep z telematyką fabryczną przybywa wolniej.</w:t>
+        <w:t>Od 21.08.2025 organy państw UE muszą przyjmować informacje w formacie eFTI (rozporządzenie UE 2020/1056), a stosowanie eFTI jest dla przewoźników dobrowolne i daje dokument uznawany w całej UE. Straty cargo w UE wyniosły 549 mln EUR w 2023 r., o 438% więcej niż rok wcześniej (TAPA EMEA TIS, 2025), co skłania ubezpieczycieli do różnicowania składek według monitoringu. Rejestracje nowych naczep spadły z 25 336 w 2023 r. do 17 268 w 2024 r. (IBRM Samar, dane PZPM, 2025), więc naczep z telematyką fabryczną przybywa wolniej.</w:t>
       </w:r>
     </w:p>
     <w:p>
@@ -1533,7 +1533,7 @@
         <w:rPr>
           <w:b w:val="0"/>
         </w:rPr>
-        <w:t>Nasycenie rynku i konkurencja. Telematyka naczep (Schmitz Cargobull TrailerConnect, Krone Telematics, Nexxiot, Arviem, Tive, SkyBitz) obejmuje lokalizację, warunki i alerty progowe, a w części przypadków obraz lub zajętość przestrzeni ładunkowej. Według dostępnej dokumentacji żaden produkt nie łączy modelu 3D z położeniem ładunku w ruchu, predykcji ryzyka z klasą ładunku, wizyjnej oceny zabezpieczeń i dokumentu eFTI. Rozwiązania fabryczne są kierowane do nowych naczep. Ceny konkurencji nie są publiczne, a orientacyjny abonament oprogramowania SkyBitz to od 30 do 75 USD za zasób miesięcznie (Capterra, 2026). Subskrypcja CargoDT jest wyższa, bo obejmuje model 3D, ocenę zabezpieczeń, predykcję ryzyka i dokument eFTI. Prawdopodobieństwo nowego konkurenta w ciągu 3-5 lat oceniamy jako umiarkowane. Bariery to jednoczesne rozwiązanie trzech problemów badawczych (Z4, Z5, Z8), model sprzedaży fabrycznej sprzeczny z retrofit oraz zgłoszenie patentowe EPO w Z11. Produkt ma wyłącznie zastosowanie cywilne.</w:t>
+        <w:t>Telematyka naczep (Schmitz Cargobull TrailerConnect, Krone Telematics, Nexxiot, Arviem, Tive, SkyBitz) obejmuje lokalizację, warunki i alerty progowe, a w części przypadków obraz lub zajętość przestrzeni ładunkowej. Według dostępnej dokumentacji żaden produkt nie łączy modelu 3D z położeniem ładunku w ruchu, predykcji ryzyka z klasą ładunku, wizyjnej oceny zabezpieczeń i dokumentu eFTI. Rozwiązania fabryczne są kierowane do nowych naczep. Ceny konkurencji nie są publiczne, a orientacyjny abonament oprogramowania SkyBitz to od 30 do 75 USD za zasób miesięcznie (Capterra, 2026). Subskrypcja CargoDT będzie wyższa, bo obejmie model 3D, ocenę zabezpieczeń, predykcję ryzyka i dokument eFTI. Prawdopodobieństwo nowego konkurenta w ciągu 3-5 lat oceniamy jako umiarkowane. Barierami będą jednoczesne rozwiązanie trzech problemów badawczych (Z4, Z5, Z8), model sprzedaży fabrycznej sprzeczny z retrofit oraz zgłoszenie patentowe EPO w Z11. Produkt będzie miał wyłącznie zastosowanie cywilne.</w:t>
       </w:r>
     </w:p>
     <w:p>
@@ -1561,7 +1561,7 @@
           <w:color w:val="666666"/>
           <w:sz w:val="17"/>
         </w:rPr>
-        <w:t xml:space="preserve"> [2614 znaków]</w:t>
+        <w:t xml:space="preserve"> [2793 znaków]</w:t>
       </w:r>
     </w:p>
     <w:p>
@@ -1572,7 +1572,7 @@
         <w:rPr>
           <w:b w:val="0"/>
         </w:rPr>
-        <w:t>Wdrożenie nastąpi we własnej działalności gospodarczej Everest11 na terytorium RP: Everest11 wprowadzi na rynek nową usługę CargoDT (zestaw retrofit, subskrypcja SaaS, licencja API) i włączy ją do własnego systemu TMS. Sprzedaż rozpoczyna się w styczniu 2030 r., w terminie 5 lat od zakończenia projektu (04/2029).</w:t>
+        <w:t>Wdrożenie nastąpi we własnej działalności gospodarczej Everest11 na terytorium RP, a Everest11 wprowadzi na rynek nową usługę CargoDT (zestaw retrofit, subskrypcja SaaS, licencja API) i włączy ją do własnego systemu TMS. Sprzedaż rozpocznie się w styczniu 2030 r., w terminie 5 lat od zakończenia projektu (04/2029).</w:t>
       </w:r>
     </w:p>
     <w:p>
@@ -1583,7 +1583,7 @@
         <w:rPr>
           <w:b w:val="0"/>
         </w:rPr>
-        <w:t>Etap 0 (05-10/2029). Kontynuacja procedur IP: zgłoszenie EPO zostało złożone w Z11, a w tym etapie prowadzona jest dalsza obsługa postępowania oraz, ze środków własnych Lidera, wniosek o wzór użytkowy dla konfiguracji sprzętowej. Certyfikacja CE zestawu retrofit zgodnie z dyrektywami RED 2014/53/UE (radar mmWave 77 GHz) i EMC 2014/30/UE oraz homologacja ECE R10 w akredytowanym laboratorium. Produkcja pierwszej serii zestawów po certyfikacji (2-3 miesiące). Równolegle uruchomienie platformy SaaS w środowisku produkcyjnym (4-5 miesięcy), materiały handlowe i cennik oraz warunkowe umowy B2B z trzema operatorami, którzy podpisali listy intencyjne.</w:t>
+        <w:t>W etapie 0 (05-10/2029) będą kontynuowane procedury IP: zgłoszenie EPO zostanie złożone w Z11, a w tym etapie Everest11 poprowadzi dalszą obsługę postępowania oraz, ze środków własnych Lidera, złoży wniosek o wzór użytkowy dla konfiguracji sprzętowej. Zestaw retrofit przejdzie certyfikację CE zgodnie z dyrektywami RED 2014/53/UE (radar mmWave 77 GHz) i EMC 2014/30/UE oraz homologację ECE R10 w akredytowanym laboratorium, a po certyfikacji powstanie pierwsza seria zestawów (2-3 miesiące). Równolegle zostanie uruchomiona platforma SaaS w środowisku produkcyjnym (4-5 miesięcy), a Everest11 przygotuje materiały handlowe i cennik oraz warunkowe umowy B2B z trzema operatorami, którzy podpisali listy intencyjne.</w:t>
       </w:r>
     </w:p>
     <w:p>
@@ -1594,7 +1594,7 @@
         <w:rPr>
           <w:b w:val="0"/>
         </w:rPr>
-        <w:t>Etap 1 (11/2029-12/2030). Od 11/2029 pilotaż instalacji u operatorów i integracja z TMS Everest11, a od stycznia 2030 r. sprzedaż. Cel: 50 aktywnych pojazdów u klientów na koniec 2030 r., w tym 20, 20 i 10 u trzech operatorów z listami intencyjnymi. Dystrybucja: sprzedaż bezpośrednia przez Michała Hajduka (7 lat sprzedaży technologii telematycznych dla flot w Legaltelematics i INELO) do bazy ponad 50 kontrahentów Everest11. Miejsce sprzedaży: kontakt bezpośredni (siedziby klientów i biuro Everest11 w Warszawie) oraz zamówienia przez panel klienta platformy SaaS. Montaż i uruchomienie zestawów u klientów wykonuje Stanisław Kozioł (IoT Specialist), a wsparcie techniczne działa całodobowo. W 2030 r. zestawy pracują średnio przez 6 miesięcy, stąd 300 pojazdo-miesięcy abonamentu. Przychody 2030: 489 300 PLN (SaaS 104,7 tys., zestawy 375,0 tys., API 9,6 tys.).</w:t>
+        <w:t>W etapie 1 (11/2029-12/2030) od 11/2029 ruszy pilotaż instalacji u operatorów i integracja z TMS Everest11, a od stycznia 2030 r. sprzedaż. Celem jest 50 aktywnych pojazdów u klientów na koniec 2030 r., w tym 20, 20 i 10 u trzech operatorów z listami intencyjnymi. Sprzedaż bezpośrednią poprowadzi Michał Hajduk (7 lat sprzedaży technologii telematycznych dla flot w Legaltelematics i INELO) do bazy ponad 50 kontrahentów Everest11, w kontakcie bezpośrednim (siedziby klientów i biuro Everest11 w Warszawie) oraz przez zamówienia w panelu klienta platformy SaaS. Montaż i uruchomienie zestawów u klientów wykona Stanisław Kozioł (IoT Specialist), a wsparcie techniczne będzie działać całodobowo. W 2030 r. zestawy będą pracować średnio przez 6 miesięcy, stąd 300 pojazdo-miesięcy abonamentu, a przychody 2030 wyniosą 489 300 PLN (SaaS 104,7 tys., zestawy 375,0 tys., API 9,6 tys.).</w:t>
       </w:r>
     </w:p>
     <w:p>
@@ -1605,7 +1605,7 @@
         <w:rPr>
           <w:b w:val="0"/>
         </w:rPr>
-        <w:t>Etap 2 (2031). Cel: 125 pojazdów, 6 klientów. Kanały: program zniżkowy z ubezpieczycielem cargo, udział w targach Trans Logistics Poland w Warszawie (listopad), sprzedaż B2B do polskich przewoźników i pierwsze umowy partnerskie z lokalnymi dostawcami TMS w regionie CEE. Przychody: 981 468 PLN.</w:t>
+        <w:t>W etapie 2 (2031) celem jest 125 pojazdów i 6 klientów. Everest11 wykorzysta program zniżkowy z ubezpieczycielem cargo, udział w targach Trans Logistics Poland w Warszawie (listopad), sprzedaż B2B do polskich przewoźników i pierwsze umowy partnerskie z lokalnymi dostawcami TMS w regionie CEE, a przychody wyniosą 981 468 PLN.</w:t>
       </w:r>
     </w:p>
     <w:p>
@@ -1616,7 +1616,7 @@
         <w:rPr>
           <w:b w:val="0"/>
         </w:rPr>
-        <w:t>Etap 3 (2032). Cel: 250 pojazdów, 12 klientów. Rozbudowa partnerstw CEE i program poleceń oparty na klientach pilotażowych. Przychody: 1 836 504 PLN.</w:t>
+        <w:t>W etapie 3 (2032) celem jest 250 pojazdów i 12 klientów. Everest11 rozbuduje partnerstwa CEE i uruchomi program poleceń oparty na klientach pilotażowych, a przychody wyniosą 1 836 504 PLN.</w:t>
       </w:r>
     </w:p>
     <w:p>
@@ -1627,7 +1627,7 @@
         <w:rPr>
           <w:b w:val="0"/>
         </w:rPr>
-        <w:t>Etap 4 (2033-2034). Cel: 500 pojazdów w 2033 r. i 1 000 w 2034 r. Pogłębianie rynku polskiego dzięki referencjom klientów i partnerstwom z dostawcami TMS w regionie CEE, a ochronę przewagi zapewnia patent EPO. Przychody: 3 673 620 PLN w 2033 r. i 7 347 240 PLN w 2034 r., razem 14 328 132 PLN. Penetracja SAM w Polsce w 2034 r.: 0,50%.</w:t>
+        <w:t>W etapie 4 (2033-2034) celem jest 500 pojazdów w 2033 r. i 1 000 w 2034 r. Everest11 pogłębi rynek polski dzięki referencjom klientów i partnerstwom z dostawcami TMS w regionie CEE, a ochronę przewagi zapewni patent EPO. Przychody wyniosą 3 673 620 PLN w 2033 r. i 7 347 240 PLN w 2034 r., razem 14 328 132 PLN, a penetracja SAM w Polsce w 2034 r. wyniesie 0,50%.</w:t>
       </w:r>
     </w:p>
     <w:p>

</xml_diff>